<commit_message>
Them anh ket qua 5 bai va thoi gian chup vao bao cao Lab06
</commit_message>
<xml_diff>
--- a/Lab06/23633801_HuynhHoaiThanh_Lab6.docx
+++ b/Lab06/23633801_HuynhHoaiThanh_Lab6.docx
@@ -211,17 +211,17 @@
         <w:pStyle w:val="Heading2"/>
       </w:pPr>
       <w:r>
-        <w:t>Cách điền ảnh vào báo cáo</w:t>
+        <w:t>Thông tin ảnh minh chứng</w:t>
       </w:r>
     </w:p>
     <w:p>
       <w:r>
-        <w:t>Chạy project và chụp màn hình thực tế theo từng ô ở các trang sau. Xóa chữ trong ô, đặt con trỏ vào ô rồi chọn Insert → Pictures để chèn ảnh. Giữ tỉ lệ ảnh và đặt chiều rộng tối đa 7,2 cm, chiều cao tối đa 13,2 cm.</w:t>
+        <w:t>Ảnh được chụp từ ứng dụng chạy trên Chromium trong môi trường cloud, khung hiển thị 390 × 844 px. Ngày giờ chụp thực tế được ghi dưới từng ảnh, theo giờ Việt Nam (UTC+7). Đây là bản web, chưa phải ảnh chạy trên thiết bị Android/iOS.</w:t>
       </w:r>
     </w:p>
     <w:p>
       <w:r>
-        <w:t>Các dòng “Cần thấy” là nội dung cần chụp, không phải kết luận kiểm thử đã thực hiện. Thay đủ các ô bằng ảnh thực tế trước khi nộp.</w:t>
+        <w:t>Bài 2 lấy dữ liệu thật từ MockAPI do sinh viên cung cấp. Yêu cầu HTTPS được chuyển tiếp qua curl có xác minh chứng chỉ của proxy cloud; không sửa dữ liệu API. Ảnh lỗi mạng được tạo bằng ngắt yêu cầu có kiểm soát, sau đó khôi phục và bấm THỬ LẠI.</w:t>
       </w:r>
     </w:p>
     <w:p>
@@ -296,7 +296,7 @@
                 <w:tcPr>
                   <w:tcW w:type="dxa" w:w="4592"/>
                   <w:vAlign w:val="center"/>
-                  <w:shd w:fill="F4F6F9"/>
+                  <w:shd w:fill="FFFFFF"/>
                   <w:tcBorders>
                     <w:top w:val="dashed" w:sz="6" w:color="94A3B8"/>
                     <w:left w:val="dashed" w:sz="6" w:color="94A3B8"/>
@@ -306,28 +306,43 @@
                 </w:tcPr>
                 <w:p>
                   <w:pPr>
+                    <w:spacing w:before="0" w:after="0" w:line="240" w:lineRule="auto"/>
                     <w:jc w:val="center"/>
                   </w:pPr>
+                  <w:r/>
                   <w:r>
-                    <w:rPr>
-                      <w:b/>
-                      <w:color w:val="64748B"/>
-                    </w:rPr>
-                    <w:t>CHÈN ẢNH 1.1 TẠI ĐÂY</w:t>
-                  </w:r>
-                </w:p>
-                <w:p>
-                  <w:pPr>
-                    <w:jc w:val="center"/>
-                  </w:pPr>
-                  <w:r>
-                    <w:rPr>
-                      <w:color w:val="64748B"/>
-                      <w:sz w:val="20"/>
-                    </w:rPr>
-                    <w:t>Ảnh chụp màn hình thực tế</w:t>
-                    <w:br/>
-                    <w:t>Thay phần chữ này bằng ảnh</w:t>
+                    <w:drawing>
+                      <wp:inline xmlns:a="http://schemas.openxmlformats.org/drawingml/2006/main" xmlns:pic="http://schemas.openxmlformats.org/drawingml/2006/picture">
+                        <wp:extent cx="2195829" cy="4752000"/>
+                        <wp:docPr id="1" name="Picture 1"/>
+                        <wp:cNvGraphicFramePr>
+                          <a:graphicFrameLocks noChangeAspect="1"/>
+                        </wp:cNvGraphicFramePr>
+                        <a:graphic>
+                          <a:graphicData uri="http://schemas.openxmlformats.org/drawingml/2006/picture">
+                            <pic:pic>
+                              <pic:nvPicPr>
+                                <pic:cNvPr id="0" name="1.1-product-blue.png"/>
+                                <pic:cNvPicPr/>
+                              </pic:nvPicPr>
+                              <pic:blipFill>
+                                <a:blip r:embed="rId12"/>
+                                <a:stretch>
+                                  <a:fillRect/>
+                                </a:stretch>
+                              </pic:blipFill>
+                              <pic:spPr>
+                                <a:xfrm>
+                                  <a:off x="0" y="0"/>
+                                  <a:ext cx="2195829" cy="4752000"/>
+                                </a:xfrm>
+                                <a:prstGeom prst="rect"/>
+                              </pic:spPr>
+                            </pic:pic>
+                          </a:graphicData>
+                        </a:graphic>
+                      </wp:inline>
+                    </w:drawing>
                   </w:r>
                 </w:p>
               </w:tc>
@@ -336,21 +351,34 @@
           <w:p>
             <w:pPr>
               <w:keepNext/>
+              <w:spacing w:before="100" w:after="100"/>
+              <w:jc w:val="center"/>
             </w:pPr>
+            <w:r>
+              <w:rPr>
+                <w:color w:val="475569"/>
+                <w:sz w:val="18"/>
+              </w:rPr>
+              <w:t>Chụp: 16:52:54 · 25/10/2026 (UTC+7)</w:t>
+            </w:r>
           </w:p>
           <w:p>
             <w:pPr>
               <w:keepNext/>
-              <w:spacing w:before="160"/>
+              <w:spacing w:before="60"/>
             </w:pPr>
             <w:r>
               <w:rPr>
                 <w:b/>
+                <w:sz w:val="20"/>
               </w:rPr>
-              <w:t xml:space="preserve">Cần thấy: </w:t>
+              <w:t xml:space="preserve">Kết quả: </w:t>
             </w:r>
             <w:r>
-              <w:t>Ảnh điện thoại xanh; tên, sao, giá; nút “4 MÀU-CHỌN MÀU” và “CHỌN MUA” ở đáy.</w:t>
+              <w:rPr>
+                <w:sz w:val="20"/>
+              </w:rPr>
+              <w:t>Ảnh điện thoại xanh, tên/sao/giá, nút chọn màu và nút CHỌN MUA ở đáy.</w:t>
             </w:r>
           </w:p>
         </w:tc>
@@ -395,7 +423,7 @@
                 <w:tcPr>
                   <w:tcW w:type="dxa" w:w="4592"/>
                   <w:vAlign w:val="center"/>
-                  <w:shd w:fill="F4F6F9"/>
+                  <w:shd w:fill="FFFFFF"/>
                   <w:tcBorders>
                     <w:top w:val="dashed" w:sz="6" w:color="94A3B8"/>
                     <w:left w:val="dashed" w:sz="6" w:color="94A3B8"/>
@@ -405,28 +433,43 @@
                 </w:tcPr>
                 <w:p>
                   <w:pPr>
+                    <w:spacing w:before="0" w:after="0" w:line="240" w:lineRule="auto"/>
                     <w:jc w:val="center"/>
                   </w:pPr>
+                  <w:r/>
                   <w:r>
-                    <w:rPr>
-                      <w:b/>
-                      <w:color w:val="64748B"/>
-                    </w:rPr>
-                    <w:t>CHÈN ẢNH 1.2 TẠI ĐÂY</w:t>
-                  </w:r>
-                </w:p>
-                <w:p>
-                  <w:pPr>
-                    <w:jc w:val="center"/>
-                  </w:pPr>
-                  <w:r>
-                    <w:rPr>
-                      <w:color w:val="64748B"/>
-                      <w:sz w:val="20"/>
-                    </w:rPr>
-                    <w:t>Ảnh chụp màn hình thực tế</w:t>
-                    <w:br/>
-                    <w:t>Thay phần chữ này bằng ảnh</w:t>
+                    <w:drawing>
+                      <wp:inline xmlns:a="http://schemas.openxmlformats.org/drawingml/2006/main" xmlns:pic="http://schemas.openxmlformats.org/drawingml/2006/picture">
+                        <wp:extent cx="2195829" cy="4752000"/>
+                        <wp:docPr id="2" name="Picture 2"/>
+                        <wp:cNvGraphicFramePr>
+                          <a:graphicFrameLocks noChangeAspect="1"/>
+                        </wp:cNvGraphicFramePr>
+                        <a:graphic>
+                          <a:graphicData uri="http://schemas.openxmlformats.org/drawingml/2006/picture">
+                            <pic:pic>
+                              <pic:nvPicPr>
+                                <pic:cNvPr id="0" name="1.2-choose-unpicked.png"/>
+                                <pic:cNvPicPr/>
+                              </pic:nvPicPr>
+                              <pic:blipFill>
+                                <a:blip r:embed="rId13"/>
+                                <a:stretch>
+                                  <a:fillRect/>
+                                </a:stretch>
+                              </pic:blipFill>
+                              <pic:spPr>
+                                <a:xfrm>
+                                  <a:off x="0" y="0"/>
+                                  <a:ext cx="2195829" cy="4752000"/>
+                                </a:xfrm>
+                                <a:prstGeom prst="rect"/>
+                              </pic:spPr>
+                            </pic:pic>
+                          </a:graphicData>
+                        </a:graphic>
+                      </wp:inline>
+                    </w:drawing>
                   </w:r>
                 </w:p>
               </w:tc>
@@ -435,39 +478,39 @@
           <w:p>
             <w:pPr>
               <w:keepNext/>
+              <w:spacing w:before="100" w:after="100"/>
+              <w:jc w:val="center"/>
             </w:pPr>
+            <w:r>
+              <w:rPr>
+                <w:color w:val="475569"/>
+                <w:sz w:val="18"/>
+              </w:rPr>
+              <w:t>Chụp: 16:52:54 · 25/10/2026 (UTC+7)</w:t>
+            </w:r>
           </w:p>
           <w:p>
             <w:pPr>
               <w:keepNext/>
-              <w:spacing w:before="160"/>
+              <w:spacing w:before="60"/>
             </w:pPr>
             <w:r>
               <w:rPr>
                 <w:b/>
+                <w:sz w:val="20"/>
               </w:rPr>
-              <w:t xml:space="preserve">Cần thấy: </w:t>
+              <w:t xml:space="preserve">Kết quả: </w:t>
             </w:r>
             <w:r>
-              <w:t>Ảnh nhỏ xanh và tên sản phẩm; 4 ô màu bạc/đỏ/đen/xanh; chưa hiện thông tin màu đã chọn.</w:t>
+              <w:rPr>
+                <w:sz w:val="20"/>
+              </w:rPr>
+              <w:t>Chưa chọn màu: chỉ có tên và ảnh nhỏ xanh; hiển thị bốn ô màu.</w:t>
             </w:r>
           </w:p>
         </w:tc>
       </w:tr>
     </w:tbl>
-    <w:p>
-      <w:pPr>
-        <w:keepNext w:val="0"/>
-        <w:spacing w:before="200"/>
-      </w:pPr>
-      <w:r>
-        <w:rPr>
-          <w:color w:val="64748B"/>
-          <w:sz w:val="20"/>
-        </w:rPr>
-        <w:t>Ghi chú (nếu có): ................................................................................................</w:t>
-      </w:r>
-    </w:p>
     <w:p>
       <w:r>
         <w:br w:type="page"/>
@@ -540,7 +583,7 @@
                 <w:tcPr>
                   <w:tcW w:type="dxa" w:w="4592"/>
                   <w:vAlign w:val="center"/>
-                  <w:shd w:fill="F4F6F9"/>
+                  <w:shd w:fill="FFFFFF"/>
                   <w:tcBorders>
                     <w:top w:val="dashed" w:sz="6" w:color="94A3B8"/>
                     <w:left w:val="dashed" w:sz="6" w:color="94A3B8"/>
@@ -550,28 +593,43 @@
                 </w:tcPr>
                 <w:p>
                   <w:pPr>
+                    <w:spacing w:before="0" w:after="0" w:line="240" w:lineRule="auto"/>
                     <w:jc w:val="center"/>
                   </w:pPr>
+                  <w:r/>
                   <w:r>
-                    <w:rPr>
-                      <w:b/>
-                      <w:color w:val="64748B"/>
-                    </w:rPr>
-                    <w:t>CHÈN ẢNH 1.3 TẠI ĐÂY</w:t>
-                  </w:r>
-                </w:p>
-                <w:p>
-                  <w:pPr>
-                    <w:jc w:val="center"/>
-                  </w:pPr>
-                  <w:r>
-                    <w:rPr>
-                      <w:color w:val="64748B"/>
-                      <w:sz w:val="20"/>
-                    </w:rPr>
-                    <w:t>Ảnh chụp màn hình thực tế</w:t>
-                    <w:br/>
-                    <w:t>Thay phần chữ này bằng ảnh</w:t>
+                    <w:drawing>
+                      <wp:inline xmlns:a="http://schemas.openxmlformats.org/drawingml/2006/main" xmlns:pic="http://schemas.openxmlformats.org/drawingml/2006/picture">
+                        <wp:extent cx="2195829" cy="4752000"/>
+                        <wp:docPr id="3" name="Picture 3"/>
+                        <wp:cNvGraphicFramePr>
+                          <a:graphicFrameLocks noChangeAspect="1"/>
+                        </wp:cNvGraphicFramePr>
+                        <a:graphic>
+                          <a:graphicData uri="http://schemas.openxmlformats.org/drawingml/2006/picture">
+                            <pic:pic>
+                              <pic:nvPicPr>
+                                <pic:cNvPr id="0" name="1.3-choose-red.png"/>
+                                <pic:cNvPicPr/>
+                              </pic:nvPicPr>
+                              <pic:blipFill>
+                                <a:blip r:embed="rId14"/>
+                                <a:stretch>
+                                  <a:fillRect/>
+                                </a:stretch>
+                              </pic:blipFill>
+                              <pic:spPr>
+                                <a:xfrm>
+                                  <a:off x="0" y="0"/>
+                                  <a:ext cx="2195829" cy="4752000"/>
+                                </a:xfrm>
+                                <a:prstGeom prst="rect"/>
+                              </pic:spPr>
+                            </pic:pic>
+                          </a:graphicData>
+                        </a:graphic>
+                      </wp:inline>
+                    </w:drawing>
                   </w:r>
                 </w:p>
               </w:tc>
@@ -580,21 +638,34 @@
           <w:p>
             <w:pPr>
               <w:keepNext/>
+              <w:spacing w:before="100" w:after="100"/>
+              <w:jc w:val="center"/>
             </w:pPr>
+            <w:r>
+              <w:rPr>
+                <w:color w:val="475569"/>
+                <w:sz w:val="18"/>
+              </w:rPr>
+              <w:t>Chụp: 16:52:55 · 25/10/2026 (UTC+7)</w:t>
+            </w:r>
           </w:p>
           <w:p>
             <w:pPr>
               <w:keepNext/>
-              <w:spacing w:before="160"/>
+              <w:spacing w:before="60"/>
             </w:pPr>
             <w:r>
               <w:rPr>
                 <w:b/>
+                <w:sz w:val="20"/>
               </w:rPr>
-              <w:t xml:space="preserve">Cần thấy: </w:t>
+              <w:t xml:space="preserve">Kết quả: </w:t>
             </w:r>
             <w:r>
-              <w:t>Ô đỏ được chọn; ảnh nhỏ đỏ; dòng “Màu: đỏ”, nhà cung cấp và giá hiển thị.</w:t>
+              <w:rPr>
+                <w:sz w:val="20"/>
+              </w:rPr>
+              <w:t>Ô đỏ có viền chọn; ảnh nhỏ chuyển đỏ; hiện màu, nhà cung cấp và giá.</w:t>
             </w:r>
           </w:p>
         </w:tc>
@@ -639,7 +710,7 @@
                 <w:tcPr>
                   <w:tcW w:type="dxa" w:w="4592"/>
                   <w:vAlign w:val="center"/>
-                  <w:shd w:fill="F4F6F9"/>
+                  <w:shd w:fill="FFFFFF"/>
                   <w:tcBorders>
                     <w:top w:val="dashed" w:sz="6" w:color="94A3B8"/>
                     <w:left w:val="dashed" w:sz="6" w:color="94A3B8"/>
@@ -649,28 +720,43 @@
                 </w:tcPr>
                 <w:p>
                   <w:pPr>
+                    <w:spacing w:before="0" w:after="0" w:line="240" w:lineRule="auto"/>
                     <w:jc w:val="center"/>
                   </w:pPr>
+                  <w:r/>
                   <w:r>
-                    <w:rPr>
-                      <w:b/>
-                      <w:color w:val="64748B"/>
-                    </w:rPr>
-                    <w:t>CHÈN ẢNH 1.4 TẠI ĐÂY</w:t>
-                  </w:r>
-                </w:p>
-                <w:p>
-                  <w:pPr>
-                    <w:jc w:val="center"/>
-                  </w:pPr>
-                  <w:r>
-                    <w:rPr>
-                      <w:color w:val="64748B"/>
-                      <w:sz w:val="20"/>
-                    </w:rPr>
-                    <w:t>Ảnh chụp màn hình thực tế</w:t>
-                    <w:br/>
-                    <w:t>Thay phần chữ này bằng ảnh</w:t>
+                    <w:drawing>
+                      <wp:inline xmlns:a="http://schemas.openxmlformats.org/drawingml/2006/main" xmlns:pic="http://schemas.openxmlformats.org/drawingml/2006/picture">
+                        <wp:extent cx="2195829" cy="4752000"/>
+                        <wp:docPr id="4" name="Picture 4"/>
+                        <wp:cNvGraphicFramePr>
+                          <a:graphicFrameLocks noChangeAspect="1"/>
+                        </wp:cNvGraphicFramePr>
+                        <a:graphic>
+                          <a:graphicData uri="http://schemas.openxmlformats.org/drawingml/2006/picture">
+                            <pic:pic>
+                              <pic:nvPicPr>
+                                <pic:cNvPr id="0" name="1.4-product-red.png"/>
+                                <pic:cNvPicPr/>
+                              </pic:nvPicPr>
+                              <pic:blipFill>
+                                <a:blip r:embed="rId15"/>
+                                <a:stretch>
+                                  <a:fillRect/>
+                                </a:stretch>
+                              </pic:blipFill>
+                              <pic:spPr>
+                                <a:xfrm>
+                                  <a:off x="0" y="0"/>
+                                  <a:ext cx="2195829" cy="4752000"/>
+                                </a:xfrm>
+                                <a:prstGeom prst="rect"/>
+                              </pic:spPr>
+                            </pic:pic>
+                          </a:graphicData>
+                        </a:graphic>
+                      </wp:inline>
+                    </w:drawing>
                   </w:r>
                 </w:p>
               </w:tc>
@@ -679,39 +765,39 @@
           <w:p>
             <w:pPr>
               <w:keepNext/>
+              <w:spacing w:before="100" w:after="100"/>
+              <w:jc w:val="center"/>
             </w:pPr>
+            <w:r>
+              <w:rPr>
+                <w:color w:val="475569"/>
+                <w:sz w:val="18"/>
+              </w:rPr>
+              <w:t>Chụp: 16:52:56 · 25/10/2026 (UTC+7)</w:t>
+            </w:r>
           </w:p>
           <w:p>
             <w:pPr>
               <w:keepNext/>
-              <w:spacing w:before="160"/>
+              <w:spacing w:before="60"/>
             </w:pPr>
             <w:r>
               <w:rPr>
                 <w:b/>
+                <w:sz w:val="20"/>
               </w:rPr>
-              <w:t xml:space="preserve">Cần thấy: </w:t>
+              <w:t xml:space="preserve">Kết quả: </w:t>
             </w:r>
             <w:r>
-              <w:t>Ảnh lớn chuyển đỏ; nút “4 MÀU-CHỌN LOẠI”; nút “CHỌN MUA” ở đáy.</w:t>
+              <w:rPr>
+                <w:sz w:val="20"/>
+              </w:rPr>
+              <w:t>Sau khi bấm XONG: ảnh lớn đỏ và nút 4 MÀU-CHỌN LOẠI.</w:t>
             </w:r>
           </w:p>
         </w:tc>
       </w:tr>
     </w:tbl>
-    <w:p>
-      <w:pPr>
-        <w:keepNext w:val="0"/>
-        <w:spacing w:before="200"/>
-      </w:pPr>
-      <w:r>
-        <w:rPr>
-          <w:color w:val="64748B"/>
-          <w:sz w:val="20"/>
-        </w:rPr>
-        <w:t>Ghi chú (nếu có): ................................................................................................</w:t>
-      </w:r>
-    </w:p>
     <w:p>
       <w:r>
         <w:br w:type="page"/>
@@ -784,7 +870,7 @@
                 <w:tcPr>
                   <w:tcW w:type="dxa" w:w="4592"/>
                   <w:vAlign w:val="center"/>
-                  <w:shd w:fill="F4F6F9"/>
+                  <w:shd w:fill="FFFFFF"/>
                   <w:tcBorders>
                     <w:top w:val="dashed" w:sz="6" w:color="94A3B8"/>
                     <w:left w:val="dashed" w:sz="6" w:color="94A3B8"/>
@@ -794,28 +880,43 @@
                 </w:tcPr>
                 <w:p>
                   <w:pPr>
+                    <w:spacing w:before="0" w:after="0" w:line="240" w:lineRule="auto"/>
                     <w:jc w:val="center"/>
                   </w:pPr>
+                  <w:r/>
                   <w:r>
-                    <w:rPr>
-                      <w:b/>
-                      <w:color w:val="64748B"/>
-                    </w:rPr>
-                    <w:t>CHÈN ẢNH 2.1 TẠI ĐÂY</w:t>
-                  </w:r>
-                </w:p>
-                <w:p>
-                  <w:pPr>
-                    <w:jc w:val="center"/>
-                  </w:pPr>
-                  <w:r>
-                    <w:rPr>
-                      <w:color w:val="64748B"/>
-                      <w:sz w:val="20"/>
-                    </w:rPr>
-                    <w:t>Ảnh chụp màn hình thực tế</w:t>
-                    <w:br/>
-                    <w:t>Thay phần chữ này bằng ảnh</w:t>
+                    <w:drawing>
+                      <wp:inline xmlns:a="http://schemas.openxmlformats.org/drawingml/2006/main" xmlns:pic="http://schemas.openxmlformats.org/drawingml/2006/picture">
+                        <wp:extent cx="2195829" cy="4752000"/>
+                        <wp:docPr id="5" name="Picture 5"/>
+                        <wp:cNvGraphicFramePr>
+                          <a:graphicFrameLocks noChangeAspect="1"/>
+                        </wp:cNvGraphicFramePr>
+                        <a:graphic>
+                          <a:graphicData uri="http://schemas.openxmlformats.org/drawingml/2006/picture">
+                            <pic:pic>
+                              <pic:nvPicPr>
+                                <pic:cNvPr id="0" name="2.1-api-json.png"/>
+                                <pic:cNvPicPr/>
+                              </pic:nvPicPr>
+                              <pic:blipFill>
+                                <a:blip r:embed="rId16"/>
+                                <a:stretch>
+                                  <a:fillRect/>
+                                </a:stretch>
+                              </pic:blipFill>
+                              <pic:spPr>
+                                <a:xfrm>
+                                  <a:off x="0" y="0"/>
+                                  <a:ext cx="2195829" cy="4752000"/>
+                                </a:xfrm>
+                                <a:prstGeom prst="rect"/>
+                              </pic:spPr>
+                            </pic:pic>
+                          </a:graphicData>
+                        </a:graphic>
+                      </wp:inline>
+                    </w:drawing>
                   </w:r>
                 </w:p>
               </w:tc>
@@ -824,21 +925,34 @@
           <w:p>
             <w:pPr>
               <w:keepNext/>
+              <w:spacing w:before="100" w:after="100"/>
+              <w:jc w:val="center"/>
             </w:pPr>
+            <w:r>
+              <w:rPr>
+                <w:color w:val="475569"/>
+                <w:sz w:val="18"/>
+              </w:rPr>
+              <w:t>Chụp: 16:53:48 · 25/10/2026 (UTC+7)</w:t>
+            </w:r>
           </w:p>
           <w:p>
             <w:pPr>
               <w:keepNext/>
-              <w:spacing w:before="160"/>
+              <w:spacing w:before="60"/>
             </w:pPr>
             <w:r>
               <w:rPr>
                 <w:b/>
+                <w:sz w:val="20"/>
               </w:rPr>
-              <w:t xml:space="preserve">Cần thấy: </w:t>
+              <w:t xml:space="preserve">Kết quả: </w:t>
             </w:r>
             <w:r>
-              <w:t>Mở /phones/1 trên trình duyệt: thấy id, name, price và các trường theo mẫu. Không chụp thông tin đăng nhập hay mã bí mật.</w:t>
+              <w:rPr>
+                <w:sz w:val="20"/>
+              </w:rPr>
+              <w:t>Phản hồi thật từ /phones/1: id = 1, tên Vsmart Joy 3, price = 1790000 và các trường cấu hình.</w:t>
             </w:r>
           </w:p>
         </w:tc>
@@ -883,7 +997,7 @@
                 <w:tcPr>
                   <w:tcW w:type="dxa" w:w="4592"/>
                   <w:vAlign w:val="center"/>
-                  <w:shd w:fill="F4F6F9"/>
+                  <w:shd w:fill="FFFFFF"/>
                   <w:tcBorders>
                     <w:top w:val="dashed" w:sz="6" w:color="94A3B8"/>
                     <w:left w:val="dashed" w:sz="6" w:color="94A3B8"/>
@@ -893,28 +1007,43 @@
                 </w:tcPr>
                 <w:p>
                   <w:pPr>
+                    <w:spacing w:before="0" w:after="0" w:line="240" w:lineRule="auto"/>
                     <w:jc w:val="center"/>
                   </w:pPr>
+                  <w:r/>
                   <w:r>
-                    <w:rPr>
-                      <w:b/>
-                      <w:color w:val="64748B"/>
-                    </w:rPr>
-                    <w:t>CHÈN ẢNH 2.2 TẠI ĐÂY</w:t>
-                  </w:r>
-                </w:p>
-                <w:p>
-                  <w:pPr>
-                    <w:jc w:val="center"/>
-                  </w:pPr>
-                  <w:r>
-                    <w:rPr>
-                      <w:color w:val="64748B"/>
-                      <w:sz w:val="20"/>
-                    </w:rPr>
-                    <w:t>Ảnh chụp màn hình thực tế</w:t>
-                    <w:br/>
-                    <w:t>Thay phần chữ này bằng ảnh</w:t>
+                    <w:drawing>
+                      <wp:inline xmlns:a="http://schemas.openxmlformats.org/drawingml/2006/main" xmlns:pic="http://schemas.openxmlformats.org/drawingml/2006/picture">
+                        <wp:extent cx="2195829" cy="4752000"/>
+                        <wp:docPr id="6" name="Picture 6"/>
+                        <wp:cNvGraphicFramePr>
+                          <a:graphicFrameLocks noChangeAspect="1"/>
+                        </wp:cNvGraphicFramePr>
+                        <a:graphic>
+                          <a:graphicData uri="http://schemas.openxmlformats.org/drawingml/2006/picture">
+                            <pic:pic>
+                              <pic:nvPicPr>
+                                <pic:cNvPr id="0" name="2.2-loading.png"/>
+                                <pic:cNvPicPr/>
+                              </pic:nvPicPr>
+                              <pic:blipFill>
+                                <a:blip r:embed="rId17"/>
+                                <a:stretch>
+                                  <a:fillRect/>
+                                </a:stretch>
+                              </pic:blipFill>
+                              <pic:spPr>
+                                <a:xfrm>
+                                  <a:off x="0" y="0"/>
+                                  <a:ext cx="2195829" cy="4752000"/>
+                                </a:xfrm>
+                                <a:prstGeom prst="rect"/>
+                              </pic:spPr>
+                            </pic:pic>
+                          </a:graphicData>
+                        </a:graphic>
+                      </wp:inline>
+                    </w:drawing>
                   </w:r>
                 </w:p>
               </w:tc>
@@ -923,39 +1052,39 @@
           <w:p>
             <w:pPr>
               <w:keepNext/>
+              <w:spacing w:before="100" w:after="100"/>
+              <w:jc w:val="center"/>
             </w:pPr>
+            <w:r>
+              <w:rPr>
+                <w:color w:val="475569"/>
+                <w:sz w:val="18"/>
+              </w:rPr>
+              <w:t>Chụp: 16:52:57 · 25/10/2026 (UTC+7)</w:t>
+            </w:r>
           </w:p>
           <w:p>
             <w:pPr>
               <w:keepNext/>
-              <w:spacing w:before="160"/>
+              <w:spacing w:before="60"/>
             </w:pPr>
             <w:r>
               <w:rPr>
                 <w:b/>
+                <w:sz w:val="20"/>
               </w:rPr>
-              <w:t xml:space="preserve">Cần thấy: </w:t>
+              <w:t xml:space="preserve">Kết quả: </w:t>
             </w:r>
             <w:r>
-              <w:t>Mở Bài 2; chụp vòng xoay ActivityIndicator và dòng “Đang tải...” trước khi sản phẩm xuất hiện.</w:t>
+              <w:rPr>
+                <w:sz w:val="20"/>
+              </w:rPr>
+              <w:t>Vòng xoay và dòng Đang tải...; yêu cầu API được làm chậm 2,2 giây để chụp trạng thái này.</w:t>
             </w:r>
           </w:p>
         </w:tc>
       </w:tr>
     </w:tbl>
-    <w:p>
-      <w:pPr>
-        <w:keepNext w:val="0"/>
-        <w:spacing w:before="200"/>
-      </w:pPr>
-      <w:r>
-        <w:rPr>
-          <w:color w:val="64748B"/>
-          <w:sz w:val="20"/>
-        </w:rPr>
-        <w:t>Ghi chú (nếu có): ................................................................................................</w:t>
-      </w:r>
-    </w:p>
     <w:p>
       <w:r>
         <w:br w:type="page"/>
@@ -1028,7 +1157,7 @@
                 <w:tcPr>
                   <w:tcW w:type="dxa" w:w="4592"/>
                   <w:vAlign w:val="center"/>
-                  <w:shd w:fill="F4F6F9"/>
+                  <w:shd w:fill="FFFFFF"/>
                   <w:tcBorders>
                     <w:top w:val="dashed" w:sz="6" w:color="94A3B8"/>
                     <w:left w:val="dashed" w:sz="6" w:color="94A3B8"/>
@@ -1038,28 +1167,43 @@
                 </w:tcPr>
                 <w:p>
                   <w:pPr>
+                    <w:spacing w:before="0" w:after="0" w:line="240" w:lineRule="auto"/>
                     <w:jc w:val="center"/>
                   </w:pPr>
+                  <w:r/>
                   <w:r>
-                    <w:rPr>
-                      <w:b/>
-                      <w:color w:val="64748B"/>
-                    </w:rPr>
-                    <w:t>CHÈN ẢNH 2.3 TẠI ĐÂY</w:t>
-                  </w:r>
-                </w:p>
-                <w:p>
-                  <w:pPr>
-                    <w:jc w:val="center"/>
-                  </w:pPr>
-                  <w:r>
-                    <w:rPr>
-                      <w:color w:val="64748B"/>
-                      <w:sz w:val="20"/>
-                    </w:rPr>
-                    <w:t>Ảnh chụp màn hình thực tế</w:t>
-                    <w:br/>
-                    <w:t>Thay phần chữ này bằng ảnh</w:t>
+                    <w:drawing>
+                      <wp:inline xmlns:a="http://schemas.openxmlformats.org/drawingml/2006/main" xmlns:pic="http://schemas.openxmlformats.org/drawingml/2006/picture">
+                        <wp:extent cx="2195829" cy="4752000"/>
+                        <wp:docPr id="7" name="Picture 7"/>
+                        <wp:cNvGraphicFramePr>
+                          <a:graphicFrameLocks noChangeAspect="1"/>
+                        </wp:cNvGraphicFramePr>
+                        <a:graphic>
+                          <a:graphicData uri="http://schemas.openxmlformats.org/drawingml/2006/picture">
+                            <pic:pic>
+                              <pic:nvPicPr>
+                                <pic:cNvPr id="0" name="2.1-api-json.png"/>
+                                <pic:cNvPicPr/>
+                              </pic:nvPicPr>
+                              <pic:blipFill>
+                                <a:blip r:embed="rId16"/>
+                                <a:stretch>
+                                  <a:fillRect/>
+                                </a:stretch>
+                              </pic:blipFill>
+                              <pic:spPr>
+                                <a:xfrm>
+                                  <a:off x="0" y="0"/>
+                                  <a:ext cx="2195829" cy="4752000"/>
+                                </a:xfrm>
+                                <a:prstGeom prst="rect"/>
+                              </pic:spPr>
+                            </pic:pic>
+                          </a:graphicData>
+                        </a:graphic>
+                      </wp:inline>
+                    </w:drawing>
                   </w:r>
                 </w:p>
               </w:tc>
@@ -1068,21 +1212,34 @@
           <w:p>
             <w:pPr>
               <w:keepNext/>
+              <w:spacing w:before="100" w:after="100"/>
+              <w:jc w:val="center"/>
             </w:pPr>
+            <w:r>
+              <w:rPr>
+                <w:color w:val="475569"/>
+                <w:sz w:val="18"/>
+              </w:rPr>
+              <w:t>Chụp: 16:53:48 · 25/10/2026 (UTC+7)</w:t>
+            </w:r>
           </w:p>
           <w:p>
             <w:pPr>
               <w:keepNext/>
-              <w:spacing w:before="160"/>
+              <w:spacing w:before="60"/>
             </w:pPr>
             <w:r>
               <w:rPr>
                 <w:b/>
+                <w:sz w:val="20"/>
               </w:rPr>
-              <w:t xml:space="preserve">Cần thấy: </w:t>
+              <w:t xml:space="preserve">Kết quả: </w:t>
             </w:r>
             <w:r>
-              <w:t>Chụp bản ghi phones/1 trên MockAPI với tên/giá đang dùng để đối chiếu với ảnh kế bên.</w:t>
+              <w:rPr>
+                <w:sz w:val="20"/>
+              </w:rPr>
+              <w:t>Bản ghi API thật: Vsmart Joy 3, giá 1.790.000 đ, defaultColor = blue. Đối chiếu với ảnh 2.4.</w:t>
             </w:r>
           </w:p>
         </w:tc>
@@ -1127,7 +1284,7 @@
                 <w:tcPr>
                   <w:tcW w:type="dxa" w:w="4592"/>
                   <w:vAlign w:val="center"/>
-                  <w:shd w:fill="F4F6F9"/>
+                  <w:shd w:fill="FFFFFF"/>
                   <w:tcBorders>
                     <w:top w:val="dashed" w:sz="6" w:color="94A3B8"/>
                     <w:left w:val="dashed" w:sz="6" w:color="94A3B8"/>
@@ -1137,28 +1294,43 @@
                 </w:tcPr>
                 <w:p>
                   <w:pPr>
+                    <w:spacing w:before="0" w:after="0" w:line="240" w:lineRule="auto"/>
                     <w:jc w:val="center"/>
                   </w:pPr>
+                  <w:r/>
                   <w:r>
-                    <w:rPr>
-                      <w:b/>
-                      <w:color w:val="64748B"/>
-                    </w:rPr>
-                    <w:t>CHÈN ẢNH 2.4 TẠI ĐÂY</w:t>
-                  </w:r>
-                </w:p>
-                <w:p>
-                  <w:pPr>
-                    <w:jc w:val="center"/>
-                  </w:pPr>
-                  <w:r>
-                    <w:rPr>
-                      <w:color w:val="64748B"/>
-                      <w:sz w:val="20"/>
-                    </w:rPr>
-                    <w:t>Ảnh chụp màn hình thực tế</w:t>
-                    <w:br/>
-                    <w:t>Thay phần chữ này bằng ảnh</w:t>
+                    <w:drawing>
+                      <wp:inline xmlns:a="http://schemas.openxmlformats.org/drawingml/2006/main" xmlns:pic="http://schemas.openxmlformats.org/drawingml/2006/picture">
+                        <wp:extent cx="2195829" cy="4752000"/>
+                        <wp:docPr id="8" name="Picture 8"/>
+                        <wp:cNvGraphicFramePr>
+                          <a:graphicFrameLocks noChangeAspect="1"/>
+                        </wp:cNvGraphicFramePr>
+                        <a:graphic>
+                          <a:graphicData uri="http://schemas.openxmlformats.org/drawingml/2006/picture">
+                            <pic:pic>
+                              <pic:nvPicPr>
+                                <pic:cNvPr id="0" name="2.4-api-product.png"/>
+                                <pic:cNvPicPr/>
+                              </pic:nvPicPr>
+                              <pic:blipFill>
+                                <a:blip r:embed="rId18"/>
+                                <a:stretch>
+                                  <a:fillRect/>
+                                </a:stretch>
+                              </pic:blipFill>
+                              <pic:spPr>
+                                <a:xfrm>
+                                  <a:off x="0" y="0"/>
+                                  <a:ext cx="2195829" cy="4752000"/>
+                                </a:xfrm>
+                                <a:prstGeom prst="rect"/>
+                              </pic:spPr>
+                            </pic:pic>
+                          </a:graphicData>
+                        </a:graphic>
+                      </wp:inline>
+                    </w:drawing>
                   </w:r>
                 </w:p>
               </w:tc>
@@ -1167,39 +1339,39 @@
           <w:p>
             <w:pPr>
               <w:keepNext/>
+              <w:spacing w:before="100" w:after="100"/>
+              <w:jc w:val="center"/>
             </w:pPr>
+            <w:r>
+              <w:rPr>
+                <w:color w:val="475569"/>
+                <w:sz w:val="18"/>
+              </w:rPr>
+              <w:t>Chụp: 16:53:00 · 25/10/2026 (UTC+7)</w:t>
+            </w:r>
           </w:p>
           <w:p>
             <w:pPr>
               <w:keepNext/>
-              <w:spacing w:before="160"/>
+              <w:spacing w:before="60"/>
             </w:pPr>
             <w:r>
               <w:rPr>
                 <w:b/>
+                <w:sz w:val="20"/>
               </w:rPr>
-              <w:t xml:space="preserve">Cần thấy: </w:t>
+              <w:t xml:space="preserve">Kết quả: </w:t>
             </w:r>
             <w:r>
-              <w:t>Tên/giá trong Bài 2 khớp với bản ghi API ở ảnh 2.3. Khi sửa dữ liệu API, về menu rồi mở lại Bài 2 để tải lại.</w:t>
+              <w:rPr>
+                <w:sz w:val="20"/>
+              </w:rPr>
+              <w:t>Bài 2 hiển thị đúng tên/giá/màu mặc định từ phản hồi API thật; không sử dụng fallback offline.</w:t>
             </w:r>
           </w:p>
         </w:tc>
       </w:tr>
     </w:tbl>
-    <w:p>
-      <w:pPr>
-        <w:keepNext w:val="0"/>
-        <w:spacing w:before="200"/>
-      </w:pPr>
-      <w:r>
-        <w:rPr>
-          <w:color w:val="64748B"/>
-          <w:sz w:val="20"/>
-        </w:rPr>
-        <w:t>Ghi chú (nếu có): ................................................................................................</w:t>
-      </w:r>
-    </w:p>
     <w:p>
       <w:r>
         <w:br w:type="page"/>
@@ -1272,7 +1444,7 @@
                 <w:tcPr>
                   <w:tcW w:type="dxa" w:w="4592"/>
                   <w:vAlign w:val="center"/>
-                  <w:shd w:fill="F4F6F9"/>
+                  <w:shd w:fill="FFFFFF"/>
                   <w:tcBorders>
                     <w:top w:val="dashed" w:sz="6" w:color="94A3B8"/>
                     <w:left w:val="dashed" w:sz="6" w:color="94A3B8"/>
@@ -1282,28 +1454,43 @@
                 </w:tcPr>
                 <w:p>
                   <w:pPr>
+                    <w:spacing w:before="0" w:after="0" w:line="240" w:lineRule="auto"/>
                     <w:jc w:val="center"/>
                   </w:pPr>
+                  <w:r/>
                   <w:r>
-                    <w:rPr>
-                      <w:b/>
-                      <w:color w:val="64748B"/>
-                    </w:rPr>
-                    <w:t>CHÈN ẢNH 2.5 TẠI ĐÂY</w:t>
-                  </w:r>
-                </w:p>
-                <w:p>
-                  <w:pPr>
-                    <w:jc w:val="center"/>
-                  </w:pPr>
-                  <w:r>
-                    <w:rPr>
-                      <w:color w:val="64748B"/>
-                      <w:sz w:val="20"/>
-                    </w:rPr>
-                    <w:t>Ảnh chụp màn hình thực tế</w:t>
-                    <w:br/>
-                    <w:t>Thay phần chữ này bằng ảnh</w:t>
+                    <w:drawing>
+                      <wp:inline xmlns:a="http://schemas.openxmlformats.org/drawingml/2006/main" xmlns:pic="http://schemas.openxmlformats.org/drawingml/2006/picture">
+                        <wp:extent cx="2195829" cy="4752000"/>
+                        <wp:docPr id="9" name="Picture 9"/>
+                        <wp:cNvGraphicFramePr>
+                          <a:graphicFrameLocks noChangeAspect="1"/>
+                        </wp:cNvGraphicFramePr>
+                        <a:graphic>
+                          <a:graphicData uri="http://schemas.openxmlformats.org/drawingml/2006/picture">
+                            <pic:pic>
+                              <pic:nvPicPr>
+                                <pic:cNvPr id="0" name="2.5-api-network-error.png"/>
+                                <pic:cNvPicPr/>
+                              </pic:nvPicPr>
+                              <pic:blipFill>
+                                <a:blip r:embed="rId19"/>
+                                <a:stretch>
+                                  <a:fillRect/>
+                                </a:stretch>
+                              </pic:blipFill>
+                              <pic:spPr>
+                                <a:xfrm>
+                                  <a:off x="0" y="0"/>
+                                  <a:ext cx="2195829" cy="4752000"/>
+                                </a:xfrm>
+                                <a:prstGeom prst="rect"/>
+                              </pic:spPr>
+                            </pic:pic>
+                          </a:graphicData>
+                        </a:graphic>
+                      </wp:inline>
+                    </w:drawing>
                   </w:r>
                 </w:p>
               </w:tc>
@@ -1312,21 +1499,34 @@
           <w:p>
             <w:pPr>
               <w:keepNext/>
+              <w:spacing w:before="100" w:after="100"/>
+              <w:jc w:val="center"/>
             </w:pPr>
+            <w:r>
+              <w:rPr>
+                <w:color w:val="475569"/>
+                <w:sz w:val="18"/>
+              </w:rPr>
+              <w:t>Chụp: 16:53:03 · 25/10/2026 (UTC+7)</w:t>
+            </w:r>
           </w:p>
           <w:p>
             <w:pPr>
               <w:keepNext/>
-              <w:spacing w:before="160"/>
+              <w:spacing w:before="60"/>
             </w:pPr>
             <w:r>
               <w:rPr>
                 <w:b/>
+                <w:sz w:val="20"/>
               </w:rPr>
-              <w:t xml:space="preserve">Cần thấy: </w:t>
+              <w:t xml:space="preserve">Kết quả: </w:t>
             </w:r>
             <w:r>
-              <w:t>Ứng dụng hiện thông báo lỗi và nút “THỬ LẠI”; không dùng ảnh offline thành công thay cho kiểm tra lỗi API.</w:t>
+              <w:rPr>
+                <w:sz w:val="20"/>
+              </w:rPr>
+              <w:t>Ngắt yêu cầu có kiểm soát bằng Playwright: hiện Failed to fetch và nút THỬ LẠI. Đây là tình huống lỗi mô phỏng.</w:t>
             </w:r>
           </w:p>
         </w:tc>
@@ -1371,7 +1571,7 @@
                 <w:tcPr>
                   <w:tcW w:type="dxa" w:w="4592"/>
                   <w:vAlign w:val="center"/>
-                  <w:shd w:fill="F4F6F9"/>
+                  <w:shd w:fill="FFFFFF"/>
                   <w:tcBorders>
                     <w:top w:val="dashed" w:sz="6" w:color="94A3B8"/>
                     <w:left w:val="dashed" w:sz="6" w:color="94A3B8"/>
@@ -1381,28 +1581,43 @@
                 </w:tcPr>
                 <w:p>
                   <w:pPr>
+                    <w:spacing w:before="0" w:after="0" w:line="240" w:lineRule="auto"/>
                     <w:jc w:val="center"/>
                   </w:pPr>
+                  <w:r/>
                   <w:r>
-                    <w:rPr>
-                      <w:b/>
-                      <w:color w:val="64748B"/>
-                    </w:rPr>
-                    <w:t>CHÈN ẢNH 2.6 TẠI ĐÂY</w:t>
-                  </w:r>
-                </w:p>
-                <w:p>
-                  <w:pPr>
-                    <w:jc w:val="center"/>
-                  </w:pPr>
-                  <w:r>
-                    <w:rPr>
-                      <w:color w:val="64748B"/>
-                      <w:sz w:val="20"/>
-                    </w:rPr>
-                    <w:t>Ảnh chụp màn hình thực tế</w:t>
-                    <w:br/>
-                    <w:t>Thay phần chữ này bằng ảnh</w:t>
+                    <w:drawing>
+                      <wp:inline xmlns:a="http://schemas.openxmlformats.org/drawingml/2006/main" xmlns:pic="http://schemas.openxmlformats.org/drawingml/2006/picture">
+                        <wp:extent cx="2195829" cy="4752000"/>
+                        <wp:docPr id="10" name="Picture 10"/>
+                        <wp:cNvGraphicFramePr>
+                          <a:graphicFrameLocks noChangeAspect="1"/>
+                        </wp:cNvGraphicFramePr>
+                        <a:graphic>
+                          <a:graphicData uri="http://schemas.openxmlformats.org/drawingml/2006/picture">
+                            <pic:pic>
+                              <pic:nvPicPr>
+                                <pic:cNvPr id="0" name="2.4-api-product.png"/>
+                                <pic:cNvPicPr/>
+                              </pic:nvPicPr>
+                              <pic:blipFill>
+                                <a:blip r:embed="rId18"/>
+                                <a:stretch>
+                                  <a:fillRect/>
+                                </a:stretch>
+                              </pic:blipFill>
+                              <pic:spPr>
+                                <a:xfrm>
+                                  <a:off x="0" y="0"/>
+                                  <a:ext cx="2195829" cy="4752000"/>
+                                </a:xfrm>
+                                <a:prstGeom prst="rect"/>
+                              </pic:spPr>
+                            </pic:pic>
+                          </a:graphicData>
+                        </a:graphic>
+                      </wp:inline>
+                    </w:drawing>
                   </w:r>
                 </w:p>
               </w:tc>
@@ -1411,39 +1626,39 @@
           <w:p>
             <w:pPr>
               <w:keepNext/>
+              <w:spacing w:before="100" w:after="100"/>
+              <w:jc w:val="center"/>
             </w:pPr>
+            <w:r>
+              <w:rPr>
+                <w:color w:val="475569"/>
+                <w:sz w:val="18"/>
+              </w:rPr>
+              <w:t>Chụp: 16:53:06 · 25/10/2026 (UTC+7)</w:t>
+            </w:r>
           </w:p>
           <w:p>
             <w:pPr>
               <w:keepNext/>
-              <w:spacing w:before="160"/>
+              <w:spacing w:before="60"/>
             </w:pPr>
             <w:r>
               <w:rPr>
                 <w:b/>
+                <w:sz w:val="20"/>
               </w:rPr>
-              <w:t xml:space="preserve">Cần thấy: </w:t>
+              <w:t xml:space="preserve">Kết quả: </w:t>
             </w:r>
             <w:r>
-              <w:t>Khôi phục mạng nếu đã tắt rồi bấm “THỬ LẠI”; sản phẩm tải lại thành công. Nếu đổi URL qua .env thì phải khởi động lại Expo.</w:t>
+              <w:rPr>
+                <w:sz w:val="20"/>
+              </w:rPr>
+              <w:t>Khôi phục kết nối rồi bấm THỬ LẠI: ứng dụng gọi lại API thật và hiển thị sản phẩm thành công.</w:t>
             </w:r>
           </w:p>
         </w:tc>
       </w:tr>
     </w:tbl>
-    <w:p>
-      <w:pPr>
-        <w:keepNext w:val="0"/>
-        <w:spacing w:before="200"/>
-      </w:pPr>
-      <w:r>
-        <w:rPr>
-          <w:color w:val="64748B"/>
-          <w:sz w:val="20"/>
-        </w:rPr>
-        <w:t>Ghi chú (nếu có): ................................................................................................</w:t>
-      </w:r>
-    </w:p>
     <w:p>
       <w:r>
         <w:br w:type="page"/>
@@ -1516,7 +1731,7 @@
                 <w:tcPr>
                   <w:tcW w:type="dxa" w:w="4592"/>
                   <w:vAlign w:val="center"/>
-                  <w:shd w:fill="F4F6F9"/>
+                  <w:shd w:fill="FFFFFF"/>
                   <w:tcBorders>
                     <w:top w:val="dashed" w:sz="6" w:color="94A3B8"/>
                     <w:left w:val="dashed" w:sz="6" w:color="94A3B8"/>
@@ -1526,28 +1741,43 @@
                 </w:tcPr>
                 <w:p>
                   <w:pPr>
+                    <w:spacing w:before="0" w:after="0" w:line="240" w:lineRule="auto"/>
                     <w:jc w:val="center"/>
                   </w:pPr>
+                  <w:r/>
                   <w:r>
-                    <w:rPr>
-                      <w:b/>
-                      <w:color w:val="64748B"/>
-                    </w:rPr>
-                    <w:t>CHÈN ẢNH 3.1 TẠI ĐÂY</w:t>
-                  </w:r>
-                </w:p>
-                <w:p>
-                  <w:pPr>
-                    <w:jc w:val="center"/>
-                  </w:pPr>
-                  <w:r>
-                    <w:rPr>
-                      <w:color w:val="64748B"/>
-                      <w:sz w:val="20"/>
-                    </w:rPr>
-                    <w:t>Ảnh chụp màn hình thực tế</w:t>
-                    <w:br/>
-                    <w:t>Thay phần chữ này bằng ảnh</w:t>
+                    <w:drawing>
+                      <wp:inline xmlns:a="http://schemas.openxmlformats.org/drawingml/2006/main" xmlns:pic="http://schemas.openxmlformats.org/drawingml/2006/picture">
+                        <wp:extent cx="2195829" cy="4752000"/>
+                        <wp:docPr id="11" name="Picture 11"/>
+                        <wp:cNvGraphicFramePr>
+                          <a:graphicFrameLocks noChangeAspect="1"/>
+                        </wp:cNvGraphicFramePr>
+                        <a:graphic>
+                          <a:graphicData uri="http://schemas.openxmlformats.org/drawingml/2006/picture">
+                            <pic:pic>
+                              <pic:nvPicPr>
+                                <pic:cNvPr id="0" name="3.1-home.png"/>
+                                <pic:cNvPicPr/>
+                              </pic:nvPicPr>
+                              <pic:blipFill>
+                                <a:blip r:embed="rId20"/>
+                                <a:stretch>
+                                  <a:fillRect/>
+                                </a:stretch>
+                              </pic:blipFill>
+                              <pic:spPr>
+                                <a:xfrm>
+                                  <a:off x="0" y="0"/>
+                                  <a:ext cx="2195829" cy="4752000"/>
+                                </a:xfrm>
+                                <a:prstGeom prst="rect"/>
+                              </pic:spPr>
+                            </pic:pic>
+                          </a:graphicData>
+                        </a:graphic>
+                      </wp:inline>
+                    </w:drawing>
                   </w:r>
                 </w:p>
               </w:tc>
@@ -1556,21 +1786,34 @@
           <w:p>
             <w:pPr>
               <w:keepNext/>
+              <w:spacing w:before="100" w:after="100"/>
+              <w:jc w:val="center"/>
             </w:pPr>
+            <w:r>
+              <w:rPr>
+                <w:color w:val="475569"/>
+                <w:sz w:val="18"/>
+              </w:rPr>
+              <w:t>Chụp: 16:53:08 · 25/10/2026 (UTC+7)</w:t>
+            </w:r>
           </w:p>
           <w:p>
             <w:pPr>
               <w:keepNext/>
-              <w:spacing w:before="160"/>
+              <w:spacing w:before="60"/>
             </w:pPr>
             <w:r>
               <w:rPr>
                 <w:b/>
+                <w:sz w:val="20"/>
               </w:rPr>
-              <w:t xml:space="preserve">Cần thấy: </w:t>
+              <w:t xml:space="preserve">Kết quả: </w:t>
             </w:r>
             <w:r>
-              <w:t>Danh sách sản phẩm FlatList; thanh tab có Trang chủ/Tìm kiếm/Cá nhân và các icon; tab đang chọn có màu đỏ.</w:t>
+              <w:rPr>
+                <w:sz w:val="20"/>
+              </w:rPr>
+              <w:t>Tab Trang chủ có danh sách sáu sản phẩm; thanh tab gồm Trang chủ, Tìm kiếm và Cá nhân.</w:t>
             </w:r>
           </w:p>
         </w:tc>
@@ -1615,7 +1858,7 @@
                 <w:tcPr>
                   <w:tcW w:type="dxa" w:w="4592"/>
                   <w:vAlign w:val="center"/>
-                  <w:shd w:fill="F4F6F9"/>
+                  <w:shd w:fill="FFFFFF"/>
                   <w:tcBorders>
                     <w:top w:val="dashed" w:sz="6" w:color="94A3B8"/>
                     <w:left w:val="dashed" w:sz="6" w:color="94A3B8"/>
@@ -1625,28 +1868,43 @@
                 </w:tcPr>
                 <w:p>
                   <w:pPr>
+                    <w:spacing w:before="0" w:after="0" w:line="240" w:lineRule="auto"/>
                     <w:jc w:val="center"/>
                   </w:pPr>
+                  <w:r/>
                   <w:r>
-                    <w:rPr>
-                      <w:b/>
-                      <w:color w:val="64748B"/>
-                    </w:rPr>
-                    <w:t>CHÈN ẢNH 3.2 TẠI ĐÂY</w:t>
-                  </w:r>
-                </w:p>
-                <w:p>
-                  <w:pPr>
-                    <w:jc w:val="center"/>
-                  </w:pPr>
-                  <w:r>
-                    <w:rPr>
-                      <w:color w:val="64748B"/>
-                      <w:sz w:val="20"/>
-                    </w:rPr>
-                    <w:t>Ảnh chụp màn hình thực tế</w:t>
-                    <w:br/>
-                    <w:t>Thay phần chữ này bằng ảnh</w:t>
+                    <w:drawing>
+                      <wp:inline xmlns:a="http://schemas.openxmlformats.org/drawingml/2006/main" xmlns:pic="http://schemas.openxmlformats.org/drawingml/2006/picture">
+                        <wp:extent cx="2195829" cy="4752000"/>
+                        <wp:docPr id="12" name="Picture 12"/>
+                        <wp:cNvGraphicFramePr>
+                          <a:graphicFrameLocks noChangeAspect="1"/>
+                        </wp:cNvGraphicFramePr>
+                        <a:graphic>
+                          <a:graphicData uri="http://schemas.openxmlformats.org/drawingml/2006/picture">
+                            <pic:pic>
+                              <pic:nvPicPr>
+                                <pic:cNvPr id="0" name="3.2-search-aris.png"/>
+                                <pic:cNvPicPr/>
+                              </pic:nvPicPr>
+                              <pic:blipFill>
+                                <a:blip r:embed="rId21"/>
+                                <a:stretch>
+                                  <a:fillRect/>
+                                </a:stretch>
+                              </pic:blipFill>
+                              <pic:spPr>
+                                <a:xfrm>
+                                  <a:off x="0" y="0"/>
+                                  <a:ext cx="2195829" cy="4752000"/>
+                                </a:xfrm>
+                                <a:prstGeom prst="rect"/>
+                              </pic:spPr>
+                            </pic:pic>
+                          </a:graphicData>
+                        </a:graphic>
+                      </wp:inline>
+                    </w:drawing>
                   </w:r>
                 </w:p>
               </w:tc>
@@ -1655,39 +1913,39 @@
           <w:p>
             <w:pPr>
               <w:keepNext/>
+              <w:spacing w:before="100" w:after="100"/>
+              <w:jc w:val="center"/>
             </w:pPr>
+            <w:r>
+              <w:rPr>
+                <w:color w:val="475569"/>
+                <w:sz w:val="18"/>
+              </w:rPr>
+              <w:t>Chụp: 16:53:09 · 25/10/2026 (UTC+7)</w:t>
+            </w:r>
           </w:p>
           <w:p>
             <w:pPr>
               <w:keepNext/>
-              <w:spacing w:before="160"/>
+              <w:spacing w:before="60"/>
             </w:pPr>
             <w:r>
               <w:rPr>
                 <w:b/>
+                <w:sz w:val="20"/>
               </w:rPr>
-              <w:t xml:space="preserve">Cần thấy: </w:t>
+              <w:t xml:space="preserve">Kết quả: </w:t>
             </w:r>
             <w:r>
-              <w:t>TextInput có từ khóa “aris”; kết quả chỉ còn sản phẩm Vsmart Aris Pro.</w:t>
+              <w:rPr>
+                <w:sz w:val="20"/>
+              </w:rPr>
+              <w:t>Nhập aris: danh sách được lọc, chỉ còn Vsmart Aris Pro.</w:t>
             </w:r>
           </w:p>
         </w:tc>
       </w:tr>
     </w:tbl>
-    <w:p>
-      <w:pPr>
-        <w:keepNext w:val="0"/>
-        <w:spacing w:before="200"/>
-      </w:pPr>
-      <w:r>
-        <w:rPr>
-          <w:color w:val="64748B"/>
-          <w:sz w:val="20"/>
-        </w:rPr>
-        <w:t>Ghi chú (nếu có): ................................................................................................</w:t>
-      </w:r>
-    </w:p>
     <w:p>
       <w:r>
         <w:br w:type="page"/>
@@ -1760,7 +2018,7 @@
                 <w:tcPr>
                   <w:tcW w:type="dxa" w:w="4592"/>
                   <w:vAlign w:val="center"/>
-                  <w:shd w:fill="F4F6F9"/>
+                  <w:shd w:fill="FFFFFF"/>
                   <w:tcBorders>
                     <w:top w:val="dashed" w:sz="6" w:color="94A3B8"/>
                     <w:left w:val="dashed" w:sz="6" w:color="94A3B8"/>
@@ -1770,28 +2028,43 @@
                 </w:tcPr>
                 <w:p>
                   <w:pPr>
+                    <w:spacing w:before="0" w:after="0" w:line="240" w:lineRule="auto"/>
                     <w:jc w:val="center"/>
                   </w:pPr>
+                  <w:r/>
                   <w:r>
-                    <w:rPr>
-                      <w:b/>
-                      <w:color w:val="64748B"/>
-                    </w:rPr>
-                    <w:t>CHÈN ẢNH 3.3 TẠI ĐÂY</w:t>
-                  </w:r>
-                </w:p>
-                <w:p>
-                  <w:pPr>
-                    <w:jc w:val="center"/>
-                  </w:pPr>
-                  <w:r>
-                    <w:rPr>
-                      <w:color w:val="64748B"/>
-                      <w:sz w:val="20"/>
-                    </w:rPr>
-                    <w:t>Ảnh chụp màn hình thực tế</w:t>
-                    <w:br/>
-                    <w:t>Thay phần chữ này bằng ảnh</w:t>
+                    <w:drawing>
+                      <wp:inline xmlns:a="http://schemas.openxmlformats.org/drawingml/2006/main" xmlns:pic="http://schemas.openxmlformats.org/drawingml/2006/picture">
+                        <wp:extent cx="2195829" cy="4752000"/>
+                        <wp:docPr id="13" name="Picture 13"/>
+                        <wp:cNvGraphicFramePr>
+                          <a:graphicFrameLocks noChangeAspect="1"/>
+                        </wp:cNvGraphicFramePr>
+                        <a:graphic>
+                          <a:graphicData uri="http://schemas.openxmlformats.org/drawingml/2006/picture">
+                            <pic:pic>
+                              <pic:nvPicPr>
+                                <pic:cNvPr id="0" name="3.3-search-empty.png"/>
+                                <pic:cNvPicPr/>
+                              </pic:nvPicPr>
+                              <pic:blipFill>
+                                <a:blip r:embed="rId22"/>
+                                <a:stretch>
+                                  <a:fillRect/>
+                                </a:stretch>
+                              </pic:blipFill>
+                              <pic:spPr>
+                                <a:xfrm>
+                                  <a:off x="0" y="0"/>
+                                  <a:ext cx="2195829" cy="4752000"/>
+                                </a:xfrm>
+                                <a:prstGeom prst="rect"/>
+                              </pic:spPr>
+                            </pic:pic>
+                          </a:graphicData>
+                        </a:graphic>
+                      </wp:inline>
+                    </w:drawing>
                   </w:r>
                 </w:p>
               </w:tc>
@@ -1800,21 +2073,34 @@
           <w:p>
             <w:pPr>
               <w:keepNext/>
+              <w:spacing w:before="100" w:after="100"/>
+              <w:jc w:val="center"/>
             </w:pPr>
+            <w:r>
+              <w:rPr>
+                <w:color w:val="475569"/>
+                <w:sz w:val="18"/>
+              </w:rPr>
+              <w:t>Chụp: 16:53:10 · 25/10/2026 (UTC+7)</w:t>
+            </w:r>
           </w:p>
           <w:p>
             <w:pPr>
               <w:keepNext/>
-              <w:spacing w:before="160"/>
+              <w:spacing w:before="60"/>
             </w:pPr>
             <w:r>
               <w:rPr>
                 <w:b/>
+                <w:sz w:val="20"/>
               </w:rPr>
-              <w:t xml:space="preserve">Cần thấy: </w:t>
+              <w:t xml:space="preserve">Kết quả: </w:t>
             </w:r>
             <w:r>
-              <w:t>TextInput có từ khóa “zzz”; xuất hiện thông báo không có kết quả.</w:t>
+              <w:rPr>
+                <w:sz w:val="20"/>
+              </w:rPr>
+              <w:t>Nhập zzz: xuất hiện thông báo không có kết quả.</w:t>
             </w:r>
           </w:p>
         </w:tc>
@@ -1859,7 +2145,7 @@
                 <w:tcPr>
                   <w:tcW w:type="dxa" w:w="4592"/>
                   <w:vAlign w:val="center"/>
-                  <w:shd w:fill="F4F6F9"/>
+                  <w:shd w:fill="FFFFFF"/>
                   <w:tcBorders>
                     <w:top w:val="dashed" w:sz="6" w:color="94A3B8"/>
                     <w:left w:val="dashed" w:sz="6" w:color="94A3B8"/>
@@ -1869,28 +2155,43 @@
                 </w:tcPr>
                 <w:p>
                   <w:pPr>
+                    <w:spacing w:before="0" w:after="0" w:line="240" w:lineRule="auto"/>
                     <w:jc w:val="center"/>
                   </w:pPr>
+                  <w:r/>
                   <w:r>
-                    <w:rPr>
-                      <w:b/>
-                      <w:color w:val="64748B"/>
-                    </w:rPr>
-                    <w:t>CHÈN ẢNH 3.4 TẠI ĐÂY</w:t>
-                  </w:r>
-                </w:p>
-                <w:p>
-                  <w:pPr>
-                    <w:jc w:val="center"/>
-                  </w:pPr>
-                  <w:r>
-                    <w:rPr>
-                      <w:color w:val="64748B"/>
-                      <w:sz w:val="20"/>
-                    </w:rPr>
-                    <w:t>Ảnh chụp màn hình thực tế</w:t>
-                    <w:br/>
-                    <w:t>Thay phần chữ này bằng ảnh</w:t>
+                    <w:drawing>
+                      <wp:inline xmlns:a="http://schemas.openxmlformats.org/drawingml/2006/main" xmlns:pic="http://schemas.openxmlformats.org/drawingml/2006/picture">
+                        <wp:extent cx="2195829" cy="4752000"/>
+                        <wp:docPr id="14" name="Picture 14"/>
+                        <wp:cNvGraphicFramePr>
+                          <a:graphicFrameLocks noChangeAspect="1"/>
+                        </wp:cNvGraphicFramePr>
+                        <a:graphic>
+                          <a:graphicData uri="http://schemas.openxmlformats.org/drawingml/2006/picture">
+                            <pic:pic>
+                              <pic:nvPicPr>
+                                <pic:cNvPr id="0" name="3.4-profile.png"/>
+                                <pic:cNvPicPr/>
+                              </pic:nvPicPr>
+                              <pic:blipFill>
+                                <a:blip r:embed="rId23"/>
+                                <a:stretch>
+                                  <a:fillRect/>
+                                </a:stretch>
+                              </pic:blipFill>
+                              <pic:spPr>
+                                <a:xfrm>
+                                  <a:off x="0" y="0"/>
+                                  <a:ext cx="2195829" cy="4752000"/>
+                                </a:xfrm>
+                                <a:prstGeom prst="rect"/>
+                              </pic:spPr>
+                            </pic:pic>
+                          </a:graphicData>
+                        </a:graphic>
+                      </wp:inline>
+                    </w:drawing>
                   </w:r>
                 </w:p>
               </w:tc>
@@ -1899,39 +2200,39 @@
           <w:p>
             <w:pPr>
               <w:keepNext/>
+              <w:spacing w:before="100" w:after="100"/>
+              <w:jc w:val="center"/>
             </w:pPr>
+            <w:r>
+              <w:rPr>
+                <w:color w:val="475569"/>
+                <w:sz w:val="18"/>
+              </w:rPr>
+              <w:t>Chụp: 16:53:10 · 25/10/2026 (UTC+7)</w:t>
+            </w:r>
           </w:p>
           <w:p>
             <w:pPr>
               <w:keepNext/>
-              <w:spacing w:before="160"/>
+              <w:spacing w:before="60"/>
             </w:pPr>
             <w:r>
               <w:rPr>
                 <w:b/>
+                <w:sz w:val="20"/>
               </w:rPr>
-              <w:t xml:space="preserve">Cần thấy: </w:t>
+              <w:t xml:space="preserve">Kết quả: </w:t>
             </w:r>
             <w:r>
-              <w:t>Avatar hình tròn, tên Huỳnh Hoài Thanh và email; icon Cá nhân được chọn.</w:t>
+              <w:rPr>
+                <w:sz w:val="20"/>
+              </w:rPr>
+              <w:t>Tab Cá nhân hiển thị avatar HT, tên Huỳnh Hoài Thanh và email.</w:t>
             </w:r>
           </w:p>
         </w:tc>
       </w:tr>
     </w:tbl>
-    <w:p>
-      <w:pPr>
-        <w:keepNext w:val="0"/>
-        <w:spacing w:before="200"/>
-      </w:pPr>
-      <w:r>
-        <w:rPr>
-          <w:color w:val="64748B"/>
-          <w:sz w:val="20"/>
-        </w:rPr>
-        <w:t>Ghi chú (nếu có): ................................................................................................</w:t>
-      </w:r>
-    </w:p>
     <w:p>
       <w:r>
         <w:br w:type="page"/>
@@ -2004,7 +2305,7 @@
                 <w:tcPr>
                   <w:tcW w:type="dxa" w:w="4592"/>
                   <w:vAlign w:val="center"/>
-                  <w:shd w:fill="F4F6F9"/>
+                  <w:shd w:fill="FFFFFF"/>
                   <w:tcBorders>
                     <w:top w:val="dashed" w:sz="6" w:color="94A3B8"/>
                     <w:left w:val="dashed" w:sz="6" w:color="94A3B8"/>
@@ -2014,28 +2315,43 @@
                 </w:tcPr>
                 <w:p>
                   <w:pPr>
+                    <w:spacing w:before="0" w:after="0" w:line="240" w:lineRule="auto"/>
                     <w:jc w:val="center"/>
                   </w:pPr>
+                  <w:r/>
                   <w:r>
-                    <w:rPr>
-                      <w:b/>
-                      <w:color w:val="64748B"/>
-                    </w:rPr>
-                    <w:t>CHÈN ẢNH 4.1 TẠI ĐÂY</w:t>
-                  </w:r>
-                </w:p>
-                <w:p>
-                  <w:pPr>
-                    <w:jc w:val="center"/>
-                  </w:pPr>
-                  <w:r>
-                    <w:rPr>
-                      <w:color w:val="64748B"/>
-                      <w:sz w:val="20"/>
-                    </w:rPr>
-                    <w:t>Ảnh chụp màn hình thực tế</w:t>
-                    <w:br/>
-                    <w:t>Thay phần chữ này bằng ảnh</w:t>
+                    <w:drawing>
+                      <wp:inline xmlns:a="http://schemas.openxmlformats.org/drawingml/2006/main" xmlns:pic="http://schemas.openxmlformats.org/drawingml/2006/picture">
+                        <wp:extent cx="2195829" cy="4752000"/>
+                        <wp:docPr id="15" name="Picture 15"/>
+                        <wp:cNvGraphicFramePr>
+                          <a:graphicFrameLocks noChangeAspect="1"/>
+                        </wp:cNvGraphicFramePr>
+                        <a:graphic>
+                          <a:graphicData uri="http://schemas.openxmlformats.org/drawingml/2006/picture">
+                            <pic:pic>
+                              <pic:nvPicPr>
+                                <pic:cNvPr id="0" name="4.1-products.png"/>
+                                <pic:cNvPicPr/>
+                              </pic:nvPicPr>
+                              <pic:blipFill>
+                                <a:blip r:embed="rId24"/>
+                                <a:stretch>
+                                  <a:fillRect/>
+                                </a:stretch>
+                              </pic:blipFill>
+                              <pic:spPr>
+                                <a:xfrm>
+                                  <a:off x="0" y="0"/>
+                                  <a:ext cx="2195829" cy="4752000"/>
+                                </a:xfrm>
+                                <a:prstGeom prst="rect"/>
+                              </pic:spPr>
+                            </pic:pic>
+                          </a:graphicData>
+                        </a:graphic>
+                      </wp:inline>
+                    </w:drawing>
                   </w:r>
                 </w:p>
               </w:tc>
@@ -2044,21 +2360,34 @@
           <w:p>
             <w:pPr>
               <w:keepNext/>
+              <w:spacing w:before="100" w:after="100"/>
+              <w:jc w:val="center"/>
             </w:pPr>
+            <w:r>
+              <w:rPr>
+                <w:color w:val="475569"/>
+                <w:sz w:val="18"/>
+              </w:rPr>
+              <w:t>Chụp: 16:53:11 · 25/10/2026 (UTC+7)</w:t>
+            </w:r>
           </w:p>
           <w:p>
             <w:pPr>
               <w:keepNext/>
-              <w:spacing w:before="160"/>
+              <w:spacing w:before="60"/>
             </w:pPr>
             <w:r>
               <w:rPr>
                 <w:b/>
+                <w:sz w:val="20"/>
               </w:rPr>
-              <w:t xml:space="preserve">Cần thấy: </w:t>
+              <w:t xml:space="preserve">Kết quả: </w:t>
             </w:r>
             <w:r>
-              <w:t>Danh sách sản phẩm; hai tab Products/Favorites. Bấm Vsmart Live 4 để mở chi tiết.</w:t>
+              <w:rPr>
+                <w:sz w:val="20"/>
+              </w:rPr>
+              <w:t>Home chứa hai tab Products/Favorites; Products hiển thị danh sách sản phẩm.</w:t>
             </w:r>
           </w:p>
         </w:tc>
@@ -2103,7 +2432,7 @@
                 <w:tcPr>
                   <w:tcW w:type="dxa" w:w="4592"/>
                   <w:vAlign w:val="center"/>
-                  <w:shd w:fill="F4F6F9"/>
+                  <w:shd w:fill="FFFFFF"/>
                   <w:tcBorders>
                     <w:top w:val="dashed" w:sz="6" w:color="94A3B8"/>
                     <w:left w:val="dashed" w:sz="6" w:color="94A3B8"/>
@@ -2113,28 +2442,43 @@
                 </w:tcPr>
                 <w:p>
                   <w:pPr>
+                    <w:spacing w:before="0" w:after="0" w:line="240" w:lineRule="auto"/>
                     <w:jc w:val="center"/>
                   </w:pPr>
+                  <w:r/>
                   <w:r>
-                    <w:rPr>
-                      <w:b/>
-                      <w:color w:val="64748B"/>
-                    </w:rPr>
-                    <w:t>CHÈN ẢNH 4.2 TẠI ĐÂY</w:t>
-                  </w:r>
-                </w:p>
-                <w:p>
-                  <w:pPr>
-                    <w:jc w:val="center"/>
-                  </w:pPr>
-                  <w:r>
-                    <w:rPr>
-                      <w:color w:val="64748B"/>
-                      <w:sz w:val="20"/>
-                    </w:rPr>
-                    <w:t>Ảnh chụp màn hình thực tế</w:t>
-                    <w:br/>
-                    <w:t>Thay phần chữ này bằng ảnh</w:t>
+                    <w:drawing>
+                      <wp:inline xmlns:a="http://schemas.openxmlformats.org/drawingml/2006/main" xmlns:pic="http://schemas.openxmlformats.org/drawingml/2006/picture">
+                        <wp:extent cx="2195829" cy="4752000"/>
+                        <wp:docPr id="16" name="Picture 16"/>
+                        <wp:cNvGraphicFramePr>
+                          <a:graphicFrameLocks noChangeAspect="1"/>
+                        </wp:cNvGraphicFramePr>
+                        <a:graphic>
+                          <a:graphicData uri="http://schemas.openxmlformats.org/drawingml/2006/picture">
+                            <pic:pic>
+                              <pic:nvPicPr>
+                                <pic:cNvPr id="0" name="4.2-live4-details-saved.png"/>
+                                <pic:cNvPicPr/>
+                              </pic:nvPicPr>
+                              <pic:blipFill>
+                                <a:blip r:embed="rId25"/>
+                                <a:stretch>
+                                  <a:fillRect/>
+                                </a:stretch>
+                              </pic:blipFill>
+                              <pic:spPr>
+                                <a:xfrm>
+                                  <a:off x="0" y="0"/>
+                                  <a:ext cx="2195829" cy="4752000"/>
+                                </a:xfrm>
+                                <a:prstGeom prst="rect"/>
+                              </pic:spPr>
+                            </pic:pic>
+                          </a:graphicData>
+                        </a:graphic>
+                      </wp:inline>
+                    </w:drawing>
                   </w:r>
                 </w:p>
               </w:tc>
@@ -2143,39 +2487,39 @@
           <w:p>
             <w:pPr>
               <w:keepNext/>
+              <w:spacing w:before="100" w:after="100"/>
+              <w:jc w:val="center"/>
             </w:pPr>
+            <w:r>
+              <w:rPr>
+                <w:color w:val="475569"/>
+                <w:sz w:val="18"/>
+              </w:rPr>
+              <w:t>Chụp: 16:53:12 · 25/10/2026 (UTC+7)</w:t>
+            </w:r>
           </w:p>
           <w:p>
             <w:pPr>
               <w:keepNext/>
-              <w:spacing w:before="160"/>
+              <w:spacing w:before="60"/>
             </w:pPr>
             <w:r>
               <w:rPr>
                 <w:b/>
+                <w:sz w:val="20"/>
               </w:rPr>
-              <w:t xml:space="preserve">Cần thấy: </w:t>
+              <w:t xml:space="preserve">Kết quả: </w:t>
             </w:r>
             <w:r>
-              <w:t>Tên đúng Vsmart Live 4, giá 3.990.000 đ, ảnh/sao/nhà cung cấp; sau khi bấm lưu, nút hiển thị “♥ Đã lưu”.</w:t>
+              <w:rPr>
+                <w:sz w:val="20"/>
+              </w:rPr>
+              <w:t>Mở Live 4 qua id = 2: giá 3.990.000 đ, đúng tên/ảnh/sao/nhà cung cấp. Sau khi lưu, nút hiển thị Đã lưu.</w:t>
             </w:r>
           </w:p>
         </w:tc>
       </w:tr>
     </w:tbl>
-    <w:p>
-      <w:pPr>
-        <w:keepNext w:val="0"/>
-        <w:spacing w:before="200"/>
-      </w:pPr>
-      <w:r>
-        <w:rPr>
-          <w:color w:val="64748B"/>
-          <w:sz w:val="20"/>
-        </w:rPr>
-        <w:t>Ghi chú (nếu có): ................................................................................................</w:t>
-      </w:r>
-    </w:p>
     <w:p>
       <w:r>
         <w:br w:type="page"/>
@@ -2248,7 +2592,7 @@
                 <w:tcPr>
                   <w:tcW w:type="dxa" w:w="4592"/>
                   <w:vAlign w:val="center"/>
-                  <w:shd w:fill="F4F6F9"/>
+                  <w:shd w:fill="FFFFFF"/>
                   <w:tcBorders>
                     <w:top w:val="dashed" w:sz="6" w:color="94A3B8"/>
                     <w:left w:val="dashed" w:sz="6" w:color="94A3B8"/>
@@ -2258,28 +2602,43 @@
                 </w:tcPr>
                 <w:p>
                   <w:pPr>
+                    <w:spacing w:before="0" w:after="0" w:line="240" w:lineRule="auto"/>
                     <w:jc w:val="center"/>
                   </w:pPr>
+                  <w:r/>
                   <w:r>
-                    <w:rPr>
-                      <w:b/>
-                      <w:color w:val="64748B"/>
-                    </w:rPr>
-                    <w:t>CHÈN ẢNH 4.3 TẠI ĐÂY</w:t>
-                  </w:r>
-                </w:p>
-                <w:p>
-                  <w:pPr>
-                    <w:jc w:val="center"/>
-                  </w:pPr>
-                  <w:r>
-                    <w:rPr>
-                      <w:color w:val="64748B"/>
-                      <w:sz w:val="20"/>
-                    </w:rPr>
-                    <w:t>Ảnh chụp màn hình thực tế</w:t>
-                    <w:br/>
-                    <w:t>Thay phần chữ này bằng ảnh</w:t>
+                    <w:drawing>
+                      <wp:inline xmlns:a="http://schemas.openxmlformats.org/drawingml/2006/main" xmlns:pic="http://schemas.openxmlformats.org/drawingml/2006/picture">
+                        <wp:extent cx="2195829" cy="4752000"/>
+                        <wp:docPr id="17" name="Picture 17"/>
+                        <wp:cNvGraphicFramePr>
+                          <a:graphicFrameLocks noChangeAspect="1"/>
+                        </wp:cNvGraphicFramePr>
+                        <a:graphic>
+                          <a:graphicData uri="http://schemas.openxmlformats.org/drawingml/2006/picture">
+                            <pic:pic>
+                              <pic:nvPicPr>
+                                <pic:cNvPr id="0" name="4.3-favorites-saved.png"/>
+                                <pic:cNvPicPr/>
+                              </pic:nvPicPr>
+                              <pic:blipFill>
+                                <a:blip r:embed="rId26"/>
+                                <a:stretch>
+                                  <a:fillRect/>
+                                </a:stretch>
+                              </pic:blipFill>
+                              <pic:spPr>
+                                <a:xfrm>
+                                  <a:off x="0" y="0"/>
+                                  <a:ext cx="2195829" cy="4752000"/>
+                                </a:xfrm>
+                                <a:prstGeom prst="rect"/>
+                              </pic:spPr>
+                            </pic:pic>
+                          </a:graphicData>
+                        </a:graphic>
+                      </wp:inline>
+                    </w:drawing>
                   </w:r>
                 </w:p>
               </w:tc>
@@ -2288,21 +2647,34 @@
           <w:p>
             <w:pPr>
               <w:keepNext/>
+              <w:spacing w:before="100" w:after="100"/>
+              <w:jc w:val="center"/>
             </w:pPr>
+            <w:r>
+              <w:rPr>
+                <w:color w:val="475569"/>
+                <w:sz w:val="18"/>
+              </w:rPr>
+              <w:t>Chụp: 16:53:12 · 25/10/2026 (UTC+7)</w:t>
+            </w:r>
           </w:p>
           <w:p>
             <w:pPr>
               <w:keepNext/>
-              <w:spacing w:before="160"/>
+              <w:spacing w:before="60"/>
             </w:pPr>
             <w:r>
               <w:rPr>
                 <w:b/>
+                <w:sz w:val="20"/>
               </w:rPr>
-              <w:t xml:space="preserve">Cần thấy: </w:t>
+              <w:t xml:space="preserve">Kết quả: </w:t>
             </w:r>
             <w:r>
-              <w:t>Quay lại Home và mở Favorites: Vsmart Live 4 xuất hiện trong danh sách; bấm dòng để mở lại chi tiết.</w:t>
+              <w:rPr>
+                <w:sz w:val="20"/>
+              </w:rPr>
+              <w:t>Sau khi quay lại Home và chọn Favorites: Live 4 đã lưu xuất hiện trong danh sách.</w:t>
             </w:r>
           </w:p>
         </w:tc>
@@ -2347,7 +2719,7 @@
                 <w:tcPr>
                   <w:tcW w:type="dxa" w:w="4592"/>
                   <w:vAlign w:val="center"/>
-                  <w:shd w:fill="F4F6F9"/>
+                  <w:shd w:fill="FFFFFF"/>
                   <w:tcBorders>
                     <w:top w:val="dashed" w:sz="6" w:color="94A3B8"/>
                     <w:left w:val="dashed" w:sz="6" w:color="94A3B8"/>
@@ -2357,28 +2729,43 @@
                 </w:tcPr>
                 <w:p>
                   <w:pPr>
+                    <w:spacing w:before="0" w:after="0" w:line="240" w:lineRule="auto"/>
                     <w:jc w:val="center"/>
                   </w:pPr>
+                  <w:r/>
                   <w:r>
-                    <w:rPr>
-                      <w:b/>
-                      <w:color w:val="64748B"/>
-                    </w:rPr>
-                    <w:t>CHÈN ẢNH 4.4 TẠI ĐÂY</w:t>
-                  </w:r>
-                </w:p>
-                <w:p>
-                  <w:pPr>
-                    <w:jc w:val="center"/>
-                  </w:pPr>
-                  <w:r>
-                    <w:rPr>
-                      <w:color w:val="64748B"/>
-                      <w:sz w:val="20"/>
-                    </w:rPr>
-                    <w:t>Ảnh chụp màn hình thực tế</w:t>
-                    <w:br/>
-                    <w:t>Thay phần chữ này bằng ảnh</w:t>
+                    <w:drawing>
+                      <wp:inline xmlns:a="http://schemas.openxmlformats.org/drawingml/2006/main" xmlns:pic="http://schemas.openxmlformats.org/drawingml/2006/picture">
+                        <wp:extent cx="2195829" cy="4752000"/>
+                        <wp:docPr id="18" name="Picture 18"/>
+                        <wp:cNvGraphicFramePr>
+                          <a:graphicFrameLocks noChangeAspect="1"/>
+                        </wp:cNvGraphicFramePr>
+                        <a:graphic>
+                          <a:graphicData uri="http://schemas.openxmlformats.org/drawingml/2006/picture">
+                            <pic:pic>
+                              <pic:nvPicPr>
+                                <pic:cNvPr id="0" name="4.4-favorites-empty.png"/>
+                                <pic:cNvPicPr/>
+                              </pic:nvPicPr>
+                              <pic:blipFill>
+                                <a:blip r:embed="rId27"/>
+                                <a:stretch>
+                                  <a:fillRect/>
+                                </a:stretch>
+                              </pic:blipFill>
+                              <pic:spPr>
+                                <a:xfrm>
+                                  <a:off x="0" y="0"/>
+                                  <a:ext cx="2195829" cy="4752000"/>
+                                </a:xfrm>
+                                <a:prstGeom prst="rect"/>
+                              </pic:spPr>
+                            </pic:pic>
+                          </a:graphicData>
+                        </a:graphic>
+                      </wp:inline>
+                    </w:drawing>
                   </w:r>
                 </w:p>
               </w:tc>
@@ -2387,39 +2774,39 @@
           <w:p>
             <w:pPr>
               <w:keepNext/>
+              <w:spacing w:before="100" w:after="100"/>
+              <w:jc w:val="center"/>
             </w:pPr>
+            <w:r>
+              <w:rPr>
+                <w:color w:val="475569"/>
+                <w:sz w:val="18"/>
+              </w:rPr>
+              <w:t>Chụp: 16:53:13 · 25/10/2026 (UTC+7)</w:t>
+            </w:r>
           </w:p>
           <w:p>
             <w:pPr>
               <w:keepNext/>
-              <w:spacing w:before="160"/>
+              <w:spacing w:before="60"/>
             </w:pPr>
             <w:r>
               <w:rPr>
                 <w:b/>
+                <w:sz w:val="20"/>
               </w:rPr>
-              <w:t xml:space="preserve">Cần thấy: </w:t>
+              <w:t xml:space="preserve">Kết quả: </w:t>
             </w:r>
             <w:r>
-              <w:t>Từ chi tiết bấm “♥ Đã lưu” để bỏ lưu; quay lại Favorites thấy “Chưa có sản phẩm nào được lưu.” khi không còn mục nào.</w:t>
+              <w:rPr>
+                <w:sz w:val="20"/>
+              </w:rPr>
+              <w:t>Mở lại chi tiết và bỏ lưu: Favorites trở về trạng thái Chưa có sản phẩm nào được lưu.</w:t>
             </w:r>
           </w:p>
         </w:tc>
       </w:tr>
     </w:tbl>
-    <w:p>
-      <w:pPr>
-        <w:keepNext w:val="0"/>
-        <w:spacing w:before="200"/>
-      </w:pPr>
-      <w:r>
-        <w:rPr>
-          <w:color w:val="64748B"/>
-          <w:sz w:val="20"/>
-        </w:rPr>
-        <w:t>Ghi chú (nếu có): ................................................................................................</w:t>
-      </w:r>
-    </w:p>
     <w:p>
       <w:r>
         <w:br w:type="page"/>
@@ -2492,7 +2879,7 @@
                 <w:tcPr>
                   <w:tcW w:type="dxa" w:w="4592"/>
                   <w:vAlign w:val="center"/>
-                  <w:shd w:fill="F4F6F9"/>
+                  <w:shd w:fill="FFFFFF"/>
                   <w:tcBorders>
                     <w:top w:val="dashed" w:sz="6" w:color="94A3B8"/>
                     <w:left w:val="dashed" w:sz="6" w:color="94A3B8"/>
@@ -2502,28 +2889,43 @@
                 </w:tcPr>
                 <w:p>
                   <w:pPr>
+                    <w:spacing w:before="0" w:after="0" w:line="240" w:lineRule="auto"/>
                     <w:jc w:val="center"/>
                   </w:pPr>
+                  <w:r/>
                   <w:r>
-                    <w:rPr>
-                      <w:b/>
-                      <w:color w:val="64748B"/>
-                    </w:rPr>
-                    <w:t>CHÈN ẢNH 5.1 TẠI ĐÂY</w:t>
-                  </w:r>
-                </w:p>
-                <w:p>
-                  <w:pPr>
-                    <w:jc w:val="center"/>
-                  </w:pPr>
-                  <w:r>
-                    <w:rPr>
-                      <w:color w:val="64748B"/>
-                      <w:sz w:val="20"/>
-                    </w:rPr>
-                    <w:t>Ảnh chụp màn hình thực tế</w:t>
-                    <w:br/>
-                    <w:t>Thay phần chữ này bằng ảnh</w:t>
+                    <w:drawing>
+                      <wp:inline xmlns:a="http://schemas.openxmlformats.org/drawingml/2006/main" xmlns:pic="http://schemas.openxmlformats.org/drawingml/2006/picture">
+                        <wp:extent cx="2195829" cy="4752000"/>
+                        <wp:docPr id="19" name="Picture 19"/>
+                        <wp:cNvGraphicFramePr>
+                          <a:graphicFrameLocks noChangeAspect="1"/>
+                        </wp:cNvGraphicFramePr>
+                        <a:graphic>
+                          <a:graphicData uri="http://schemas.openxmlformats.org/drawingml/2006/picture">
+                            <pic:pic>
+                              <pic:nvPicPr>
+                                <pic:cNvPr id="0" name="5.1-drawer.png"/>
+                                <pic:cNvPicPr/>
+                              </pic:nvPicPr>
+                              <pic:blipFill>
+                                <a:blip r:embed="rId28"/>
+                                <a:stretch>
+                                  <a:fillRect/>
+                                </a:stretch>
+                              </pic:blipFill>
+                              <pic:spPr>
+                                <a:xfrm>
+                                  <a:off x="0" y="0"/>
+                                  <a:ext cx="2195829" cy="4752000"/>
+                                </a:xfrm>
+                                <a:prstGeom prst="rect"/>
+                              </pic:spPr>
+                            </pic:pic>
+                          </a:graphicData>
+                        </a:graphic>
+                      </wp:inline>
+                    </w:drawing>
                   </w:r>
                 </w:p>
               </w:tc>
@@ -2532,21 +2934,34 @@
           <w:p>
             <w:pPr>
               <w:keepNext/>
+              <w:spacing w:before="100" w:after="100"/>
+              <w:jc w:val="center"/>
             </w:pPr>
+            <w:r>
+              <w:rPr>
+                <w:color w:val="475569"/>
+                <w:sz w:val="18"/>
+              </w:rPr>
+              <w:t>Chụp: 16:53:14 · 25/10/2026 (UTC+7)</w:t>
+            </w:r>
           </w:p>
           <w:p>
             <w:pPr>
               <w:keepNext/>
-              <w:spacing w:before="160"/>
+              <w:spacing w:before="60"/>
             </w:pPr>
             <w:r>
               <w:rPr>
                 <w:b/>
+                <w:sz w:val="20"/>
               </w:rPr>
-              <w:t xml:space="preserve">Cần thấy: </w:t>
+              <w:t xml:space="preserve">Kết quả: </w:t>
             </w:r>
             <w:r>
-              <w:t>Mở bằng nút ☰ hoặc kéo từ mép trái trên điện thoại; menu gồm Trang chủ, Cá nhân, Cài đặt. Nền phía sau là Trang chủ “Xin chào”.</w:t>
+              <w:rPr>
+                <w:sz w:val="20"/>
+              </w:rPr>
+              <w:t>Menu Drawer mở bằng nút trên header, có Trang chủ, Cá nhân và Cài đặt; mục hiện tại tô đỏ.</w:t>
             </w:r>
           </w:p>
         </w:tc>
@@ -2591,7 +3006,7 @@
                 <w:tcPr>
                   <w:tcW w:type="dxa" w:w="4592"/>
                   <w:vAlign w:val="center"/>
-                  <w:shd w:fill="F4F6F9"/>
+                  <w:shd w:fill="FFFFFF"/>
                   <w:tcBorders>
                     <w:top w:val="dashed" w:sz="6" w:color="94A3B8"/>
                     <w:left w:val="dashed" w:sz="6" w:color="94A3B8"/>
@@ -2601,28 +3016,43 @@
                 </w:tcPr>
                 <w:p>
                   <w:pPr>
+                    <w:spacing w:before="0" w:after="0" w:line="240" w:lineRule="auto"/>
                     <w:jc w:val="center"/>
                   </w:pPr>
+                  <w:r/>
                   <w:r>
-                    <w:rPr>
-                      <w:b/>
-                      <w:color w:val="64748B"/>
-                    </w:rPr>
-                    <w:t>CHÈN ẢNH 5.2 TẠI ĐÂY</w:t>
-                  </w:r>
-                </w:p>
-                <w:p>
-                  <w:pPr>
-                    <w:jc w:val="center"/>
-                  </w:pPr>
-                  <w:r>
-                    <w:rPr>
-                      <w:color w:val="64748B"/>
-                      <w:sz w:val="20"/>
-                    </w:rPr>
-                    <w:t>Ảnh chụp màn hình thực tế</w:t>
-                    <w:br/>
-                    <w:t>Thay phần chữ này bằng ảnh</w:t>
+                    <w:drawing>
+                      <wp:inline xmlns:a="http://schemas.openxmlformats.org/drawingml/2006/main" xmlns:pic="http://schemas.openxmlformats.org/drawingml/2006/picture">
+                        <wp:extent cx="2195829" cy="4752000"/>
+                        <wp:docPr id="20" name="Picture 20"/>
+                        <wp:cNvGraphicFramePr>
+                          <a:graphicFrameLocks noChangeAspect="1"/>
+                        </wp:cNvGraphicFramePr>
+                        <a:graphic>
+                          <a:graphicData uri="http://schemas.openxmlformats.org/drawingml/2006/picture">
+                            <pic:pic>
+                              <pic:nvPicPr>
+                                <pic:cNvPr id="0" name="5.2-profile.png"/>
+                                <pic:cNvPicPr/>
+                              </pic:nvPicPr>
+                              <pic:blipFill>
+                                <a:blip r:embed="rId29"/>
+                                <a:stretch>
+                                  <a:fillRect/>
+                                </a:stretch>
+                              </pic:blipFill>
+                              <pic:spPr>
+                                <a:xfrm>
+                                  <a:off x="0" y="0"/>
+                                  <a:ext cx="2195829" cy="4752000"/>
+                                </a:xfrm>
+                                <a:prstGeom prst="rect"/>
+                              </pic:spPr>
+                            </pic:pic>
+                          </a:graphicData>
+                        </a:graphic>
+                      </wp:inline>
+                    </w:drawing>
                   </w:r>
                 </w:p>
               </w:tc>
@@ -2631,39 +3061,39 @@
           <w:p>
             <w:pPr>
               <w:keepNext/>
+              <w:spacing w:before="100" w:after="100"/>
+              <w:jc w:val="center"/>
             </w:pPr>
+            <w:r>
+              <w:rPr>
+                <w:color w:val="475569"/>
+                <w:sz w:val="18"/>
+              </w:rPr>
+              <w:t>Chụp: 16:53:15 · 25/10/2026 (UTC+7)</w:t>
+            </w:r>
           </w:p>
           <w:p>
             <w:pPr>
               <w:keepNext/>
-              <w:spacing w:before="160"/>
+              <w:spacing w:before="60"/>
             </w:pPr>
             <w:r>
               <w:rPr>
                 <w:b/>
+                <w:sz w:val="20"/>
               </w:rPr>
-              <w:t xml:space="preserve">Cần thấy: </w:t>
+              <w:t xml:space="preserve">Kết quả: </w:t>
             </w:r>
             <w:r>
-              <w:t>Chọn Cá nhân trong Drawer: hiển thị avatar, tên và email người dùng.</w:t>
+              <w:rPr>
+                <w:sz w:val="20"/>
+              </w:rPr>
+              <w:t>Chọn Cá nhân trong Drawer: hiển thị avatar, họ tên và email.</w:t>
             </w:r>
           </w:p>
         </w:tc>
       </w:tr>
     </w:tbl>
-    <w:p>
-      <w:pPr>
-        <w:keepNext w:val="0"/>
-        <w:spacing w:before="200"/>
-      </w:pPr>
-      <w:r>
-        <w:rPr>
-          <w:color w:val="64748B"/>
-          <w:sz w:val="20"/>
-        </w:rPr>
-        <w:t>Ghi chú (nếu có): ................................................................................................</w:t>
-      </w:r>
-    </w:p>
     <w:p>
       <w:r>
         <w:br w:type="page"/>
@@ -2736,7 +3166,7 @@
                 <w:tcPr>
                   <w:tcW w:type="dxa" w:w="4592"/>
                   <w:vAlign w:val="center"/>
-                  <w:shd w:fill="F4F6F9"/>
+                  <w:shd w:fill="FFFFFF"/>
                   <w:tcBorders>
                     <w:top w:val="dashed" w:sz="6" w:color="94A3B8"/>
                     <w:left w:val="dashed" w:sz="6" w:color="94A3B8"/>
@@ -2746,28 +3176,43 @@
                 </w:tcPr>
                 <w:p>
                   <w:pPr>
+                    <w:spacing w:before="0" w:after="0" w:line="240" w:lineRule="auto"/>
                     <w:jc w:val="center"/>
                   </w:pPr>
+                  <w:r/>
                   <w:r>
-                    <w:rPr>
-                      <w:b/>
-                      <w:color w:val="64748B"/>
-                    </w:rPr>
-                    <w:t>CHÈN ẢNH 5.3 TẠI ĐÂY</w:t>
-                  </w:r>
-                </w:p>
-                <w:p>
-                  <w:pPr>
-                    <w:jc w:val="center"/>
-                  </w:pPr>
-                  <w:r>
-                    <w:rPr>
-                      <w:color w:val="64748B"/>
-                      <w:sz w:val="20"/>
-                    </w:rPr>
-                    <w:t>Ảnh chụp màn hình thực tế</w:t>
-                    <w:br/>
-                    <w:t>Thay phần chữ này bằng ảnh</w:t>
+                    <w:drawing>
+                      <wp:inline xmlns:a="http://schemas.openxmlformats.org/drawingml/2006/main" xmlns:pic="http://schemas.openxmlformats.org/drawingml/2006/picture">
+                        <wp:extent cx="2195829" cy="4752000"/>
+                        <wp:docPr id="21" name="Picture 21"/>
+                        <wp:cNvGraphicFramePr>
+                          <a:graphicFrameLocks noChangeAspect="1"/>
+                        </wp:cNvGraphicFramePr>
+                        <a:graphic>
+                          <a:graphicData uri="http://schemas.openxmlformats.org/drawingml/2006/picture">
+                            <pic:pic>
+                              <pic:nvPicPr>
+                                <pic:cNvPr id="0" name="5.3-settings-default.png"/>
+                                <pic:cNvPicPr/>
+                              </pic:nvPicPr>
+                              <pic:blipFill>
+                                <a:blip r:embed="rId30"/>
+                                <a:stretch>
+                                  <a:fillRect/>
+                                </a:stretch>
+                              </pic:blipFill>
+                              <pic:spPr>
+                                <a:xfrm>
+                                  <a:off x="0" y="0"/>
+                                  <a:ext cx="2195829" cy="4752000"/>
+                                </a:xfrm>
+                                <a:prstGeom prst="rect"/>
+                              </pic:spPr>
+                            </pic:pic>
+                          </a:graphicData>
+                        </a:graphic>
+                      </wp:inline>
+                    </w:drawing>
                   </w:r>
                 </w:p>
               </w:tc>
@@ -2776,21 +3221,34 @@
           <w:p>
             <w:pPr>
               <w:keepNext/>
+              <w:spacing w:before="100" w:after="100"/>
+              <w:jc w:val="center"/>
             </w:pPr>
+            <w:r>
+              <w:rPr>
+                <w:color w:val="475569"/>
+                <w:sz w:val="18"/>
+              </w:rPr>
+              <w:t>Chụp: 16:53:16 · 25/10/2026 (UTC+7)</w:t>
+            </w:r>
           </w:p>
           <w:p>
             <w:pPr>
               <w:keepNext/>
-              <w:spacing w:before="160"/>
+              <w:spacing w:before="60"/>
             </w:pPr>
             <w:r>
               <w:rPr>
                 <w:b/>
+                <w:sz w:val="20"/>
               </w:rPr>
-              <w:t xml:space="preserve">Cần thấy: </w:t>
+              <w:t xml:space="preserve">Kết quả: </w:t>
             </w:r>
             <w:r>
-              <w:t>Nhận thông báo bật, Giao diện tối tắt; dòng trạng thái “Thông báo: BẬT · Giao diện: sáng”.</w:t>
+              <w:rPr>
+                <w:sz w:val="20"/>
+              </w:rPr>
+              <w:t>Hai Switch ở trạng thái mặc định: thông báo BẬT, giao diện sáng.</w:t>
             </w:r>
           </w:p>
         </w:tc>
@@ -2835,7 +3293,7 @@
                 <w:tcPr>
                   <w:tcW w:type="dxa" w:w="4592"/>
                   <w:vAlign w:val="center"/>
-                  <w:shd w:fill="F4F6F9"/>
+                  <w:shd w:fill="FFFFFF"/>
                   <w:tcBorders>
                     <w:top w:val="dashed" w:sz="6" w:color="94A3B8"/>
                     <w:left w:val="dashed" w:sz="6" w:color="94A3B8"/>
@@ -2845,28 +3303,43 @@
                 </w:tcPr>
                 <w:p>
                   <w:pPr>
+                    <w:spacing w:before="0" w:after="0" w:line="240" w:lineRule="auto"/>
                     <w:jc w:val="center"/>
                   </w:pPr>
+                  <w:r/>
                   <w:r>
-                    <w:rPr>
-                      <w:b/>
-                      <w:color w:val="64748B"/>
-                    </w:rPr>
-                    <w:t>CHÈN ẢNH 5.4 TẠI ĐÂY</w:t>
-                  </w:r>
-                </w:p>
-                <w:p>
-                  <w:pPr>
-                    <w:jc w:val="center"/>
-                  </w:pPr>
-                  <w:r>
-                    <w:rPr>
-                      <w:color w:val="64748B"/>
-                      <w:sz w:val="20"/>
-                    </w:rPr>
-                    <w:t>Ảnh chụp màn hình thực tế</w:t>
-                    <w:br/>
-                    <w:t>Thay phần chữ này bằng ảnh</w:t>
+                    <w:drawing>
+                      <wp:inline xmlns:a="http://schemas.openxmlformats.org/drawingml/2006/main" xmlns:pic="http://schemas.openxmlformats.org/drawingml/2006/picture">
+                        <wp:extent cx="2195829" cy="4752000"/>
+                        <wp:docPr id="22" name="Picture 22"/>
+                        <wp:cNvGraphicFramePr>
+                          <a:graphicFrameLocks noChangeAspect="1"/>
+                        </wp:cNvGraphicFramePr>
+                        <a:graphic>
+                          <a:graphicData uri="http://schemas.openxmlformats.org/drawingml/2006/picture">
+                            <pic:pic>
+                              <pic:nvPicPr>
+                                <pic:cNvPr id="0" name="5.4-settings-toggled.png"/>
+                                <pic:cNvPicPr/>
+                              </pic:nvPicPr>
+                              <pic:blipFill>
+                                <a:blip r:embed="rId31"/>
+                                <a:stretch>
+                                  <a:fillRect/>
+                                </a:stretch>
+                              </pic:blipFill>
+                              <pic:spPr>
+                                <a:xfrm>
+                                  <a:off x="0" y="0"/>
+                                  <a:ext cx="2195829" cy="4752000"/>
+                                </a:xfrm>
+                                <a:prstGeom prst="rect"/>
+                              </pic:spPr>
+                            </pic:pic>
+                          </a:graphicData>
+                        </a:graphic>
+                      </wp:inline>
+                    </w:drawing>
                   </w:r>
                 </w:p>
               </w:tc>
@@ -2875,39 +3348,193 @@
           <w:p>
             <w:pPr>
               <w:keepNext/>
+              <w:spacing w:before="100" w:after="100"/>
+              <w:jc w:val="center"/>
             </w:pPr>
+            <w:r>
+              <w:rPr>
+                <w:color w:val="475569"/>
+                <w:sz w:val="18"/>
+              </w:rPr>
+              <w:t>Chụp: 16:53:17 · 25/10/2026 (UTC+7)</w:t>
+            </w:r>
           </w:p>
           <w:p>
             <w:pPr>
               <w:keepNext/>
-              <w:spacing w:before="160"/>
+              <w:spacing w:before="60"/>
             </w:pPr>
             <w:r>
               <w:rPr>
                 <w:b/>
+                <w:sz w:val="20"/>
               </w:rPr>
-              <w:t xml:space="preserve">Cần thấy: </w:t>
+              <w:t xml:space="preserve">Kết quả: </w:t>
             </w:r>
             <w:r>
-              <w:t>Tắt Nhận thông báo và bật Giao diện tối; dòng trạng thái “Thông báo: TẮT · Giao diện: tối”.</w:t>
+              <w:rPr>
+                <w:sz w:val="20"/>
+              </w:rPr>
+              <w:t>Gạt hai Switch: thông báo TẮT, giao diện tối; dòng trạng thái cập nhật ngay. Không kiểm tra phần nâng cao đổi nền toàn app.</w:t>
             </w:r>
           </w:p>
         </w:tc>
       </w:tr>
     </w:tbl>
     <w:p>
+      <w:r>
+        <w:br w:type="page"/>
+      </w:r>
+    </w:p>
+    <w:p>
       <w:pPr>
-        <w:keepNext w:val="0"/>
-        <w:spacing w:before="200"/>
+        <w:pStyle w:val="Heading1"/>
       </w:pPr>
       <w:r>
-        <w:rPr>
-          <w:color w:val="64748B"/>
-          <w:sz w:val="20"/>
-        </w:rPr>
-        <w:t>Ghi chú (nếu có): ................................................................................................</w:t>
+        <w:t>BÀI 5. DRAWER NAVIGATION</w:t>
       </w:r>
     </w:p>
+    <w:p>
+      <w:r>
+        <w:t>Minh chứng bổ sung — Màn Trang chủ</w:t>
+      </w:r>
+    </w:p>
+    <w:tbl>
+      <w:tblPr>
+        <w:tblW w:type="auto" w:w="0"/>
+        <w:jc w:val="center"/>
+        <w:tblLayout w:type="fixed"/>
+        <w:tblLook w:firstColumn="1" w:firstRow="1" w:lastColumn="0" w:lastRow="0" w:noHBand="0" w:noVBand="1" w:val="04A0"/>
+      </w:tblPr>
+      <w:tblGrid>
+        <w:gridCol w:w="9524"/>
+      </w:tblGrid>
+      <w:tr>
+        <w:tc>
+          <w:tcPr>
+            <w:tcW w:type="dxa" w:w="9638"/>
+            <w:vAlign w:val="top"/>
+          </w:tcPr>
+          <w:p>
+            <w:pPr>
+              <w:keepNext/>
+              <w:spacing w:after="120"/>
+              <w:jc w:val="center"/>
+            </w:pPr>
+            <w:r>
+              <w:rPr>
+                <w:b/>
+                <w:sz w:val="24"/>
+              </w:rPr>
+              <w:t>Ảnh 5.5. Trang chủ trong Drawer</w:t>
+            </w:r>
+          </w:p>
+          <w:tbl>
+            <w:tblPr>
+              <w:tblW w:type="auto" w:w="0"/>
+              <w:jc w:val="center"/>
+              <w:tblLayout w:type="fixed"/>
+              <w:tblLook w:firstColumn="1" w:firstRow="1" w:lastColumn="0" w:lastRow="0" w:noHBand="0" w:noVBand="1" w:val="04A0"/>
+            </w:tblPr>
+            <w:tblGrid>
+              <w:gridCol w:w="4365"/>
+            </w:tblGrid>
+            <w:tr>
+              <w:trPr>
+                <w:trHeight w:val="7937" w:hRule="exact"/>
+              </w:trPr>
+              <w:tc>
+                <w:tcPr>
+                  <w:tcW w:type="dxa" w:w="9638"/>
+                  <w:vAlign w:val="center"/>
+                  <w:shd w:fill="FFFFFF"/>
+                  <w:tcBorders>
+                    <w:top w:val="dashed" w:sz="6" w:color="94A3B8"/>
+                    <w:left w:val="dashed" w:sz="6" w:color="94A3B8"/>
+                    <w:bottom w:val="dashed" w:sz="6" w:color="94A3B8"/>
+                    <w:right w:val="dashed" w:sz="6" w:color="94A3B8"/>
+                  </w:tcBorders>
+                </w:tcPr>
+                <w:p>
+                  <w:pPr>
+                    <w:spacing w:before="0" w:after="0" w:line="240" w:lineRule="auto"/>
+                    <w:jc w:val="center"/>
+                  </w:pPr>
+                  <w:r/>
+                  <w:r>
+                    <w:drawing>
+                      <wp:inline xmlns:a="http://schemas.openxmlformats.org/drawingml/2006/main" xmlns:pic="http://schemas.openxmlformats.org/drawingml/2006/picture">
+                        <wp:extent cx="2195829" cy="4752000"/>
+                        <wp:docPr id="23" name="Picture 23"/>
+                        <wp:cNvGraphicFramePr>
+                          <a:graphicFrameLocks noChangeAspect="1"/>
+                        </wp:cNvGraphicFramePr>
+                        <a:graphic>
+                          <a:graphicData uri="http://schemas.openxmlformats.org/drawingml/2006/picture">
+                            <pic:pic>
+                              <pic:nvPicPr>
+                                <pic:cNvPr id="0" name="5.5-home.png"/>
+                                <pic:cNvPicPr/>
+                              </pic:nvPicPr>
+                              <pic:blipFill>
+                                <a:blip r:embed="rId32"/>
+                                <a:stretch>
+                                  <a:fillRect/>
+                                </a:stretch>
+                              </pic:blipFill>
+                              <pic:spPr>
+                                <a:xfrm>
+                                  <a:off x="0" y="0"/>
+                                  <a:ext cx="2195829" cy="4752000"/>
+                                </a:xfrm>
+                                <a:prstGeom prst="rect"/>
+                              </pic:spPr>
+                            </pic:pic>
+                          </a:graphicData>
+                        </a:graphic>
+                      </wp:inline>
+                    </w:drawing>
+                  </w:r>
+                </w:p>
+              </w:tc>
+            </w:tr>
+          </w:tbl>
+          <w:p>
+            <w:pPr>
+              <w:keepNext/>
+              <w:spacing w:before="100" w:after="100"/>
+              <w:jc w:val="center"/>
+            </w:pPr>
+            <w:r>
+              <w:rPr>
+                <w:color w:val="475569"/>
+                <w:sz w:val="18"/>
+              </w:rPr>
+              <w:t>Chụp: 16:54:37 · 25/10/2026 (UTC+7)</w:t>
+            </w:r>
+          </w:p>
+          <w:p>
+            <w:pPr>
+              <w:keepNext/>
+              <w:spacing w:before="60"/>
+            </w:pPr>
+            <w:r>
+              <w:rPr>
+                <w:b/>
+                <w:sz w:val="20"/>
+              </w:rPr>
+              <w:t xml:space="preserve">Kết quả: </w:t>
+            </w:r>
+            <w:r>
+              <w:rPr>
+                <w:sz w:val="20"/>
+              </w:rPr>
+              <w:t>Trang chủ hiển thị Xin chào; header có nút mở Drawer. Đây là màn Home của Bài 5.</w:t>
+            </w:r>
+          </w:p>
+        </w:tc>
+      </w:tr>
+    </w:tbl>
     <w:sectPr>
       <w:headerReference w:type="default" r:id="rId9"/>
       <w:footerReference w:type="default" r:id="rId10"/>

</xml_diff>

<commit_message>
Bien soan bao cao Lab06 theo 11 anh minh chung cua sinh vien
</commit_message>
<xml_diff>
--- a/Lab06/23633801_HuynhHoaiThanh_Lab6.docx
+++ b/Lab06/23633801_HuynhHoaiThanh_Lab6.docx
@@ -9,7 +9,7 @@
       <w:r>
         <w:rPr>
           <w:b/>
-          <w:sz w:val="44"/>
+          <w:sz w:val="46"/>
         </w:rPr>
         <w:t>BÁO CÁO THỰC HÀNH</w:t>
       </w:r>
@@ -38,11 +38,7 @@
         <w:t>Select Phone · API · Bottom Tab · Stack + Tab · Drawer</w:t>
       </w:r>
     </w:p>
-    <w:p>
-      <w:r>
-        <w:br/>
-      </w:r>
-    </w:p>
+    <w:p/>
     <w:tbl>
       <w:tblPr>
         <w:tblW w:type="auto" w:w="0"/>
@@ -113,7 +109,7 @@
               <w:rPr>
                 <w:b/>
               </w:rPr>
-              <w:t>Tên bài thực hành</w:t>
+              <w:t>Nội dung thực hành</w:t>
             </w:r>
           </w:p>
         </w:tc>
@@ -123,7 +119,7 @@
           </w:tcPr>
           <w:p>
             <w:r>
-              <w:t>Lab 6 — Navigation</w:t>
+              <w:t>Điều hướng trong ứng dụng React Native</w:t>
             </w:r>
           </w:p>
         </w:tc>
@@ -138,7 +134,7 @@
               <w:rPr>
                 <w:b/>
               </w:rPr>
-              <w:t>Công nghệ</w:t>
+              <w:t>Công nghệ sử dụng</w:t>
             </w:r>
           </w:p>
         </w:tc>
@@ -148,7 +144,32 @@
           </w:tcPr>
           <w:p>
             <w:r>
-              <w:t>Expo · React Native · TypeScript</w:t>
+              <w:t>Expo, React Native, TypeScript, React Navigation</w:t>
+            </w:r>
+          </w:p>
+        </w:tc>
+      </w:tr>
+      <w:tr>
+        <w:tc>
+          <w:tcPr>
+            <w:tcW w:type="dxa" w:w="2381"/>
+          </w:tcPr>
+          <w:p>
+            <w:r>
+              <w:rPr>
+                <w:b/>
+              </w:rPr>
+              <w:t>Môi trường minh chứng</w:t>
+            </w:r>
+          </w:p>
+        </w:tc>
+        <w:tc>
+          <w:tcPr>
+            <w:tcW w:type="dxa" w:w="7257"/>
+          </w:tcPr>
+          <w:p>
+            <w:r>
+              <w:t>Chrome trên Windows — bản web tại localhost:8081</w:t>
             </w:r>
           </w:p>
         </w:tc>
@@ -159,7 +180,7 @@
         <w:rPr>
           <w:b/>
         </w:rPr>
-        <w:t>Địa chỉ GitHub:</w:t>
+        <w:t>Mã nguồn GitHub:</w:t>
       </w:r>
     </w:p>
     <w:p>
@@ -178,32 +199,12 @@
         <w:pStyle w:val="Heading2"/>
       </w:pPr>
       <w:r>
-        <w:t>Nội dung minh chứng</w:t>
+        <w:t>1. Mục tiêu thực hành</w:t>
       </w:r>
     </w:p>
     <w:p>
       <w:r>
-        <w:t>Bài 1: Select Phone — đủ 4 trạng thái theo thiết kế.</w:t>
-      </w:r>
-    </w:p>
-    <w:p>
-      <w:r>
-        <w:t>Bài 2: Gắn API — dữ liệu, loading, lỗi và thử lại.</w:t>
-      </w:r>
-    </w:p>
-    <w:p>
-      <w:r>
-        <w:t>Bài 3: Bottom Tab — Trang chủ, Tìm kiếm và Cá nhân.</w:t>
-      </w:r>
-    </w:p>
-    <w:p>
-      <w:r>
-        <w:t>Bài 4: Stack + Tab — truyền id và quản lý yêu thích.</w:t>
-      </w:r>
-    </w:p>
-    <w:p>
-      <w:r>
-        <w:t>Bài 5: Drawer — menu và hai Switch cài đặt.</w:t>
+        <w:t>Xây dựng giao diện chọn điện thoại bằng Expo; tích hợp dữ liệu API và xử lý lỗi; sử dụng điều hướng Bottom Tab, Stack kết hợp Tab và Drawer theo yêu cầu Lab 6.</w:t>
       </w:r>
     </w:p>
     <w:p>
@@ -211,17 +212,309 @@
         <w:pStyle w:val="Heading2"/>
       </w:pPr>
       <w:r>
-        <w:t>Thông tin ảnh minh chứng</w:t>
+        <w:t>2. Bố cục báo cáo</w:t>
+      </w:r>
+    </w:p>
+    <w:tbl>
+      <w:tblPr>
+        <w:tblStyle w:val="TableGrid"/>
+        <w:tblW w:type="auto" w:w="0"/>
+        <w:tblLook w:firstColumn="1" w:firstRow="1" w:lastColumn="0" w:lastRow="0" w:noHBand="0" w:noVBand="1" w:val="04A0"/>
+      </w:tblPr>
+      <w:tblGrid>
+        <w:gridCol w:w="4819"/>
+        <w:gridCol w:w="4819"/>
+      </w:tblGrid>
+      <w:tr>
+        <w:tc>
+          <w:tcPr>
+            <w:tcW w:type="dxa" w:w="4819"/>
+            <w:shd w:fill="EAF0F7"/>
+          </w:tcPr>
+          <w:p>
+            <w:r>
+              <w:rPr>
+                <w:b/>
+              </w:rPr>
+              <w:t>Nội dung</w:t>
+            </w:r>
+          </w:p>
+        </w:tc>
+        <w:tc>
+          <w:tcPr>
+            <w:tcW w:type="dxa" w:w="4819"/>
+            <w:shd w:fill="EAF0F7"/>
+          </w:tcPr>
+          <w:p>
+            <w:r>
+              <w:rPr>
+                <w:b/>
+              </w:rPr>
+              <w:t>Ảnh minh chứng</w:t>
+            </w:r>
+          </w:p>
+        </w:tc>
+      </w:tr>
+      <w:tr>
+        <w:tc>
+          <w:tcPr>
+            <w:tcW w:type="dxa" w:w="4819"/>
+          </w:tcPr>
+          <w:p>
+            <w:r>
+              <w:t>Tổng quan: menu lựa chọn bài thực hành</w:t>
+            </w:r>
+          </w:p>
+        </w:tc>
+        <w:tc>
+          <w:tcPr>
+            <w:tcW w:type="dxa" w:w="4819"/>
+          </w:tcPr>
+          <w:p>
+            <w:r>
+              <w:t>Hình 1</w:t>
+            </w:r>
+          </w:p>
+        </w:tc>
+      </w:tr>
+      <w:tr>
+        <w:tc>
+          <w:tcPr>
+            <w:tcW w:type="dxa" w:w="4819"/>
+          </w:tcPr>
+          <w:p>
+            <w:r>
+              <w:t>Bài 1: Ứng dụng Select Phone</w:t>
+            </w:r>
+          </w:p>
+        </w:tc>
+        <w:tc>
+          <w:tcPr>
+            <w:tcW w:type="dxa" w:w="4819"/>
+          </w:tcPr>
+          <w:p>
+            <w:r>
+              <w:t>Hình 2–3</w:t>
+            </w:r>
+          </w:p>
+        </w:tc>
+      </w:tr>
+      <w:tr>
+        <w:tc>
+          <w:tcPr>
+            <w:tcW w:type="dxa" w:w="4819"/>
+          </w:tcPr>
+          <w:p>
+            <w:r>
+              <w:t>Bài 2: Gắn API và xử lý lỗi</w:t>
+            </w:r>
+          </w:p>
+        </w:tc>
+        <w:tc>
+          <w:tcPr>
+            <w:tcW w:type="dxa" w:w="4819"/>
+          </w:tcPr>
+          <w:p>
+            <w:r>
+              <w:t>Hình 4–5</w:t>
+            </w:r>
+          </w:p>
+        </w:tc>
+      </w:tr>
+      <w:tr>
+        <w:tc>
+          <w:tcPr>
+            <w:tcW w:type="dxa" w:w="4819"/>
+          </w:tcPr>
+          <w:p>
+            <w:r>
+              <w:t>Bài 3: Bottom Tab Navigation</w:t>
+            </w:r>
+          </w:p>
+        </w:tc>
+        <w:tc>
+          <w:tcPr>
+            <w:tcW w:type="dxa" w:w="4819"/>
+          </w:tcPr>
+          <w:p>
+            <w:r>
+              <w:t>Hình 6–7</w:t>
+            </w:r>
+          </w:p>
+        </w:tc>
+      </w:tr>
+      <w:tr>
+        <w:tc>
+          <w:tcPr>
+            <w:tcW w:type="dxa" w:w="4819"/>
+          </w:tcPr>
+          <w:p>
+            <w:r>
+              <w:t>Bài 4: Stack + Tab và yêu thích</w:t>
+            </w:r>
+          </w:p>
+        </w:tc>
+        <w:tc>
+          <w:tcPr>
+            <w:tcW w:type="dxa" w:w="4819"/>
+          </w:tcPr>
+          <w:p>
+            <w:r>
+              <w:t>Hình 8–9</w:t>
+            </w:r>
+          </w:p>
+        </w:tc>
+      </w:tr>
+      <w:tr>
+        <w:tc>
+          <w:tcPr>
+            <w:tcW w:type="dxa" w:w="4819"/>
+          </w:tcPr>
+          <w:p>
+            <w:r>
+              <w:t>Bài 5: Drawer Navigation</w:t>
+            </w:r>
+          </w:p>
+        </w:tc>
+        <w:tc>
+          <w:tcPr>
+            <w:tcW w:type="dxa" w:w="4819"/>
+          </w:tcPr>
+          <w:p>
+            <w:r>
+              <w:t>Hình 10–11</w:t>
+            </w:r>
+          </w:p>
+        </w:tc>
+      </w:tr>
+    </w:tbl>
+    <w:p>
+      <w:pPr>
+        <w:pStyle w:val="Heading2"/>
+      </w:pPr>
+      <w:r>
+        <w:t>3. Thông tin minh chứng</w:t>
       </w:r>
     </w:p>
     <w:p>
       <w:r>
-        <w:t>Ảnh được chụp từ ứng dụng chạy trên Chromium trong môi trường cloud, khung hiển thị 390 × 844 px. Ngày giờ chụp thực tế được ghi dưới từng ảnh, theo giờ Việt Nam (UTC+7). Đây là bản web, chưa phải ảnh chạy trên thiết bị Android/iOS.</w:t>
+        <w:t>Báo cáo sử dụng 11 ảnh trong file do sinh viên cung cấp. Ảnh được giữ nguyên nội dung, bao gồm đồng hồ và ngày tháng trên thanh tác vụ Windows. Phần mô tả bên dưới chỉ ghi nhận các trạng thái xuất hiện trong ảnh; các thao tác chưa có ảnh không được xem là đã minh chứng.</w:t>
       </w:r>
     </w:p>
     <w:p>
+      <w:pPr>
+        <w:sectPr>
+          <w:headerReference w:type="default" r:id="rId9"/>
+          <w:footerReference w:type="default" r:id="rId10"/>
+          <w:pgSz w:w="11906" w:h="16838"/>
+          <w:pgMar w:top="1020" w:right="1134" w:bottom="1020" w:left="1134" w:header="397" w:footer="397" w:gutter="0"/>
+          <w:cols w:space="720"/>
+          <w:docGrid w:linePitch="360"/>
+        </w:sectPr>
+      </w:pPr>
+    </w:p>
+    <w:p>
+      <w:pPr>
+        <w:pStyle w:val="Heading1"/>
+      </w:pPr>
       <w:r>
-        <w:t>Bài 2 lấy dữ liệu thật từ MockAPI do sinh viên cung cấp. Yêu cầu HTTPS được chuyển tiếp qua curl có xác minh chứng chỉ của proxy cloud; không sửa dữ liệu API. Ảnh lỗi mạng được tạo bằng ngắt yêu cầu có kiểm soát, sau đó khôi phục và bấm THỬ LẠI.</w:t>
+        <w:t>TỔNG QUAN ỨNG DỤNG</w:t>
+      </w:r>
+    </w:p>
+    <w:p>
+      <w:pPr>
+        <w:spacing w:after="80"/>
+      </w:pPr>
+      <w:r>
+        <w:rPr>
+          <w:b/>
+          <w:sz w:val="24"/>
+        </w:rPr>
+        <w:t>Menu lựa chọn bài thực hành</w:t>
+      </w:r>
+    </w:p>
+    <w:p>
+      <w:pPr>
+        <w:spacing w:after="100"/>
+      </w:pPr>
+      <w:r>
+        <w:rPr>
+          <w:sz w:val="20"/>
+        </w:rPr>
+        <w:t>Ứng dụng Lab 06 tập hợp năm nội dung thực hành trong cùng một giao diện chọn bài.</w:t>
+      </w:r>
+    </w:p>
+    <w:p>
+      <w:pPr>
+        <w:keepNext/>
+        <w:spacing w:after="80" w:line="240" w:lineRule="auto"/>
+        <w:jc w:val="center"/>
+      </w:pPr>
+      <w:r>
+        <w:drawing>
+          <wp:inline xmlns:a="http://schemas.openxmlformats.org/drawingml/2006/main" xmlns:pic="http://schemas.openxmlformats.org/drawingml/2006/picture">
+            <wp:extent cx="8460000" cy="4758750"/>
+            <wp:docPr id="1" name="Picture 1"/>
+            <wp:cNvGraphicFramePr>
+              <a:graphicFrameLocks noChangeAspect="1"/>
+            </wp:cNvGraphicFramePr>
+            <a:graphic>
+              <a:graphicData uri="http://schemas.openxmlformats.org/drawingml/2006/picture">
+                <pic:pic>
+                  <pic:nvPicPr>
+                    <pic:cNvPr id="0" name="image1.png"/>
+                    <pic:cNvPicPr/>
+                  </pic:nvPicPr>
+                  <pic:blipFill>
+                    <a:blip r:embed="rId12"/>
+                    <a:stretch>
+                      <a:fillRect/>
+                    </a:stretch>
+                  </pic:blipFill>
+                  <pic:spPr>
+                    <a:xfrm>
+                      <a:off x="0" y="0"/>
+                      <a:ext cx="8460000" cy="4758750"/>
+                    </a:xfrm>
+                    <a:prstGeom prst="rect"/>
+                  </pic:spPr>
+                </pic:pic>
+              </a:graphicData>
+            </a:graphic>
+          </wp:inline>
+        </w:drawing>
+      </w:r>
+    </w:p>
+    <w:p>
+      <w:pPr>
+        <w:keepNext/>
+        <w:spacing w:after="100"/>
+        <w:jc w:val="center"/>
+      </w:pPr>
+      <w:r>
+        <w:rPr>
+          <w:i/>
+          <w:sz w:val="20"/>
+        </w:rPr>
+        <w:t>Hình 1. Menu chính của ứng dụng Lab 06.</w:t>
+      </w:r>
+    </w:p>
+    <w:p>
+      <w:pPr>
+        <w:spacing w:after="0"/>
+      </w:pPr>
+      <w:r>
+        <w:rPr>
+          <w:b/>
+          <w:sz w:val="20"/>
+        </w:rPr>
+        <w:t xml:space="preserve">Nhận xét: </w:t>
+      </w:r>
+      <w:r>
+        <w:rPr>
+          <w:sz w:val="20"/>
+        </w:rPr>
+        <w:t>Màn hình hiển thị họ tên, mã số sinh viên và năm mục Bài 1 đến Bài 5. Người dùng chọn từng mục để mở nội dung tương ứng.</w:t>
       </w:r>
     </w:p>
     <w:p>
@@ -234,283 +527,105 @@
         <w:pStyle w:val="Heading1"/>
       </w:pPr>
       <w:r>
-        <w:t>BÀI 1. SELECT PHONE</w:t>
+        <w:t>BÀI 1. ỨNG DỤNG SELECT PHONE</w:t>
       </w:r>
     </w:p>
     <w:p>
       <w:pPr>
-        <w:spacing w:after="280"/>
+        <w:spacing w:after="80"/>
       </w:pPr>
       <w:r>
-        <w:t>Minh chứng 1/2 — Giao diện ban đầu và mở chọn màu</w:t>
+        <w:rPr>
+          <w:b/>
+          <w:sz w:val="24"/>
+        </w:rPr>
+        <w:t>1.1. Màn hình thông tin sản phẩm</w:t>
       </w:r>
     </w:p>
-    <w:tbl>
-      <w:tblPr>
-        <w:tblW w:type="auto" w:w="0"/>
+    <w:p>
+      <w:pPr>
+        <w:spacing w:after="100"/>
+      </w:pPr>
+      <w:r>
+        <w:rPr>
+          <w:sz w:val="20"/>
+        </w:rPr>
+        <w:t>Yêu cầu: xây dựng giao diện sản phẩm và màn chọn màu bằng Expo, đồng thời truyền màu được chọn về màn sản phẩm.</w:t>
+      </w:r>
+    </w:p>
+    <w:p>
+      <w:pPr>
+        <w:keepNext/>
+        <w:spacing w:after="80" w:line="240" w:lineRule="auto"/>
         <w:jc w:val="center"/>
-        <w:tblLayout w:type="fixed"/>
-        <w:tblLook w:firstColumn="1" w:firstRow="1" w:lastColumn="0" w:lastRow="0" w:noHBand="0" w:noVBand="1" w:val="04A0"/>
-      </w:tblPr>
-      <w:tblGrid>
-        <w:gridCol w:w="4592"/>
-        <w:gridCol w:w="340"/>
-        <w:gridCol w:w="4592"/>
-      </w:tblGrid>
-      <w:tr>
-        <w:trPr>
-          <w:cantSplit/>
-        </w:trPr>
-        <w:tc>
-          <w:tcPr>
-            <w:tcW w:type="dxa" w:w="4592"/>
-            <w:vAlign w:val="top"/>
-          </w:tcPr>
-          <w:p>
-            <w:pPr>
-              <w:keepNext/>
-              <w:spacing w:after="120"/>
-            </w:pPr>
-            <w:r>
-              <w:rPr>
-                <w:b/>
-                <w:sz w:val="24"/>
-              </w:rPr>
-              <w:t>Ảnh 1.1. Product — chưa chọn màu</w:t>
-            </w:r>
-          </w:p>
-          <w:tbl>
-            <w:tblPr>
-              <w:tblW w:type="auto" w:w="0"/>
-              <w:tblLayout w:type="fixed"/>
-              <w:tblLook w:firstColumn="1" w:firstRow="1" w:lastColumn="0" w:lastRow="0" w:noHBand="0" w:noVBand="1" w:val="04A0"/>
-            </w:tblPr>
-            <w:tblGrid>
-              <w:gridCol w:w="4365"/>
-            </w:tblGrid>
-            <w:tr>
-              <w:trPr>
-                <w:trHeight w:val="7937" w:hRule="exact"/>
-              </w:trPr>
-              <w:tc>
-                <w:tcPr>
-                  <w:tcW w:type="dxa" w:w="4592"/>
-                  <w:vAlign w:val="center"/>
-                  <w:shd w:fill="FFFFFF"/>
-                  <w:tcBorders>
-                    <w:top w:val="dashed" w:sz="6" w:color="94A3B8"/>
-                    <w:left w:val="dashed" w:sz="6" w:color="94A3B8"/>
-                    <w:bottom w:val="dashed" w:sz="6" w:color="94A3B8"/>
-                    <w:right w:val="dashed" w:sz="6" w:color="94A3B8"/>
-                  </w:tcBorders>
-                </w:tcPr>
-                <w:p>
-                  <w:pPr>
-                    <w:spacing w:before="0" w:after="0" w:line="240" w:lineRule="auto"/>
-                    <w:jc w:val="center"/>
-                  </w:pPr>
-                  <w:r/>
-                  <w:r>
-                    <w:drawing>
-                      <wp:inline xmlns:a="http://schemas.openxmlformats.org/drawingml/2006/main" xmlns:pic="http://schemas.openxmlformats.org/drawingml/2006/picture">
-                        <wp:extent cx="2195829" cy="4752000"/>
-                        <wp:docPr id="1" name="Picture 1"/>
-                        <wp:cNvGraphicFramePr>
-                          <a:graphicFrameLocks noChangeAspect="1"/>
-                        </wp:cNvGraphicFramePr>
-                        <a:graphic>
-                          <a:graphicData uri="http://schemas.openxmlformats.org/drawingml/2006/picture">
-                            <pic:pic>
-                              <pic:nvPicPr>
-                                <pic:cNvPr id="0" name="1.1-product-blue.png"/>
-                                <pic:cNvPicPr/>
-                              </pic:nvPicPr>
-                              <pic:blipFill>
-                                <a:blip r:embed="rId12"/>
-                                <a:stretch>
-                                  <a:fillRect/>
-                                </a:stretch>
-                              </pic:blipFill>
-                              <pic:spPr>
-                                <a:xfrm>
-                                  <a:off x="0" y="0"/>
-                                  <a:ext cx="2195829" cy="4752000"/>
-                                </a:xfrm>
-                                <a:prstGeom prst="rect"/>
-                              </pic:spPr>
-                            </pic:pic>
-                          </a:graphicData>
-                        </a:graphic>
-                      </wp:inline>
-                    </w:drawing>
-                  </w:r>
-                </w:p>
-              </w:tc>
-            </w:tr>
-          </w:tbl>
-          <w:p>
-            <w:pPr>
-              <w:keepNext/>
-              <w:spacing w:before="100" w:after="100"/>
-              <w:jc w:val="center"/>
-            </w:pPr>
-            <w:r>
-              <w:rPr>
-                <w:color w:val="475569"/>
-                <w:sz w:val="18"/>
-              </w:rPr>
-              <w:t>Chụp: 16:52:54 · 25/10/2026 (UTC+7)</w:t>
-            </w:r>
-          </w:p>
-          <w:p>
-            <w:pPr>
-              <w:keepNext/>
-              <w:spacing w:before="60"/>
-            </w:pPr>
-            <w:r>
-              <w:rPr>
-                <w:b/>
-                <w:sz w:val="20"/>
-              </w:rPr>
-              <w:t xml:space="preserve">Kết quả: </w:t>
-            </w:r>
-            <w:r>
-              <w:rPr>
-                <w:sz w:val="20"/>
-              </w:rPr>
-              <w:t>Ảnh điện thoại xanh, tên/sao/giá, nút chọn màu và nút CHỌN MUA ở đáy.</w:t>
-            </w:r>
-          </w:p>
-        </w:tc>
-        <w:tc>
-          <w:tcPr>
-            <w:tcW w:type="dxa" w:w="340"/>
-          </w:tcPr>
-          <w:p/>
-        </w:tc>
-        <w:tc>
-          <w:tcPr>
-            <w:tcW w:type="dxa" w:w="4592"/>
-            <w:vAlign w:val="top"/>
-          </w:tcPr>
-          <w:p>
-            <w:pPr>
-              <w:keepNext/>
-              <w:spacing w:after="120"/>
-            </w:pPr>
-            <w:r>
-              <w:rPr>
-                <w:b/>
-                <w:sz w:val="24"/>
-              </w:rPr>
-              <w:t>Ảnh 1.2. ChooseColor — chưa chọn</w:t>
-            </w:r>
-          </w:p>
-          <w:tbl>
-            <w:tblPr>
-              <w:tblW w:type="auto" w:w="0"/>
-              <w:tblLayout w:type="fixed"/>
-              <w:tblLook w:firstColumn="1" w:firstRow="1" w:lastColumn="0" w:lastRow="0" w:noHBand="0" w:noVBand="1" w:val="04A0"/>
-            </w:tblPr>
-            <w:tblGrid>
-              <w:gridCol w:w="4365"/>
-            </w:tblGrid>
-            <w:tr>
-              <w:trPr>
-                <w:trHeight w:val="7937" w:hRule="exact"/>
-              </w:trPr>
-              <w:tc>
-                <w:tcPr>
-                  <w:tcW w:type="dxa" w:w="4592"/>
-                  <w:vAlign w:val="center"/>
-                  <w:shd w:fill="FFFFFF"/>
-                  <w:tcBorders>
-                    <w:top w:val="dashed" w:sz="6" w:color="94A3B8"/>
-                    <w:left w:val="dashed" w:sz="6" w:color="94A3B8"/>
-                    <w:bottom w:val="dashed" w:sz="6" w:color="94A3B8"/>
-                    <w:right w:val="dashed" w:sz="6" w:color="94A3B8"/>
-                  </w:tcBorders>
-                </w:tcPr>
-                <w:p>
-                  <w:pPr>
-                    <w:spacing w:before="0" w:after="0" w:line="240" w:lineRule="auto"/>
-                    <w:jc w:val="center"/>
-                  </w:pPr>
-                  <w:r/>
-                  <w:r>
-                    <w:drawing>
-                      <wp:inline xmlns:a="http://schemas.openxmlformats.org/drawingml/2006/main" xmlns:pic="http://schemas.openxmlformats.org/drawingml/2006/picture">
-                        <wp:extent cx="2195829" cy="4752000"/>
-                        <wp:docPr id="2" name="Picture 2"/>
-                        <wp:cNvGraphicFramePr>
-                          <a:graphicFrameLocks noChangeAspect="1"/>
-                        </wp:cNvGraphicFramePr>
-                        <a:graphic>
-                          <a:graphicData uri="http://schemas.openxmlformats.org/drawingml/2006/picture">
-                            <pic:pic>
-                              <pic:nvPicPr>
-                                <pic:cNvPr id="0" name="1.2-choose-unpicked.png"/>
-                                <pic:cNvPicPr/>
-                              </pic:nvPicPr>
-                              <pic:blipFill>
-                                <a:blip r:embed="rId13"/>
-                                <a:stretch>
-                                  <a:fillRect/>
-                                </a:stretch>
-                              </pic:blipFill>
-                              <pic:spPr>
-                                <a:xfrm>
-                                  <a:off x="0" y="0"/>
-                                  <a:ext cx="2195829" cy="4752000"/>
-                                </a:xfrm>
-                                <a:prstGeom prst="rect"/>
-                              </pic:spPr>
-                            </pic:pic>
-                          </a:graphicData>
-                        </a:graphic>
-                      </wp:inline>
-                    </w:drawing>
-                  </w:r>
-                </w:p>
-              </w:tc>
-            </w:tr>
-          </w:tbl>
-          <w:p>
-            <w:pPr>
-              <w:keepNext/>
-              <w:spacing w:before="100" w:after="100"/>
-              <w:jc w:val="center"/>
-            </w:pPr>
-            <w:r>
-              <w:rPr>
-                <w:color w:val="475569"/>
-                <w:sz w:val="18"/>
-              </w:rPr>
-              <w:t>Chụp: 16:52:54 · 25/10/2026 (UTC+7)</w:t>
-            </w:r>
-          </w:p>
-          <w:p>
-            <w:pPr>
-              <w:keepNext/>
-              <w:spacing w:before="60"/>
-            </w:pPr>
-            <w:r>
-              <w:rPr>
-                <w:b/>
-                <w:sz w:val="20"/>
-              </w:rPr>
-              <w:t xml:space="preserve">Kết quả: </w:t>
-            </w:r>
-            <w:r>
-              <w:rPr>
-                <w:sz w:val="20"/>
-              </w:rPr>
-              <w:t>Chưa chọn màu: chỉ có tên và ảnh nhỏ xanh; hiển thị bốn ô màu.</w:t>
-            </w:r>
-          </w:p>
-        </w:tc>
-      </w:tr>
-    </w:tbl>
+      </w:pPr>
+      <w:r>
+        <w:drawing>
+          <wp:inline xmlns:a="http://schemas.openxmlformats.org/drawingml/2006/main" xmlns:pic="http://schemas.openxmlformats.org/drawingml/2006/picture">
+            <wp:extent cx="8460000" cy="4758750"/>
+            <wp:docPr id="2" name="Picture 2"/>
+            <wp:cNvGraphicFramePr>
+              <a:graphicFrameLocks noChangeAspect="1"/>
+            </wp:cNvGraphicFramePr>
+            <a:graphic>
+              <a:graphicData uri="http://schemas.openxmlformats.org/drawingml/2006/picture">
+                <pic:pic>
+                  <pic:nvPicPr>
+                    <pic:cNvPr id="0" name="image2.png"/>
+                    <pic:cNvPicPr/>
+                  </pic:nvPicPr>
+                  <pic:blipFill>
+                    <a:blip r:embed="rId13"/>
+                    <a:stretch>
+                      <a:fillRect/>
+                    </a:stretch>
+                  </pic:blipFill>
+                  <pic:spPr>
+                    <a:xfrm>
+                      <a:off x="0" y="0"/>
+                      <a:ext cx="8460000" cy="4758750"/>
+                    </a:xfrm>
+                    <a:prstGeom prst="rect"/>
+                  </pic:spPr>
+                </pic:pic>
+              </a:graphicData>
+            </a:graphic>
+          </wp:inline>
+        </w:drawing>
+      </w:r>
+    </w:p>
+    <w:p>
+      <w:pPr>
+        <w:keepNext/>
+        <w:spacing w:after="100"/>
+        <w:jc w:val="center"/>
+      </w:pPr>
+      <w:r>
+        <w:rPr>
+          <w:i/>
+          <w:sz w:val="20"/>
+        </w:rPr>
+        <w:t>Hình 2. Thông tin điện thoại Vsmart Joy 3 ở trạng thái ban đầu.</w:t>
+      </w:r>
+    </w:p>
+    <w:p>
+      <w:pPr>
+        <w:spacing w:after="0"/>
+      </w:pPr>
+      <w:r>
+        <w:rPr>
+          <w:b/>
+          <w:sz w:val="20"/>
+        </w:rPr>
+        <w:t xml:space="preserve">Nhận xét: </w:t>
+      </w:r>
+      <w:r>
+        <w:rPr>
+          <w:sz w:val="20"/>
+        </w:rPr>
+        <w:t>Ảnh cho thấy điện thoại màu xanh, tên sản phẩm, đánh giá, giá 1.790.000 đ và nút “4 MÀU-CHỌN MÀU”. Nút “CHỌN MUA” được bố trí ở cuối màn hình.</w:t>
+      </w:r>
+    </w:p>
     <w:p>
       <w:r>
         <w:br w:type="page"/>
@@ -521,283 +636,105 @@
         <w:pStyle w:val="Heading1"/>
       </w:pPr>
       <w:r>
-        <w:t>BÀI 1. SELECT PHONE</w:t>
+        <w:t>BÀI 1. ỨNG DỤNG SELECT PHONE</w:t>
       </w:r>
     </w:p>
     <w:p>
       <w:pPr>
-        <w:spacing w:after="280"/>
+        <w:spacing w:after="80"/>
       </w:pPr>
       <w:r>
-        <w:t>Minh chứng 2/2 — Chọn đỏ và trả kết quả về Product</w:t>
+        <w:rPr>
+          <w:b/>
+          <w:sz w:val="24"/>
+        </w:rPr>
+        <w:t>1.2. Màn hình lựa chọn màu sắc</w:t>
       </w:r>
     </w:p>
-    <w:tbl>
-      <w:tblPr>
-        <w:tblW w:type="auto" w:w="0"/>
+    <w:p>
+      <w:pPr>
+        <w:spacing w:after="100"/>
+      </w:pPr>
+      <w:r>
+        <w:rPr>
+          <w:sz w:val="20"/>
+        </w:rPr>
+        <w:t>Nội dung minh chứng: lựa chọn một trong bốn màu và cập nhật thông tin tương ứng trên màn ChooseColor.</w:t>
+      </w:r>
+    </w:p>
+    <w:p>
+      <w:pPr>
+        <w:keepNext/>
+        <w:spacing w:after="80" w:line="240" w:lineRule="auto"/>
         <w:jc w:val="center"/>
-        <w:tblLayout w:type="fixed"/>
-        <w:tblLook w:firstColumn="1" w:firstRow="1" w:lastColumn="0" w:lastRow="0" w:noHBand="0" w:noVBand="1" w:val="04A0"/>
-      </w:tblPr>
-      <w:tblGrid>
-        <w:gridCol w:w="4592"/>
-        <w:gridCol w:w="340"/>
-        <w:gridCol w:w="4592"/>
-      </w:tblGrid>
-      <w:tr>
-        <w:trPr>
-          <w:cantSplit/>
-        </w:trPr>
-        <w:tc>
-          <w:tcPr>
-            <w:tcW w:type="dxa" w:w="4592"/>
-            <w:vAlign w:val="top"/>
-          </w:tcPr>
-          <w:p>
-            <w:pPr>
-              <w:keepNext/>
-              <w:spacing w:after="120"/>
-            </w:pPr>
-            <w:r>
-              <w:rPr>
-                <w:b/>
-                <w:sz w:val="24"/>
-              </w:rPr>
-              <w:t>Ảnh 1.3. ChooseColor — đã chọn đỏ</w:t>
-            </w:r>
-          </w:p>
-          <w:tbl>
-            <w:tblPr>
-              <w:tblW w:type="auto" w:w="0"/>
-              <w:tblLayout w:type="fixed"/>
-              <w:tblLook w:firstColumn="1" w:firstRow="1" w:lastColumn="0" w:lastRow="0" w:noHBand="0" w:noVBand="1" w:val="04A0"/>
-            </w:tblPr>
-            <w:tblGrid>
-              <w:gridCol w:w="4365"/>
-            </w:tblGrid>
-            <w:tr>
-              <w:trPr>
-                <w:trHeight w:val="7937" w:hRule="exact"/>
-              </w:trPr>
-              <w:tc>
-                <w:tcPr>
-                  <w:tcW w:type="dxa" w:w="4592"/>
-                  <w:vAlign w:val="center"/>
-                  <w:shd w:fill="FFFFFF"/>
-                  <w:tcBorders>
-                    <w:top w:val="dashed" w:sz="6" w:color="94A3B8"/>
-                    <w:left w:val="dashed" w:sz="6" w:color="94A3B8"/>
-                    <w:bottom w:val="dashed" w:sz="6" w:color="94A3B8"/>
-                    <w:right w:val="dashed" w:sz="6" w:color="94A3B8"/>
-                  </w:tcBorders>
-                </w:tcPr>
-                <w:p>
-                  <w:pPr>
-                    <w:spacing w:before="0" w:after="0" w:line="240" w:lineRule="auto"/>
-                    <w:jc w:val="center"/>
-                  </w:pPr>
-                  <w:r/>
-                  <w:r>
-                    <w:drawing>
-                      <wp:inline xmlns:a="http://schemas.openxmlformats.org/drawingml/2006/main" xmlns:pic="http://schemas.openxmlformats.org/drawingml/2006/picture">
-                        <wp:extent cx="2195829" cy="4752000"/>
-                        <wp:docPr id="3" name="Picture 3"/>
-                        <wp:cNvGraphicFramePr>
-                          <a:graphicFrameLocks noChangeAspect="1"/>
-                        </wp:cNvGraphicFramePr>
-                        <a:graphic>
-                          <a:graphicData uri="http://schemas.openxmlformats.org/drawingml/2006/picture">
-                            <pic:pic>
-                              <pic:nvPicPr>
-                                <pic:cNvPr id="0" name="1.3-choose-red.png"/>
-                                <pic:cNvPicPr/>
-                              </pic:nvPicPr>
-                              <pic:blipFill>
-                                <a:blip r:embed="rId14"/>
-                                <a:stretch>
-                                  <a:fillRect/>
-                                </a:stretch>
-                              </pic:blipFill>
-                              <pic:spPr>
-                                <a:xfrm>
-                                  <a:off x="0" y="0"/>
-                                  <a:ext cx="2195829" cy="4752000"/>
-                                </a:xfrm>
-                                <a:prstGeom prst="rect"/>
-                              </pic:spPr>
-                            </pic:pic>
-                          </a:graphicData>
-                        </a:graphic>
-                      </wp:inline>
-                    </w:drawing>
-                  </w:r>
-                </w:p>
-              </w:tc>
-            </w:tr>
-          </w:tbl>
-          <w:p>
-            <w:pPr>
-              <w:keepNext/>
-              <w:spacing w:before="100" w:after="100"/>
-              <w:jc w:val="center"/>
-            </w:pPr>
-            <w:r>
-              <w:rPr>
-                <w:color w:val="475569"/>
-                <w:sz w:val="18"/>
-              </w:rPr>
-              <w:t>Chụp: 16:52:55 · 25/10/2026 (UTC+7)</w:t>
-            </w:r>
-          </w:p>
-          <w:p>
-            <w:pPr>
-              <w:keepNext/>
-              <w:spacing w:before="60"/>
-            </w:pPr>
-            <w:r>
-              <w:rPr>
-                <w:b/>
-                <w:sz w:val="20"/>
-              </w:rPr>
-              <w:t xml:space="preserve">Kết quả: </w:t>
-            </w:r>
-            <w:r>
-              <w:rPr>
-                <w:sz w:val="20"/>
-              </w:rPr>
-              <w:t>Ô đỏ có viền chọn; ảnh nhỏ chuyển đỏ; hiện màu, nhà cung cấp và giá.</w:t>
-            </w:r>
-          </w:p>
-        </w:tc>
-        <w:tc>
-          <w:tcPr>
-            <w:tcW w:type="dxa" w:w="340"/>
-          </w:tcPr>
-          <w:p/>
-        </w:tc>
-        <w:tc>
-          <w:tcPr>
-            <w:tcW w:type="dxa" w:w="4592"/>
-            <w:vAlign w:val="top"/>
-          </w:tcPr>
-          <w:p>
-            <w:pPr>
-              <w:keepNext/>
-              <w:spacing w:after="120"/>
-            </w:pPr>
-            <w:r>
-              <w:rPr>
-                <w:b/>
-                <w:sz w:val="24"/>
-              </w:rPr>
-              <w:t>Ảnh 1.4. Product — sau khi bấm XONG</w:t>
-            </w:r>
-          </w:p>
-          <w:tbl>
-            <w:tblPr>
-              <w:tblW w:type="auto" w:w="0"/>
-              <w:tblLayout w:type="fixed"/>
-              <w:tblLook w:firstColumn="1" w:firstRow="1" w:lastColumn="0" w:lastRow="0" w:noHBand="0" w:noVBand="1" w:val="04A0"/>
-            </w:tblPr>
-            <w:tblGrid>
-              <w:gridCol w:w="4365"/>
-            </w:tblGrid>
-            <w:tr>
-              <w:trPr>
-                <w:trHeight w:val="7937" w:hRule="exact"/>
-              </w:trPr>
-              <w:tc>
-                <w:tcPr>
-                  <w:tcW w:type="dxa" w:w="4592"/>
-                  <w:vAlign w:val="center"/>
-                  <w:shd w:fill="FFFFFF"/>
-                  <w:tcBorders>
-                    <w:top w:val="dashed" w:sz="6" w:color="94A3B8"/>
-                    <w:left w:val="dashed" w:sz="6" w:color="94A3B8"/>
-                    <w:bottom w:val="dashed" w:sz="6" w:color="94A3B8"/>
-                    <w:right w:val="dashed" w:sz="6" w:color="94A3B8"/>
-                  </w:tcBorders>
-                </w:tcPr>
-                <w:p>
-                  <w:pPr>
-                    <w:spacing w:before="0" w:after="0" w:line="240" w:lineRule="auto"/>
-                    <w:jc w:val="center"/>
-                  </w:pPr>
-                  <w:r/>
-                  <w:r>
-                    <w:drawing>
-                      <wp:inline xmlns:a="http://schemas.openxmlformats.org/drawingml/2006/main" xmlns:pic="http://schemas.openxmlformats.org/drawingml/2006/picture">
-                        <wp:extent cx="2195829" cy="4752000"/>
-                        <wp:docPr id="4" name="Picture 4"/>
-                        <wp:cNvGraphicFramePr>
-                          <a:graphicFrameLocks noChangeAspect="1"/>
-                        </wp:cNvGraphicFramePr>
-                        <a:graphic>
-                          <a:graphicData uri="http://schemas.openxmlformats.org/drawingml/2006/picture">
-                            <pic:pic>
-                              <pic:nvPicPr>
-                                <pic:cNvPr id="0" name="1.4-product-red.png"/>
-                                <pic:cNvPicPr/>
-                              </pic:nvPicPr>
-                              <pic:blipFill>
-                                <a:blip r:embed="rId15"/>
-                                <a:stretch>
-                                  <a:fillRect/>
-                                </a:stretch>
-                              </pic:blipFill>
-                              <pic:spPr>
-                                <a:xfrm>
-                                  <a:off x="0" y="0"/>
-                                  <a:ext cx="2195829" cy="4752000"/>
-                                </a:xfrm>
-                                <a:prstGeom prst="rect"/>
-                              </pic:spPr>
-                            </pic:pic>
-                          </a:graphicData>
-                        </a:graphic>
-                      </wp:inline>
-                    </w:drawing>
-                  </w:r>
-                </w:p>
-              </w:tc>
-            </w:tr>
-          </w:tbl>
-          <w:p>
-            <w:pPr>
-              <w:keepNext/>
-              <w:spacing w:before="100" w:after="100"/>
-              <w:jc w:val="center"/>
-            </w:pPr>
-            <w:r>
-              <w:rPr>
-                <w:color w:val="475569"/>
-                <w:sz w:val="18"/>
-              </w:rPr>
-              <w:t>Chụp: 16:52:56 · 25/10/2026 (UTC+7)</w:t>
-            </w:r>
-          </w:p>
-          <w:p>
-            <w:pPr>
-              <w:keepNext/>
-              <w:spacing w:before="60"/>
-            </w:pPr>
-            <w:r>
-              <w:rPr>
-                <w:b/>
-                <w:sz w:val="20"/>
-              </w:rPr>
-              <w:t xml:space="preserve">Kết quả: </w:t>
-            </w:r>
-            <w:r>
-              <w:rPr>
-                <w:sz w:val="20"/>
-              </w:rPr>
-              <w:t>Sau khi bấm XONG: ảnh lớn đỏ và nút 4 MÀU-CHỌN LOẠI.</w:t>
-            </w:r>
-          </w:p>
-        </w:tc>
-      </w:tr>
-    </w:tbl>
+      </w:pPr>
+      <w:r>
+        <w:drawing>
+          <wp:inline xmlns:a="http://schemas.openxmlformats.org/drawingml/2006/main" xmlns:pic="http://schemas.openxmlformats.org/drawingml/2006/picture">
+            <wp:extent cx="8460000" cy="4758750"/>
+            <wp:docPr id="3" name="Picture 3"/>
+            <wp:cNvGraphicFramePr>
+              <a:graphicFrameLocks noChangeAspect="1"/>
+            </wp:cNvGraphicFramePr>
+            <a:graphic>
+              <a:graphicData uri="http://schemas.openxmlformats.org/drawingml/2006/picture">
+                <pic:pic>
+                  <pic:nvPicPr>
+                    <pic:cNvPr id="0" name="image3.png"/>
+                    <pic:cNvPicPr/>
+                  </pic:nvPicPr>
+                  <pic:blipFill>
+                    <a:blip r:embed="rId14"/>
+                    <a:stretch>
+                      <a:fillRect/>
+                    </a:stretch>
+                  </pic:blipFill>
+                  <pic:spPr>
+                    <a:xfrm>
+                      <a:off x="0" y="0"/>
+                      <a:ext cx="8460000" cy="4758750"/>
+                    </a:xfrm>
+                    <a:prstGeom prst="rect"/>
+                  </pic:spPr>
+                </pic:pic>
+              </a:graphicData>
+            </a:graphic>
+          </wp:inline>
+        </w:drawing>
+      </w:r>
+    </w:p>
+    <w:p>
+      <w:pPr>
+        <w:keepNext/>
+        <w:spacing w:after="100"/>
+        <w:jc w:val="center"/>
+      </w:pPr>
+      <w:r>
+        <w:rPr>
+          <w:i/>
+          <w:sz w:val="20"/>
+        </w:rPr>
+        <w:t>Hình 3. Màn ChooseColor sau khi chọn màu bạc.</w:t>
+      </w:r>
+    </w:p>
+    <w:p>
+      <w:pPr>
+        <w:spacing w:after="0"/>
+      </w:pPr>
+      <w:r>
+        <w:rPr>
+          <w:b/>
+          <w:sz w:val="20"/>
+        </w:rPr>
+        <w:t xml:space="preserve">Nhận xét: </w:t>
+      </w:r>
+      <w:r>
+        <w:rPr>
+          <w:sz w:val="20"/>
+        </w:rPr>
+        <w:t>Bốn ô màu bạc, đỏ, đen và xanh được xếp dọc. Ô bạc có viền đánh dấu; ảnh điện thoại và dòng “Màu: bạc” được cập nhật, kèm nhà cung cấp Tiki Tradding, giá bán và nút “XONG”.</w:t>
+      </w:r>
+    </w:p>
     <w:p>
       <w:r>
         <w:br w:type="page"/>
@@ -813,278 +750,100 @@
     </w:p>
     <w:p>
       <w:pPr>
-        <w:spacing w:after="280"/>
+        <w:spacing w:after="80"/>
       </w:pPr>
       <w:r>
-        <w:t>Minh chứng 1/3 — Nguồn dữ liệu và trạng thái tải</w:t>
+        <w:rPr>
+          <w:b/>
+          <w:sz w:val="24"/>
+        </w:rPr>
+        <w:t>2.1. Hiển thị thông tin sản phẩm</w:t>
       </w:r>
     </w:p>
-    <w:tbl>
-      <w:tblPr>
-        <w:tblW w:type="auto" w:w="0"/>
+    <w:p>
+      <w:pPr>
+        <w:spacing w:after="100"/>
+      </w:pPr>
+      <w:r>
+        <w:rPr>
+          <w:sz w:val="20"/>
+        </w:rPr>
+        <w:t>Yêu cầu: tích hợp API vào giao diện Bài 1, có trạng thái tải dữ liệu, thông báo lỗi và thao tác thử lại.</w:t>
+      </w:r>
+    </w:p>
+    <w:p>
+      <w:pPr>
+        <w:keepNext/>
+        <w:spacing w:after="80" w:line="240" w:lineRule="auto"/>
         <w:jc w:val="center"/>
-        <w:tblLayout w:type="fixed"/>
-        <w:tblLook w:firstColumn="1" w:firstRow="1" w:lastColumn="0" w:lastRow="0" w:noHBand="0" w:noVBand="1" w:val="04A0"/>
-      </w:tblPr>
-      <w:tblGrid>
-        <w:gridCol w:w="4592"/>
-        <w:gridCol w:w="340"/>
-        <w:gridCol w:w="4592"/>
-      </w:tblGrid>
-      <w:tr>
-        <w:trPr>
-          <w:cantSplit/>
-        </w:trPr>
-        <w:tc>
-          <w:tcPr>
-            <w:tcW w:type="dxa" w:w="4592"/>
-            <w:vAlign w:val="top"/>
-          </w:tcPr>
-          <w:p>
-            <w:pPr>
-              <w:keepNext/>
-              <w:spacing w:after="120"/>
-            </w:pPr>
-            <w:r>
-              <w:rPr>
-                <w:b/>
-                <w:sz w:val="24"/>
-              </w:rPr>
-              <w:t>Ảnh 2.1. Dữ liệu trên MockAPI</w:t>
-            </w:r>
-          </w:p>
-          <w:tbl>
-            <w:tblPr>
-              <w:tblW w:type="auto" w:w="0"/>
-              <w:tblLayout w:type="fixed"/>
-              <w:tblLook w:firstColumn="1" w:firstRow="1" w:lastColumn="0" w:lastRow="0" w:noHBand="0" w:noVBand="1" w:val="04A0"/>
-            </w:tblPr>
-            <w:tblGrid>
-              <w:gridCol w:w="4365"/>
-            </w:tblGrid>
-            <w:tr>
-              <w:trPr>
-                <w:trHeight w:val="7937" w:hRule="exact"/>
-              </w:trPr>
-              <w:tc>
-                <w:tcPr>
-                  <w:tcW w:type="dxa" w:w="4592"/>
-                  <w:vAlign w:val="center"/>
-                  <w:shd w:fill="FFFFFF"/>
-                  <w:tcBorders>
-                    <w:top w:val="dashed" w:sz="6" w:color="94A3B8"/>
-                    <w:left w:val="dashed" w:sz="6" w:color="94A3B8"/>
-                    <w:bottom w:val="dashed" w:sz="6" w:color="94A3B8"/>
-                    <w:right w:val="dashed" w:sz="6" w:color="94A3B8"/>
-                  </w:tcBorders>
-                </w:tcPr>
-                <w:p>
-                  <w:pPr>
-                    <w:spacing w:before="0" w:after="0" w:line="240" w:lineRule="auto"/>
-                    <w:jc w:val="center"/>
-                  </w:pPr>
-                  <w:r/>
-                  <w:r>
-                    <w:drawing>
-                      <wp:inline xmlns:a="http://schemas.openxmlformats.org/drawingml/2006/main" xmlns:pic="http://schemas.openxmlformats.org/drawingml/2006/picture">
-                        <wp:extent cx="2195829" cy="4752000"/>
-                        <wp:docPr id="5" name="Picture 5"/>
-                        <wp:cNvGraphicFramePr>
-                          <a:graphicFrameLocks noChangeAspect="1"/>
-                        </wp:cNvGraphicFramePr>
-                        <a:graphic>
-                          <a:graphicData uri="http://schemas.openxmlformats.org/drawingml/2006/picture">
-                            <pic:pic>
-                              <pic:nvPicPr>
-                                <pic:cNvPr id="0" name="2.1-api-json.png"/>
-                                <pic:cNvPicPr/>
-                              </pic:nvPicPr>
-                              <pic:blipFill>
-                                <a:blip r:embed="rId16"/>
-                                <a:stretch>
-                                  <a:fillRect/>
-                                </a:stretch>
-                              </pic:blipFill>
-                              <pic:spPr>
-                                <a:xfrm>
-                                  <a:off x="0" y="0"/>
-                                  <a:ext cx="2195829" cy="4752000"/>
-                                </a:xfrm>
-                                <a:prstGeom prst="rect"/>
-                              </pic:spPr>
-                            </pic:pic>
-                          </a:graphicData>
-                        </a:graphic>
-                      </wp:inline>
-                    </w:drawing>
-                  </w:r>
-                </w:p>
-              </w:tc>
-            </w:tr>
-          </w:tbl>
-          <w:p>
-            <w:pPr>
-              <w:keepNext/>
-              <w:spacing w:before="100" w:after="100"/>
-              <w:jc w:val="center"/>
-            </w:pPr>
-            <w:r>
-              <w:rPr>
-                <w:color w:val="475569"/>
-                <w:sz w:val="18"/>
-              </w:rPr>
-              <w:t>Chụp: 16:53:48 · 25/10/2026 (UTC+7)</w:t>
-            </w:r>
-          </w:p>
-          <w:p>
-            <w:pPr>
-              <w:keepNext/>
-              <w:spacing w:before="60"/>
-            </w:pPr>
-            <w:r>
-              <w:rPr>
-                <w:b/>
-                <w:sz w:val="20"/>
-              </w:rPr>
-              <w:t xml:space="preserve">Kết quả: </w:t>
-            </w:r>
-            <w:r>
-              <w:rPr>
-                <w:sz w:val="20"/>
-              </w:rPr>
-              <w:t>Phản hồi thật từ /phones/1: id = 1, tên Vsmart Joy 3, price = 1790000 và các trường cấu hình.</w:t>
-            </w:r>
-          </w:p>
-        </w:tc>
-        <w:tc>
-          <w:tcPr>
-            <w:tcW w:type="dxa" w:w="340"/>
-          </w:tcPr>
-          <w:p/>
-        </w:tc>
-        <w:tc>
-          <w:tcPr>
-            <w:tcW w:type="dxa" w:w="4592"/>
-            <w:vAlign w:val="top"/>
-          </w:tcPr>
-          <w:p>
-            <w:pPr>
-              <w:keepNext/>
-              <w:spacing w:after="120"/>
-            </w:pPr>
-            <w:r>
-              <w:rPr>
-                <w:b/>
-                <w:sz w:val="24"/>
-              </w:rPr>
-              <w:t>Ảnh 2.2. Ứng dụng đang tải</w:t>
-            </w:r>
-          </w:p>
-          <w:tbl>
-            <w:tblPr>
-              <w:tblW w:type="auto" w:w="0"/>
-              <w:tblLayout w:type="fixed"/>
-              <w:tblLook w:firstColumn="1" w:firstRow="1" w:lastColumn="0" w:lastRow="0" w:noHBand="0" w:noVBand="1" w:val="04A0"/>
-            </w:tblPr>
-            <w:tblGrid>
-              <w:gridCol w:w="4365"/>
-            </w:tblGrid>
-            <w:tr>
-              <w:trPr>
-                <w:trHeight w:val="7937" w:hRule="exact"/>
-              </w:trPr>
-              <w:tc>
-                <w:tcPr>
-                  <w:tcW w:type="dxa" w:w="4592"/>
-                  <w:vAlign w:val="center"/>
-                  <w:shd w:fill="FFFFFF"/>
-                  <w:tcBorders>
-                    <w:top w:val="dashed" w:sz="6" w:color="94A3B8"/>
-                    <w:left w:val="dashed" w:sz="6" w:color="94A3B8"/>
-                    <w:bottom w:val="dashed" w:sz="6" w:color="94A3B8"/>
-                    <w:right w:val="dashed" w:sz="6" w:color="94A3B8"/>
-                  </w:tcBorders>
-                </w:tcPr>
-                <w:p>
-                  <w:pPr>
-                    <w:spacing w:before="0" w:after="0" w:line="240" w:lineRule="auto"/>
-                    <w:jc w:val="center"/>
-                  </w:pPr>
-                  <w:r/>
-                  <w:r>
-                    <w:drawing>
-                      <wp:inline xmlns:a="http://schemas.openxmlformats.org/drawingml/2006/main" xmlns:pic="http://schemas.openxmlformats.org/drawingml/2006/picture">
-                        <wp:extent cx="2195829" cy="4752000"/>
-                        <wp:docPr id="6" name="Picture 6"/>
-                        <wp:cNvGraphicFramePr>
-                          <a:graphicFrameLocks noChangeAspect="1"/>
-                        </wp:cNvGraphicFramePr>
-                        <a:graphic>
-                          <a:graphicData uri="http://schemas.openxmlformats.org/drawingml/2006/picture">
-                            <pic:pic>
-                              <pic:nvPicPr>
-                                <pic:cNvPr id="0" name="2.2-loading.png"/>
-                                <pic:cNvPicPr/>
-                              </pic:nvPicPr>
-                              <pic:blipFill>
-                                <a:blip r:embed="rId17"/>
-                                <a:stretch>
-                                  <a:fillRect/>
-                                </a:stretch>
-                              </pic:blipFill>
-                              <pic:spPr>
-                                <a:xfrm>
-                                  <a:off x="0" y="0"/>
-                                  <a:ext cx="2195829" cy="4752000"/>
-                                </a:xfrm>
-                                <a:prstGeom prst="rect"/>
-                              </pic:spPr>
-                            </pic:pic>
-                          </a:graphicData>
-                        </a:graphic>
-                      </wp:inline>
-                    </w:drawing>
-                  </w:r>
-                </w:p>
-              </w:tc>
-            </w:tr>
-          </w:tbl>
-          <w:p>
-            <w:pPr>
-              <w:keepNext/>
-              <w:spacing w:before="100" w:after="100"/>
-              <w:jc w:val="center"/>
-            </w:pPr>
-            <w:r>
-              <w:rPr>
-                <w:color w:val="475569"/>
-                <w:sz w:val="18"/>
-              </w:rPr>
-              <w:t>Chụp: 16:52:57 · 25/10/2026 (UTC+7)</w:t>
-            </w:r>
-          </w:p>
-          <w:p>
-            <w:pPr>
-              <w:keepNext/>
-              <w:spacing w:before="60"/>
-            </w:pPr>
-            <w:r>
-              <w:rPr>
-                <w:b/>
-                <w:sz w:val="20"/>
-              </w:rPr>
-              <w:t xml:space="preserve">Kết quả: </w:t>
-            </w:r>
-            <w:r>
-              <w:rPr>
-                <w:sz w:val="20"/>
-              </w:rPr>
-              <w:t>Vòng xoay và dòng Đang tải...; yêu cầu API được làm chậm 2,2 giây để chụp trạng thái này.</w:t>
-            </w:r>
-          </w:p>
-        </w:tc>
-      </w:tr>
-    </w:tbl>
+      </w:pPr>
+      <w:r>
+        <w:drawing>
+          <wp:inline xmlns:a="http://schemas.openxmlformats.org/drawingml/2006/main" xmlns:pic="http://schemas.openxmlformats.org/drawingml/2006/picture">
+            <wp:extent cx="8460000" cy="4758750"/>
+            <wp:docPr id="4" name="Picture 4"/>
+            <wp:cNvGraphicFramePr>
+              <a:graphicFrameLocks noChangeAspect="1"/>
+            </wp:cNvGraphicFramePr>
+            <a:graphic>
+              <a:graphicData uri="http://schemas.openxmlformats.org/drawingml/2006/picture">
+                <pic:pic>
+                  <pic:nvPicPr>
+                    <pic:cNvPr id="0" name="image4.png"/>
+                    <pic:cNvPicPr/>
+                  </pic:nvPicPr>
+                  <pic:blipFill>
+                    <a:blip r:embed="rId15"/>
+                    <a:stretch>
+                      <a:fillRect/>
+                    </a:stretch>
+                  </pic:blipFill>
+                  <pic:spPr>
+                    <a:xfrm>
+                      <a:off x="0" y="0"/>
+                      <a:ext cx="8460000" cy="4758750"/>
+                    </a:xfrm>
+                    <a:prstGeom prst="rect"/>
+                  </pic:spPr>
+                </pic:pic>
+              </a:graphicData>
+            </a:graphic>
+          </wp:inline>
+        </w:drawing>
+      </w:r>
+    </w:p>
+    <w:p>
+      <w:pPr>
+        <w:keepNext/>
+        <w:spacing w:after="100"/>
+        <w:jc w:val="center"/>
+      </w:pPr>
+      <w:r>
+        <w:rPr>
+          <w:i/>
+          <w:sz w:val="20"/>
+        </w:rPr>
+        <w:t>Hình 4. Giao diện sản phẩm trong Bài 2.</w:t>
+      </w:r>
+    </w:p>
+    <w:p>
+      <w:pPr>
+        <w:spacing w:after="0"/>
+      </w:pPr>
+      <w:r>
+        <w:rPr>
+          <w:b/>
+          <w:sz w:val="20"/>
+        </w:rPr>
+        <w:t xml:space="preserve">Nhận xét: </w:t>
+      </w:r>
+      <w:r>
+        <w:rPr>
+          <w:sz w:val="20"/>
+        </w:rPr>
+        <w:t>Màn hình Bài 2 hiển thị Vsmart Joy 3, ảnh màu xanh và giá 1.790.000 đ. Giao diện chọn màu và nút “CHỌN MUA” được tái sử dụng từ Bài 1.</w:t>
+      </w:r>
+    </w:p>
     <w:p>
       <w:r>
         <w:br w:type="page"/>
@@ -1100,565 +859,100 @@
     </w:p>
     <w:p>
       <w:pPr>
-        <w:spacing w:after="280"/>
+        <w:spacing w:after="80"/>
       </w:pPr>
       <w:r>
-        <w:t>Minh chứng 2/3 — Hiển thị dữ liệu từ API</w:t>
-      </w:r>
-    </w:p>
-    <w:tbl>
-      <w:tblPr>
-        <w:tblW w:type="auto" w:w="0"/>
-        <w:jc w:val="center"/>
-        <w:tblLayout w:type="fixed"/>
-        <w:tblLook w:firstColumn="1" w:firstRow="1" w:lastColumn="0" w:lastRow="0" w:noHBand="0" w:noVBand="1" w:val="04A0"/>
-      </w:tblPr>
-      <w:tblGrid>
-        <w:gridCol w:w="4592"/>
-        <w:gridCol w:w="340"/>
-        <w:gridCol w:w="4592"/>
-      </w:tblGrid>
-      <w:tr>
-        <w:trPr>
-          <w:cantSplit/>
-        </w:trPr>
-        <w:tc>
-          <w:tcPr>
-            <w:tcW w:type="dxa" w:w="4592"/>
-            <w:vAlign w:val="top"/>
-          </w:tcPr>
-          <w:p>
-            <w:pPr>
-              <w:keepNext/>
-              <w:spacing w:after="120"/>
-            </w:pPr>
-            <w:r>
-              <w:rPr>
-                <w:b/>
-                <w:sz w:val="24"/>
-              </w:rPr>
-              <w:t>Ảnh 2.3. Tên/giá của bản ghi API</w:t>
-            </w:r>
-          </w:p>
-          <w:tbl>
-            <w:tblPr>
-              <w:tblW w:type="auto" w:w="0"/>
-              <w:tblLayout w:type="fixed"/>
-              <w:tblLook w:firstColumn="1" w:firstRow="1" w:lastColumn="0" w:lastRow="0" w:noHBand="0" w:noVBand="1" w:val="04A0"/>
-            </w:tblPr>
-            <w:tblGrid>
-              <w:gridCol w:w="4365"/>
-            </w:tblGrid>
-            <w:tr>
-              <w:trPr>
-                <w:trHeight w:val="7937" w:hRule="exact"/>
-              </w:trPr>
-              <w:tc>
-                <w:tcPr>
-                  <w:tcW w:type="dxa" w:w="4592"/>
-                  <w:vAlign w:val="center"/>
-                  <w:shd w:fill="FFFFFF"/>
-                  <w:tcBorders>
-                    <w:top w:val="dashed" w:sz="6" w:color="94A3B8"/>
-                    <w:left w:val="dashed" w:sz="6" w:color="94A3B8"/>
-                    <w:bottom w:val="dashed" w:sz="6" w:color="94A3B8"/>
-                    <w:right w:val="dashed" w:sz="6" w:color="94A3B8"/>
-                  </w:tcBorders>
-                </w:tcPr>
-                <w:p>
-                  <w:pPr>
-                    <w:spacing w:before="0" w:after="0" w:line="240" w:lineRule="auto"/>
-                    <w:jc w:val="center"/>
-                  </w:pPr>
-                  <w:r/>
-                  <w:r>
-                    <w:drawing>
-                      <wp:inline xmlns:a="http://schemas.openxmlformats.org/drawingml/2006/main" xmlns:pic="http://schemas.openxmlformats.org/drawingml/2006/picture">
-                        <wp:extent cx="2195829" cy="4752000"/>
-                        <wp:docPr id="7" name="Picture 7"/>
-                        <wp:cNvGraphicFramePr>
-                          <a:graphicFrameLocks noChangeAspect="1"/>
-                        </wp:cNvGraphicFramePr>
-                        <a:graphic>
-                          <a:graphicData uri="http://schemas.openxmlformats.org/drawingml/2006/picture">
-                            <pic:pic>
-                              <pic:nvPicPr>
-                                <pic:cNvPr id="0" name="2.1-api-json.png"/>
-                                <pic:cNvPicPr/>
-                              </pic:nvPicPr>
-                              <pic:blipFill>
-                                <a:blip r:embed="rId16"/>
-                                <a:stretch>
-                                  <a:fillRect/>
-                                </a:stretch>
-                              </pic:blipFill>
-                              <pic:spPr>
-                                <a:xfrm>
-                                  <a:off x="0" y="0"/>
-                                  <a:ext cx="2195829" cy="4752000"/>
-                                </a:xfrm>
-                                <a:prstGeom prst="rect"/>
-                              </pic:spPr>
-                            </pic:pic>
-                          </a:graphicData>
-                        </a:graphic>
-                      </wp:inline>
-                    </w:drawing>
-                  </w:r>
-                </w:p>
-              </w:tc>
-            </w:tr>
-          </w:tbl>
-          <w:p>
-            <w:pPr>
-              <w:keepNext/>
-              <w:spacing w:before="100" w:after="100"/>
-              <w:jc w:val="center"/>
-            </w:pPr>
-            <w:r>
-              <w:rPr>
-                <w:color w:val="475569"/>
-                <w:sz w:val="18"/>
-              </w:rPr>
-              <w:t>Chụp: 16:53:48 · 25/10/2026 (UTC+7)</w:t>
-            </w:r>
-          </w:p>
-          <w:p>
-            <w:pPr>
-              <w:keepNext/>
-              <w:spacing w:before="60"/>
-            </w:pPr>
-            <w:r>
-              <w:rPr>
-                <w:b/>
-                <w:sz w:val="20"/>
-              </w:rPr>
-              <w:t xml:space="preserve">Kết quả: </w:t>
-            </w:r>
-            <w:r>
-              <w:rPr>
-                <w:sz w:val="20"/>
-              </w:rPr>
-              <w:t>Bản ghi API thật: Vsmart Joy 3, giá 1.790.000 đ, defaultColor = blue. Đối chiếu với ảnh 2.4.</w:t>
-            </w:r>
-          </w:p>
-        </w:tc>
-        <w:tc>
-          <w:tcPr>
-            <w:tcW w:type="dxa" w:w="340"/>
-          </w:tcPr>
-          <w:p/>
-        </w:tc>
-        <w:tc>
-          <w:tcPr>
-            <w:tcW w:type="dxa" w:w="4592"/>
-            <w:vAlign w:val="top"/>
-          </w:tcPr>
-          <w:p>
-            <w:pPr>
-              <w:keepNext/>
-              <w:spacing w:after="120"/>
-            </w:pPr>
-            <w:r>
-              <w:rPr>
-                <w:b/>
-                <w:sz w:val="24"/>
-              </w:rPr>
-              <w:t>Ảnh 2.4. Sản phẩm đã tải trên app</w:t>
-            </w:r>
-          </w:p>
-          <w:tbl>
-            <w:tblPr>
-              <w:tblW w:type="auto" w:w="0"/>
-              <w:tblLayout w:type="fixed"/>
-              <w:tblLook w:firstColumn="1" w:firstRow="1" w:lastColumn="0" w:lastRow="0" w:noHBand="0" w:noVBand="1" w:val="04A0"/>
-            </w:tblPr>
-            <w:tblGrid>
-              <w:gridCol w:w="4365"/>
-            </w:tblGrid>
-            <w:tr>
-              <w:trPr>
-                <w:trHeight w:val="7937" w:hRule="exact"/>
-              </w:trPr>
-              <w:tc>
-                <w:tcPr>
-                  <w:tcW w:type="dxa" w:w="4592"/>
-                  <w:vAlign w:val="center"/>
-                  <w:shd w:fill="FFFFFF"/>
-                  <w:tcBorders>
-                    <w:top w:val="dashed" w:sz="6" w:color="94A3B8"/>
-                    <w:left w:val="dashed" w:sz="6" w:color="94A3B8"/>
-                    <w:bottom w:val="dashed" w:sz="6" w:color="94A3B8"/>
-                    <w:right w:val="dashed" w:sz="6" w:color="94A3B8"/>
-                  </w:tcBorders>
-                </w:tcPr>
-                <w:p>
-                  <w:pPr>
-                    <w:spacing w:before="0" w:after="0" w:line="240" w:lineRule="auto"/>
-                    <w:jc w:val="center"/>
-                  </w:pPr>
-                  <w:r/>
-                  <w:r>
-                    <w:drawing>
-                      <wp:inline xmlns:a="http://schemas.openxmlformats.org/drawingml/2006/main" xmlns:pic="http://schemas.openxmlformats.org/drawingml/2006/picture">
-                        <wp:extent cx="2195829" cy="4752000"/>
-                        <wp:docPr id="8" name="Picture 8"/>
-                        <wp:cNvGraphicFramePr>
-                          <a:graphicFrameLocks noChangeAspect="1"/>
-                        </wp:cNvGraphicFramePr>
-                        <a:graphic>
-                          <a:graphicData uri="http://schemas.openxmlformats.org/drawingml/2006/picture">
-                            <pic:pic>
-                              <pic:nvPicPr>
-                                <pic:cNvPr id="0" name="2.4-api-product.png"/>
-                                <pic:cNvPicPr/>
-                              </pic:nvPicPr>
-                              <pic:blipFill>
-                                <a:blip r:embed="rId18"/>
-                                <a:stretch>
-                                  <a:fillRect/>
-                                </a:stretch>
-                              </pic:blipFill>
-                              <pic:spPr>
-                                <a:xfrm>
-                                  <a:off x="0" y="0"/>
-                                  <a:ext cx="2195829" cy="4752000"/>
-                                </a:xfrm>
-                                <a:prstGeom prst="rect"/>
-                              </pic:spPr>
-                            </pic:pic>
-                          </a:graphicData>
-                        </a:graphic>
-                      </wp:inline>
-                    </w:drawing>
-                  </w:r>
-                </w:p>
-              </w:tc>
-            </w:tr>
-          </w:tbl>
-          <w:p>
-            <w:pPr>
-              <w:keepNext/>
-              <w:spacing w:before="100" w:after="100"/>
-              <w:jc w:val="center"/>
-            </w:pPr>
-            <w:r>
-              <w:rPr>
-                <w:color w:val="475569"/>
-                <w:sz w:val="18"/>
-              </w:rPr>
-              <w:t>Chụp: 16:53:00 · 25/10/2026 (UTC+7)</w:t>
-            </w:r>
-          </w:p>
-          <w:p>
-            <w:pPr>
-              <w:keepNext/>
-              <w:spacing w:before="60"/>
-            </w:pPr>
-            <w:r>
-              <w:rPr>
-                <w:b/>
-                <w:sz w:val="20"/>
-              </w:rPr>
-              <w:t xml:space="preserve">Kết quả: </w:t>
-            </w:r>
-            <w:r>
-              <w:rPr>
-                <w:sz w:val="20"/>
-              </w:rPr>
-              <w:t>Bài 2 hiển thị đúng tên/giá/màu mặc định từ phản hồi API thật; không sử dụng fallback offline.</w:t>
-            </w:r>
-          </w:p>
-        </w:tc>
-      </w:tr>
-    </w:tbl>
-    <w:p>
-      <w:r>
-        <w:br w:type="page"/>
+        <w:rPr>
+          <w:b/>
+          <w:sz w:val="24"/>
+        </w:rPr>
+        <w:t>2.2. Xử lý yêu cầu trả về lỗi</w:t>
       </w:r>
     </w:p>
     <w:p>
       <w:pPr>
-        <w:pStyle w:val="Heading1"/>
+        <w:spacing w:after="100"/>
       </w:pPr>
       <w:r>
-        <w:t>BÀI 2. GẮN API</w:t>
+        <w:rPr>
+          <w:sz w:val="20"/>
+        </w:rPr>
+        <w:t>Nội dung minh chứng: giao diện thông báo lỗi khi yêu cầu dữ liệu không tìm thấy tài nguyên.</w:t>
       </w:r>
     </w:p>
     <w:p>
       <w:pPr>
-        <w:spacing w:after="280"/>
+        <w:keepNext/>
+        <w:spacing w:after="80" w:line="240" w:lineRule="auto"/>
+        <w:jc w:val="center"/>
       </w:pPr>
       <w:r>
-        <w:t>Minh chứng 3/3 — Lỗi và thử lại</w:t>
+        <w:drawing>
+          <wp:inline xmlns:a="http://schemas.openxmlformats.org/drawingml/2006/main" xmlns:pic="http://schemas.openxmlformats.org/drawingml/2006/picture">
+            <wp:extent cx="8460000" cy="4758750"/>
+            <wp:docPr id="5" name="Picture 5"/>
+            <wp:cNvGraphicFramePr>
+              <a:graphicFrameLocks noChangeAspect="1"/>
+            </wp:cNvGraphicFramePr>
+            <a:graphic>
+              <a:graphicData uri="http://schemas.openxmlformats.org/drawingml/2006/picture">
+                <pic:pic>
+                  <pic:nvPicPr>
+                    <pic:cNvPr id="0" name="image5.png"/>
+                    <pic:cNvPicPr/>
+                  </pic:nvPicPr>
+                  <pic:blipFill>
+                    <a:blip r:embed="rId16"/>
+                    <a:stretch>
+                      <a:fillRect/>
+                    </a:stretch>
+                  </pic:blipFill>
+                  <pic:spPr>
+                    <a:xfrm>
+                      <a:off x="0" y="0"/>
+                      <a:ext cx="8460000" cy="4758750"/>
+                    </a:xfrm>
+                    <a:prstGeom prst="rect"/>
+                  </pic:spPr>
+                </pic:pic>
+              </a:graphicData>
+            </a:graphic>
+          </wp:inline>
+        </w:drawing>
       </w:r>
     </w:p>
-    <w:tbl>
-      <w:tblPr>
-        <w:tblW w:type="auto" w:w="0"/>
+    <w:p>
+      <w:pPr>
+        <w:keepNext/>
+        <w:spacing w:after="100"/>
         <w:jc w:val="center"/>
-        <w:tblLayout w:type="fixed"/>
-        <w:tblLook w:firstColumn="1" w:firstRow="1" w:lastColumn="0" w:lastRow="0" w:noHBand="0" w:noVBand="1" w:val="04A0"/>
-      </w:tblPr>
-      <w:tblGrid>
-        <w:gridCol w:w="4592"/>
-        <w:gridCol w:w="340"/>
-        <w:gridCol w:w="4592"/>
-      </w:tblGrid>
-      <w:tr>
-        <w:trPr>
-          <w:cantSplit/>
-        </w:trPr>
-        <w:tc>
-          <w:tcPr>
-            <w:tcW w:type="dxa" w:w="4592"/>
-            <w:vAlign w:val="top"/>
-          </w:tcPr>
-          <w:p>
-            <w:pPr>
-              <w:keepNext/>
-              <w:spacing w:after="120"/>
-            </w:pPr>
-            <w:r>
-              <w:rPr>
-                <w:b/>
-                <w:sz w:val="24"/>
-              </w:rPr>
-              <w:t>Ảnh 2.5. Khi mất mạng hoặc URL lỗi</w:t>
-            </w:r>
-          </w:p>
-          <w:tbl>
-            <w:tblPr>
-              <w:tblW w:type="auto" w:w="0"/>
-              <w:tblLayout w:type="fixed"/>
-              <w:tblLook w:firstColumn="1" w:firstRow="1" w:lastColumn="0" w:lastRow="0" w:noHBand="0" w:noVBand="1" w:val="04A0"/>
-            </w:tblPr>
-            <w:tblGrid>
-              <w:gridCol w:w="4365"/>
-            </w:tblGrid>
-            <w:tr>
-              <w:trPr>
-                <w:trHeight w:val="7937" w:hRule="exact"/>
-              </w:trPr>
-              <w:tc>
-                <w:tcPr>
-                  <w:tcW w:type="dxa" w:w="4592"/>
-                  <w:vAlign w:val="center"/>
-                  <w:shd w:fill="FFFFFF"/>
-                  <w:tcBorders>
-                    <w:top w:val="dashed" w:sz="6" w:color="94A3B8"/>
-                    <w:left w:val="dashed" w:sz="6" w:color="94A3B8"/>
-                    <w:bottom w:val="dashed" w:sz="6" w:color="94A3B8"/>
-                    <w:right w:val="dashed" w:sz="6" w:color="94A3B8"/>
-                  </w:tcBorders>
-                </w:tcPr>
-                <w:p>
-                  <w:pPr>
-                    <w:spacing w:before="0" w:after="0" w:line="240" w:lineRule="auto"/>
-                    <w:jc w:val="center"/>
-                  </w:pPr>
-                  <w:r/>
-                  <w:r>
-                    <w:drawing>
-                      <wp:inline xmlns:a="http://schemas.openxmlformats.org/drawingml/2006/main" xmlns:pic="http://schemas.openxmlformats.org/drawingml/2006/picture">
-                        <wp:extent cx="2195829" cy="4752000"/>
-                        <wp:docPr id="9" name="Picture 9"/>
-                        <wp:cNvGraphicFramePr>
-                          <a:graphicFrameLocks noChangeAspect="1"/>
-                        </wp:cNvGraphicFramePr>
-                        <a:graphic>
-                          <a:graphicData uri="http://schemas.openxmlformats.org/drawingml/2006/picture">
-                            <pic:pic>
-                              <pic:nvPicPr>
-                                <pic:cNvPr id="0" name="2.5-api-network-error.png"/>
-                                <pic:cNvPicPr/>
-                              </pic:nvPicPr>
-                              <pic:blipFill>
-                                <a:blip r:embed="rId19"/>
-                                <a:stretch>
-                                  <a:fillRect/>
-                                </a:stretch>
-                              </pic:blipFill>
-                              <pic:spPr>
-                                <a:xfrm>
-                                  <a:off x="0" y="0"/>
-                                  <a:ext cx="2195829" cy="4752000"/>
-                                </a:xfrm>
-                                <a:prstGeom prst="rect"/>
-                              </pic:spPr>
-                            </pic:pic>
-                          </a:graphicData>
-                        </a:graphic>
-                      </wp:inline>
-                    </w:drawing>
-                  </w:r>
-                </w:p>
-              </w:tc>
-            </w:tr>
-          </w:tbl>
-          <w:p>
-            <w:pPr>
-              <w:keepNext/>
-              <w:spacing w:before="100" w:after="100"/>
-              <w:jc w:val="center"/>
-            </w:pPr>
-            <w:r>
-              <w:rPr>
-                <w:color w:val="475569"/>
-                <w:sz w:val="18"/>
-              </w:rPr>
-              <w:t>Chụp: 16:53:03 · 25/10/2026 (UTC+7)</w:t>
-            </w:r>
-          </w:p>
-          <w:p>
-            <w:pPr>
-              <w:keepNext/>
-              <w:spacing w:before="60"/>
-            </w:pPr>
-            <w:r>
-              <w:rPr>
-                <w:b/>
-                <w:sz w:val="20"/>
-              </w:rPr>
-              <w:t xml:space="preserve">Kết quả: </w:t>
-            </w:r>
-            <w:r>
-              <w:rPr>
-                <w:sz w:val="20"/>
-              </w:rPr>
-              <w:t>Ngắt yêu cầu có kiểm soát bằng Playwright: hiện Failed to fetch và nút THỬ LẠI. Đây là tình huống lỗi mô phỏng.</w:t>
-            </w:r>
-          </w:p>
-        </w:tc>
-        <w:tc>
-          <w:tcPr>
-            <w:tcW w:type="dxa" w:w="340"/>
-          </w:tcPr>
-          <w:p/>
-        </w:tc>
-        <w:tc>
-          <w:tcPr>
-            <w:tcW w:type="dxa" w:w="4592"/>
-            <w:vAlign w:val="top"/>
-          </w:tcPr>
-          <w:p>
-            <w:pPr>
-              <w:keepNext/>
-              <w:spacing w:after="120"/>
-            </w:pPr>
-            <w:r>
-              <w:rPr>
-                <w:b/>
-                <w:sz w:val="24"/>
-              </w:rPr>
-              <w:t>Ảnh 2.6. Sau khi bấm THỬ LẠI</w:t>
-            </w:r>
-          </w:p>
-          <w:tbl>
-            <w:tblPr>
-              <w:tblW w:type="auto" w:w="0"/>
-              <w:tblLayout w:type="fixed"/>
-              <w:tblLook w:firstColumn="1" w:firstRow="1" w:lastColumn="0" w:lastRow="0" w:noHBand="0" w:noVBand="1" w:val="04A0"/>
-            </w:tblPr>
-            <w:tblGrid>
-              <w:gridCol w:w="4365"/>
-            </w:tblGrid>
-            <w:tr>
-              <w:trPr>
-                <w:trHeight w:val="7937" w:hRule="exact"/>
-              </w:trPr>
-              <w:tc>
-                <w:tcPr>
-                  <w:tcW w:type="dxa" w:w="4592"/>
-                  <w:vAlign w:val="center"/>
-                  <w:shd w:fill="FFFFFF"/>
-                  <w:tcBorders>
-                    <w:top w:val="dashed" w:sz="6" w:color="94A3B8"/>
-                    <w:left w:val="dashed" w:sz="6" w:color="94A3B8"/>
-                    <w:bottom w:val="dashed" w:sz="6" w:color="94A3B8"/>
-                    <w:right w:val="dashed" w:sz="6" w:color="94A3B8"/>
-                  </w:tcBorders>
-                </w:tcPr>
-                <w:p>
-                  <w:pPr>
-                    <w:spacing w:before="0" w:after="0" w:line="240" w:lineRule="auto"/>
-                    <w:jc w:val="center"/>
-                  </w:pPr>
-                  <w:r/>
-                  <w:r>
-                    <w:drawing>
-                      <wp:inline xmlns:a="http://schemas.openxmlformats.org/drawingml/2006/main" xmlns:pic="http://schemas.openxmlformats.org/drawingml/2006/picture">
-                        <wp:extent cx="2195829" cy="4752000"/>
-                        <wp:docPr id="10" name="Picture 10"/>
-                        <wp:cNvGraphicFramePr>
-                          <a:graphicFrameLocks noChangeAspect="1"/>
-                        </wp:cNvGraphicFramePr>
-                        <a:graphic>
-                          <a:graphicData uri="http://schemas.openxmlformats.org/drawingml/2006/picture">
-                            <pic:pic>
-                              <pic:nvPicPr>
-                                <pic:cNvPr id="0" name="2.4-api-product.png"/>
-                                <pic:cNvPicPr/>
-                              </pic:nvPicPr>
-                              <pic:blipFill>
-                                <a:blip r:embed="rId18"/>
-                                <a:stretch>
-                                  <a:fillRect/>
-                                </a:stretch>
-                              </pic:blipFill>
-                              <pic:spPr>
-                                <a:xfrm>
-                                  <a:off x="0" y="0"/>
-                                  <a:ext cx="2195829" cy="4752000"/>
-                                </a:xfrm>
-                                <a:prstGeom prst="rect"/>
-                              </pic:spPr>
-                            </pic:pic>
-                          </a:graphicData>
-                        </a:graphic>
-                      </wp:inline>
-                    </w:drawing>
-                  </w:r>
-                </w:p>
-              </w:tc>
-            </w:tr>
-          </w:tbl>
-          <w:p>
-            <w:pPr>
-              <w:keepNext/>
-              <w:spacing w:before="100" w:after="100"/>
-              <w:jc w:val="center"/>
-            </w:pPr>
-            <w:r>
-              <w:rPr>
-                <w:color w:val="475569"/>
-                <w:sz w:val="18"/>
-              </w:rPr>
-              <w:t>Chụp: 16:53:06 · 25/10/2026 (UTC+7)</w:t>
-            </w:r>
-          </w:p>
-          <w:p>
-            <w:pPr>
-              <w:keepNext/>
-              <w:spacing w:before="60"/>
-            </w:pPr>
-            <w:r>
-              <w:rPr>
-                <w:b/>
-                <w:sz w:val="20"/>
-              </w:rPr>
-              <w:t xml:space="preserve">Kết quả: </w:t>
-            </w:r>
-            <w:r>
-              <w:rPr>
-                <w:sz w:val="20"/>
-              </w:rPr>
-              <w:t>Khôi phục kết nối rồi bấm THỬ LẠI: ứng dụng gọi lại API thật và hiển thị sản phẩm thành công.</w:t>
-            </w:r>
-          </w:p>
-        </w:tc>
-      </w:tr>
-    </w:tbl>
+      </w:pPr>
+      <w:r>
+        <w:rPr>
+          <w:i/>
+          <w:sz w:val="20"/>
+        </w:rPr>
+        <w:t>Hình 5. Thông báo lỗi HTTP 404 và nút thử lại.</w:t>
+      </w:r>
+    </w:p>
+    <w:p>
+      <w:pPr>
+        <w:spacing w:after="0"/>
+      </w:pPr>
+      <w:r>
+        <w:rPr>
+          <w:b/>
+          <w:sz w:val="20"/>
+        </w:rPr>
+        <w:t xml:space="preserve">Nhận xét: </w:t>
+      </w:r>
+      <w:r>
+        <w:rPr>
+          <w:sz w:val="20"/>
+        </w:rPr>
+        <w:t>Ứng dụng hiển thị “Máy chủ trả về lỗi 404” cùng nút “THỬ LẠI”. Ảnh minh chứng trạng thái lỗi và sự hiện diện của thao tác thử lại; chưa thể hiện kết quả sau khi bấm nút.</w:t>
+      </w:r>
+    </w:p>
     <w:p>
       <w:r>
         <w:br w:type="page"/>
@@ -1674,278 +968,100 @@
     </w:p>
     <w:p>
       <w:pPr>
-        <w:spacing w:after="280"/>
+        <w:spacing w:after="80"/>
       </w:pPr>
       <w:r>
-        <w:t>Minh chứng 1/2 — Danh sách và tìm kiếm</w:t>
+        <w:rPr>
+          <w:b/>
+          <w:sz w:val="24"/>
+        </w:rPr>
+        <w:t>3.1. Tab Trang chủ</w:t>
       </w:r>
     </w:p>
-    <w:tbl>
-      <w:tblPr>
-        <w:tblW w:type="auto" w:w="0"/>
+    <w:p>
+      <w:pPr>
+        <w:spacing w:after="100"/>
+      </w:pPr>
+      <w:r>
+        <w:rPr>
+          <w:sz w:val="20"/>
+        </w:rPr>
+        <w:t>Yêu cầu: tạo ba tab Home, Search và Profile; có danh sách sản phẩm, ô nhập từ khóa, thông tin cá nhân và icon cho từng tab.</w:t>
+      </w:r>
+    </w:p>
+    <w:p>
+      <w:pPr>
+        <w:keepNext/>
+        <w:spacing w:after="80" w:line="240" w:lineRule="auto"/>
         <w:jc w:val="center"/>
-        <w:tblLayout w:type="fixed"/>
-        <w:tblLook w:firstColumn="1" w:firstRow="1" w:lastColumn="0" w:lastRow="0" w:noHBand="0" w:noVBand="1" w:val="04A0"/>
-      </w:tblPr>
-      <w:tblGrid>
-        <w:gridCol w:w="4592"/>
-        <w:gridCol w:w="340"/>
-        <w:gridCol w:w="4592"/>
-      </w:tblGrid>
-      <w:tr>
-        <w:trPr>
-          <w:cantSplit/>
-        </w:trPr>
-        <w:tc>
-          <w:tcPr>
-            <w:tcW w:type="dxa" w:w="4592"/>
-            <w:vAlign w:val="top"/>
-          </w:tcPr>
-          <w:p>
-            <w:pPr>
-              <w:keepNext/>
-              <w:spacing w:after="120"/>
-            </w:pPr>
-            <w:r>
-              <w:rPr>
-                <w:b/>
-                <w:sz w:val="24"/>
-              </w:rPr>
-              <w:t>Ảnh 3.1. Tab Trang chủ</w:t>
-            </w:r>
-          </w:p>
-          <w:tbl>
-            <w:tblPr>
-              <w:tblW w:type="auto" w:w="0"/>
-              <w:tblLayout w:type="fixed"/>
-              <w:tblLook w:firstColumn="1" w:firstRow="1" w:lastColumn="0" w:lastRow="0" w:noHBand="0" w:noVBand="1" w:val="04A0"/>
-            </w:tblPr>
-            <w:tblGrid>
-              <w:gridCol w:w="4365"/>
-            </w:tblGrid>
-            <w:tr>
-              <w:trPr>
-                <w:trHeight w:val="7937" w:hRule="exact"/>
-              </w:trPr>
-              <w:tc>
-                <w:tcPr>
-                  <w:tcW w:type="dxa" w:w="4592"/>
-                  <w:vAlign w:val="center"/>
-                  <w:shd w:fill="FFFFFF"/>
-                  <w:tcBorders>
-                    <w:top w:val="dashed" w:sz="6" w:color="94A3B8"/>
-                    <w:left w:val="dashed" w:sz="6" w:color="94A3B8"/>
-                    <w:bottom w:val="dashed" w:sz="6" w:color="94A3B8"/>
-                    <w:right w:val="dashed" w:sz="6" w:color="94A3B8"/>
-                  </w:tcBorders>
-                </w:tcPr>
-                <w:p>
-                  <w:pPr>
-                    <w:spacing w:before="0" w:after="0" w:line="240" w:lineRule="auto"/>
-                    <w:jc w:val="center"/>
-                  </w:pPr>
-                  <w:r/>
-                  <w:r>
-                    <w:drawing>
-                      <wp:inline xmlns:a="http://schemas.openxmlformats.org/drawingml/2006/main" xmlns:pic="http://schemas.openxmlformats.org/drawingml/2006/picture">
-                        <wp:extent cx="2195829" cy="4752000"/>
-                        <wp:docPr id="11" name="Picture 11"/>
-                        <wp:cNvGraphicFramePr>
-                          <a:graphicFrameLocks noChangeAspect="1"/>
-                        </wp:cNvGraphicFramePr>
-                        <a:graphic>
-                          <a:graphicData uri="http://schemas.openxmlformats.org/drawingml/2006/picture">
-                            <pic:pic>
-                              <pic:nvPicPr>
-                                <pic:cNvPr id="0" name="3.1-home.png"/>
-                                <pic:cNvPicPr/>
-                              </pic:nvPicPr>
-                              <pic:blipFill>
-                                <a:blip r:embed="rId20"/>
-                                <a:stretch>
-                                  <a:fillRect/>
-                                </a:stretch>
-                              </pic:blipFill>
-                              <pic:spPr>
-                                <a:xfrm>
-                                  <a:off x="0" y="0"/>
-                                  <a:ext cx="2195829" cy="4752000"/>
-                                </a:xfrm>
-                                <a:prstGeom prst="rect"/>
-                              </pic:spPr>
-                            </pic:pic>
-                          </a:graphicData>
-                        </a:graphic>
-                      </wp:inline>
-                    </w:drawing>
-                  </w:r>
-                </w:p>
-              </w:tc>
-            </w:tr>
-          </w:tbl>
-          <w:p>
-            <w:pPr>
-              <w:keepNext/>
-              <w:spacing w:before="100" w:after="100"/>
-              <w:jc w:val="center"/>
-            </w:pPr>
-            <w:r>
-              <w:rPr>
-                <w:color w:val="475569"/>
-                <w:sz w:val="18"/>
-              </w:rPr>
-              <w:t>Chụp: 16:53:08 · 25/10/2026 (UTC+7)</w:t>
-            </w:r>
-          </w:p>
-          <w:p>
-            <w:pPr>
-              <w:keepNext/>
-              <w:spacing w:before="60"/>
-            </w:pPr>
-            <w:r>
-              <w:rPr>
-                <w:b/>
-                <w:sz w:val="20"/>
-              </w:rPr>
-              <w:t xml:space="preserve">Kết quả: </w:t>
-            </w:r>
-            <w:r>
-              <w:rPr>
-                <w:sz w:val="20"/>
-              </w:rPr>
-              <w:t>Tab Trang chủ có danh sách sáu sản phẩm; thanh tab gồm Trang chủ, Tìm kiếm và Cá nhân.</w:t>
-            </w:r>
-          </w:p>
-        </w:tc>
-        <w:tc>
-          <w:tcPr>
-            <w:tcW w:type="dxa" w:w="340"/>
-          </w:tcPr>
-          <w:p/>
-        </w:tc>
-        <w:tc>
-          <w:tcPr>
-            <w:tcW w:type="dxa" w:w="4592"/>
-            <w:vAlign w:val="top"/>
-          </w:tcPr>
-          <w:p>
-            <w:pPr>
-              <w:keepNext/>
-              <w:spacing w:after="120"/>
-            </w:pPr>
-            <w:r>
-              <w:rPr>
-                <w:b/>
-                <w:sz w:val="24"/>
-              </w:rPr>
-              <w:t>Ảnh 3.2. Tìm kiếm “aris”</w:t>
-            </w:r>
-          </w:p>
-          <w:tbl>
-            <w:tblPr>
-              <w:tblW w:type="auto" w:w="0"/>
-              <w:tblLayout w:type="fixed"/>
-              <w:tblLook w:firstColumn="1" w:firstRow="1" w:lastColumn="0" w:lastRow="0" w:noHBand="0" w:noVBand="1" w:val="04A0"/>
-            </w:tblPr>
-            <w:tblGrid>
-              <w:gridCol w:w="4365"/>
-            </w:tblGrid>
-            <w:tr>
-              <w:trPr>
-                <w:trHeight w:val="7937" w:hRule="exact"/>
-              </w:trPr>
-              <w:tc>
-                <w:tcPr>
-                  <w:tcW w:type="dxa" w:w="4592"/>
-                  <w:vAlign w:val="center"/>
-                  <w:shd w:fill="FFFFFF"/>
-                  <w:tcBorders>
-                    <w:top w:val="dashed" w:sz="6" w:color="94A3B8"/>
-                    <w:left w:val="dashed" w:sz="6" w:color="94A3B8"/>
-                    <w:bottom w:val="dashed" w:sz="6" w:color="94A3B8"/>
-                    <w:right w:val="dashed" w:sz="6" w:color="94A3B8"/>
-                  </w:tcBorders>
-                </w:tcPr>
-                <w:p>
-                  <w:pPr>
-                    <w:spacing w:before="0" w:after="0" w:line="240" w:lineRule="auto"/>
-                    <w:jc w:val="center"/>
-                  </w:pPr>
-                  <w:r/>
-                  <w:r>
-                    <w:drawing>
-                      <wp:inline xmlns:a="http://schemas.openxmlformats.org/drawingml/2006/main" xmlns:pic="http://schemas.openxmlformats.org/drawingml/2006/picture">
-                        <wp:extent cx="2195829" cy="4752000"/>
-                        <wp:docPr id="12" name="Picture 12"/>
-                        <wp:cNvGraphicFramePr>
-                          <a:graphicFrameLocks noChangeAspect="1"/>
-                        </wp:cNvGraphicFramePr>
-                        <a:graphic>
-                          <a:graphicData uri="http://schemas.openxmlformats.org/drawingml/2006/picture">
-                            <pic:pic>
-                              <pic:nvPicPr>
-                                <pic:cNvPr id="0" name="3.2-search-aris.png"/>
-                                <pic:cNvPicPr/>
-                              </pic:nvPicPr>
-                              <pic:blipFill>
-                                <a:blip r:embed="rId21"/>
-                                <a:stretch>
-                                  <a:fillRect/>
-                                </a:stretch>
-                              </pic:blipFill>
-                              <pic:spPr>
-                                <a:xfrm>
-                                  <a:off x="0" y="0"/>
-                                  <a:ext cx="2195829" cy="4752000"/>
-                                </a:xfrm>
-                                <a:prstGeom prst="rect"/>
-                              </pic:spPr>
-                            </pic:pic>
-                          </a:graphicData>
-                        </a:graphic>
-                      </wp:inline>
-                    </w:drawing>
-                  </w:r>
-                </w:p>
-              </w:tc>
-            </w:tr>
-          </w:tbl>
-          <w:p>
-            <w:pPr>
-              <w:keepNext/>
-              <w:spacing w:before="100" w:after="100"/>
-              <w:jc w:val="center"/>
-            </w:pPr>
-            <w:r>
-              <w:rPr>
-                <w:color w:val="475569"/>
-                <w:sz w:val="18"/>
-              </w:rPr>
-              <w:t>Chụp: 16:53:09 · 25/10/2026 (UTC+7)</w:t>
-            </w:r>
-          </w:p>
-          <w:p>
-            <w:pPr>
-              <w:keepNext/>
-              <w:spacing w:before="60"/>
-            </w:pPr>
-            <w:r>
-              <w:rPr>
-                <w:b/>
-                <w:sz w:val="20"/>
-              </w:rPr>
-              <w:t xml:space="preserve">Kết quả: </w:t>
-            </w:r>
-            <w:r>
-              <w:rPr>
-                <w:sz w:val="20"/>
-              </w:rPr>
-              <w:t>Nhập aris: danh sách được lọc, chỉ còn Vsmart Aris Pro.</w:t>
-            </w:r>
-          </w:p>
-        </w:tc>
-      </w:tr>
-    </w:tbl>
+      </w:pPr>
+      <w:r>
+        <w:drawing>
+          <wp:inline xmlns:a="http://schemas.openxmlformats.org/drawingml/2006/main" xmlns:pic="http://schemas.openxmlformats.org/drawingml/2006/picture">
+            <wp:extent cx="8460000" cy="4758750"/>
+            <wp:docPr id="6" name="Picture 6"/>
+            <wp:cNvGraphicFramePr>
+              <a:graphicFrameLocks noChangeAspect="1"/>
+            </wp:cNvGraphicFramePr>
+            <a:graphic>
+              <a:graphicData uri="http://schemas.openxmlformats.org/drawingml/2006/picture">
+                <pic:pic>
+                  <pic:nvPicPr>
+                    <pic:cNvPr id="0" name="image6.png"/>
+                    <pic:cNvPicPr/>
+                  </pic:nvPicPr>
+                  <pic:blipFill>
+                    <a:blip r:embed="rId17"/>
+                    <a:stretch>
+                      <a:fillRect/>
+                    </a:stretch>
+                  </pic:blipFill>
+                  <pic:spPr>
+                    <a:xfrm>
+                      <a:off x="0" y="0"/>
+                      <a:ext cx="8460000" cy="4758750"/>
+                    </a:xfrm>
+                    <a:prstGeom prst="rect"/>
+                  </pic:spPr>
+                </pic:pic>
+              </a:graphicData>
+            </a:graphic>
+          </wp:inline>
+        </w:drawing>
+      </w:r>
+    </w:p>
+    <w:p>
+      <w:pPr>
+        <w:keepNext/>
+        <w:spacing w:after="100"/>
+        <w:jc w:val="center"/>
+      </w:pPr>
+      <w:r>
+        <w:rPr>
+          <w:i/>
+          <w:sz w:val="20"/>
+        </w:rPr>
+        <w:t>Hình 6. Danh sách sản phẩm trong tab Trang chủ.</w:t>
+      </w:r>
+    </w:p>
+    <w:p>
+      <w:pPr>
+        <w:spacing w:after="0"/>
+      </w:pPr>
+      <w:r>
+        <w:rPr>
+          <w:b/>
+          <w:sz w:val="20"/>
+        </w:rPr>
+        <w:t xml:space="preserve">Nhận xét: </w:t>
+      </w:r>
+      <w:r>
+        <w:rPr>
+          <w:sz w:val="20"/>
+        </w:rPr>
+        <w:t>Trang chủ hiển thị danh sách các mẫu Vsmart Joy 3, Live 4, Star 5, Active 3, Aris Pro và Bee 3. Thanh điều hướng dưới cùng có ba mục Trang chủ, Tìm kiếm và Cá nhân; tab hiện tại được tô đỏ.</w:t>
+      </w:r>
+    </w:p>
     <w:p>
       <w:r>
         <w:br w:type="page"/>
@@ -1961,278 +1077,100 @@
     </w:p>
     <w:p>
       <w:pPr>
-        <w:spacing w:after="280"/>
+        <w:spacing w:after="80"/>
       </w:pPr>
       <w:r>
-        <w:t>Minh chứng 2/2 — Kết quả rỗng và hồ sơ</w:t>
+        <w:rPr>
+          <w:b/>
+          <w:sz w:val="24"/>
+        </w:rPr>
+        <w:t>3.2. Tab Cá nhân</w:t>
       </w:r>
     </w:p>
-    <w:tbl>
-      <w:tblPr>
-        <w:tblW w:type="auto" w:w="0"/>
+    <w:p>
+      <w:pPr>
+        <w:spacing w:after="100"/>
+      </w:pPr>
+      <w:r>
+        <w:rPr>
+          <w:sz w:val="20"/>
+        </w:rPr>
+        <w:t>Nội dung minh chứng: chuyển sang tab Profile để hiển thị thông tin người dùng.</w:t>
+      </w:r>
+    </w:p>
+    <w:p>
+      <w:pPr>
+        <w:keepNext/>
+        <w:spacing w:after="80" w:line="240" w:lineRule="auto"/>
         <w:jc w:val="center"/>
-        <w:tblLayout w:type="fixed"/>
-        <w:tblLook w:firstColumn="1" w:firstRow="1" w:lastColumn="0" w:lastRow="0" w:noHBand="0" w:noVBand="1" w:val="04A0"/>
-      </w:tblPr>
-      <w:tblGrid>
-        <w:gridCol w:w="4592"/>
-        <w:gridCol w:w="340"/>
-        <w:gridCol w:w="4592"/>
-      </w:tblGrid>
-      <w:tr>
-        <w:trPr>
-          <w:cantSplit/>
-        </w:trPr>
-        <w:tc>
-          <w:tcPr>
-            <w:tcW w:type="dxa" w:w="4592"/>
-            <w:vAlign w:val="top"/>
-          </w:tcPr>
-          <w:p>
-            <w:pPr>
-              <w:keepNext/>
-              <w:spacing w:after="120"/>
-            </w:pPr>
-            <w:r>
-              <w:rPr>
-                <w:b/>
-                <w:sz w:val="24"/>
-              </w:rPr>
-              <w:t>Ảnh 3.3. Tìm kiếm “zzz”</w:t>
-            </w:r>
-          </w:p>
-          <w:tbl>
-            <w:tblPr>
-              <w:tblW w:type="auto" w:w="0"/>
-              <w:tblLayout w:type="fixed"/>
-              <w:tblLook w:firstColumn="1" w:firstRow="1" w:lastColumn="0" w:lastRow="0" w:noHBand="0" w:noVBand="1" w:val="04A0"/>
-            </w:tblPr>
-            <w:tblGrid>
-              <w:gridCol w:w="4365"/>
-            </w:tblGrid>
-            <w:tr>
-              <w:trPr>
-                <w:trHeight w:val="7937" w:hRule="exact"/>
-              </w:trPr>
-              <w:tc>
-                <w:tcPr>
-                  <w:tcW w:type="dxa" w:w="4592"/>
-                  <w:vAlign w:val="center"/>
-                  <w:shd w:fill="FFFFFF"/>
-                  <w:tcBorders>
-                    <w:top w:val="dashed" w:sz="6" w:color="94A3B8"/>
-                    <w:left w:val="dashed" w:sz="6" w:color="94A3B8"/>
-                    <w:bottom w:val="dashed" w:sz="6" w:color="94A3B8"/>
-                    <w:right w:val="dashed" w:sz="6" w:color="94A3B8"/>
-                  </w:tcBorders>
-                </w:tcPr>
-                <w:p>
-                  <w:pPr>
-                    <w:spacing w:before="0" w:after="0" w:line="240" w:lineRule="auto"/>
-                    <w:jc w:val="center"/>
-                  </w:pPr>
-                  <w:r/>
-                  <w:r>
-                    <w:drawing>
-                      <wp:inline xmlns:a="http://schemas.openxmlformats.org/drawingml/2006/main" xmlns:pic="http://schemas.openxmlformats.org/drawingml/2006/picture">
-                        <wp:extent cx="2195829" cy="4752000"/>
-                        <wp:docPr id="13" name="Picture 13"/>
-                        <wp:cNvGraphicFramePr>
-                          <a:graphicFrameLocks noChangeAspect="1"/>
-                        </wp:cNvGraphicFramePr>
-                        <a:graphic>
-                          <a:graphicData uri="http://schemas.openxmlformats.org/drawingml/2006/picture">
-                            <pic:pic>
-                              <pic:nvPicPr>
-                                <pic:cNvPr id="0" name="3.3-search-empty.png"/>
-                                <pic:cNvPicPr/>
-                              </pic:nvPicPr>
-                              <pic:blipFill>
-                                <a:blip r:embed="rId22"/>
-                                <a:stretch>
-                                  <a:fillRect/>
-                                </a:stretch>
-                              </pic:blipFill>
-                              <pic:spPr>
-                                <a:xfrm>
-                                  <a:off x="0" y="0"/>
-                                  <a:ext cx="2195829" cy="4752000"/>
-                                </a:xfrm>
-                                <a:prstGeom prst="rect"/>
-                              </pic:spPr>
-                            </pic:pic>
-                          </a:graphicData>
-                        </a:graphic>
-                      </wp:inline>
-                    </w:drawing>
-                  </w:r>
-                </w:p>
-              </w:tc>
-            </w:tr>
-          </w:tbl>
-          <w:p>
-            <w:pPr>
-              <w:keepNext/>
-              <w:spacing w:before="100" w:after="100"/>
-              <w:jc w:val="center"/>
-            </w:pPr>
-            <w:r>
-              <w:rPr>
-                <w:color w:val="475569"/>
-                <w:sz w:val="18"/>
-              </w:rPr>
-              <w:t>Chụp: 16:53:10 · 25/10/2026 (UTC+7)</w:t>
-            </w:r>
-          </w:p>
-          <w:p>
-            <w:pPr>
-              <w:keepNext/>
-              <w:spacing w:before="60"/>
-            </w:pPr>
-            <w:r>
-              <w:rPr>
-                <w:b/>
-                <w:sz w:val="20"/>
-              </w:rPr>
-              <w:t xml:space="preserve">Kết quả: </w:t>
-            </w:r>
-            <w:r>
-              <w:rPr>
-                <w:sz w:val="20"/>
-              </w:rPr>
-              <w:t>Nhập zzz: xuất hiện thông báo không có kết quả.</w:t>
-            </w:r>
-          </w:p>
-        </w:tc>
-        <w:tc>
-          <w:tcPr>
-            <w:tcW w:type="dxa" w:w="340"/>
-          </w:tcPr>
-          <w:p/>
-        </w:tc>
-        <w:tc>
-          <w:tcPr>
-            <w:tcW w:type="dxa" w:w="4592"/>
-            <w:vAlign w:val="top"/>
-          </w:tcPr>
-          <w:p>
-            <w:pPr>
-              <w:keepNext/>
-              <w:spacing w:after="120"/>
-            </w:pPr>
-            <w:r>
-              <w:rPr>
-                <w:b/>
-                <w:sz w:val="24"/>
-              </w:rPr>
-              <w:t>Ảnh 3.4. Tab Cá nhân</w:t>
-            </w:r>
-          </w:p>
-          <w:tbl>
-            <w:tblPr>
-              <w:tblW w:type="auto" w:w="0"/>
-              <w:tblLayout w:type="fixed"/>
-              <w:tblLook w:firstColumn="1" w:firstRow="1" w:lastColumn="0" w:lastRow="0" w:noHBand="0" w:noVBand="1" w:val="04A0"/>
-            </w:tblPr>
-            <w:tblGrid>
-              <w:gridCol w:w="4365"/>
-            </w:tblGrid>
-            <w:tr>
-              <w:trPr>
-                <w:trHeight w:val="7937" w:hRule="exact"/>
-              </w:trPr>
-              <w:tc>
-                <w:tcPr>
-                  <w:tcW w:type="dxa" w:w="4592"/>
-                  <w:vAlign w:val="center"/>
-                  <w:shd w:fill="FFFFFF"/>
-                  <w:tcBorders>
-                    <w:top w:val="dashed" w:sz="6" w:color="94A3B8"/>
-                    <w:left w:val="dashed" w:sz="6" w:color="94A3B8"/>
-                    <w:bottom w:val="dashed" w:sz="6" w:color="94A3B8"/>
-                    <w:right w:val="dashed" w:sz="6" w:color="94A3B8"/>
-                  </w:tcBorders>
-                </w:tcPr>
-                <w:p>
-                  <w:pPr>
-                    <w:spacing w:before="0" w:after="0" w:line="240" w:lineRule="auto"/>
-                    <w:jc w:val="center"/>
-                  </w:pPr>
-                  <w:r/>
-                  <w:r>
-                    <w:drawing>
-                      <wp:inline xmlns:a="http://schemas.openxmlformats.org/drawingml/2006/main" xmlns:pic="http://schemas.openxmlformats.org/drawingml/2006/picture">
-                        <wp:extent cx="2195829" cy="4752000"/>
-                        <wp:docPr id="14" name="Picture 14"/>
-                        <wp:cNvGraphicFramePr>
-                          <a:graphicFrameLocks noChangeAspect="1"/>
-                        </wp:cNvGraphicFramePr>
-                        <a:graphic>
-                          <a:graphicData uri="http://schemas.openxmlformats.org/drawingml/2006/picture">
-                            <pic:pic>
-                              <pic:nvPicPr>
-                                <pic:cNvPr id="0" name="3.4-profile.png"/>
-                                <pic:cNvPicPr/>
-                              </pic:nvPicPr>
-                              <pic:blipFill>
-                                <a:blip r:embed="rId23"/>
-                                <a:stretch>
-                                  <a:fillRect/>
-                                </a:stretch>
-                              </pic:blipFill>
-                              <pic:spPr>
-                                <a:xfrm>
-                                  <a:off x="0" y="0"/>
-                                  <a:ext cx="2195829" cy="4752000"/>
-                                </a:xfrm>
-                                <a:prstGeom prst="rect"/>
-                              </pic:spPr>
-                            </pic:pic>
-                          </a:graphicData>
-                        </a:graphic>
-                      </wp:inline>
-                    </w:drawing>
-                  </w:r>
-                </w:p>
-              </w:tc>
-            </w:tr>
-          </w:tbl>
-          <w:p>
-            <w:pPr>
-              <w:keepNext/>
-              <w:spacing w:before="100" w:after="100"/>
-              <w:jc w:val="center"/>
-            </w:pPr>
-            <w:r>
-              <w:rPr>
-                <w:color w:val="475569"/>
-                <w:sz w:val="18"/>
-              </w:rPr>
-              <w:t>Chụp: 16:53:10 · 25/10/2026 (UTC+7)</w:t>
-            </w:r>
-          </w:p>
-          <w:p>
-            <w:pPr>
-              <w:keepNext/>
-              <w:spacing w:before="60"/>
-            </w:pPr>
-            <w:r>
-              <w:rPr>
-                <w:b/>
-                <w:sz w:val="20"/>
-              </w:rPr>
-              <w:t xml:space="preserve">Kết quả: </w:t>
-            </w:r>
-            <w:r>
-              <w:rPr>
-                <w:sz w:val="20"/>
-              </w:rPr>
-              <w:t>Tab Cá nhân hiển thị avatar HT, tên Huỳnh Hoài Thanh và email.</w:t>
-            </w:r>
-          </w:p>
-        </w:tc>
-      </w:tr>
-    </w:tbl>
+      </w:pPr>
+      <w:r>
+        <w:drawing>
+          <wp:inline xmlns:a="http://schemas.openxmlformats.org/drawingml/2006/main" xmlns:pic="http://schemas.openxmlformats.org/drawingml/2006/picture">
+            <wp:extent cx="8460000" cy="4758750"/>
+            <wp:docPr id="7" name="Picture 7"/>
+            <wp:cNvGraphicFramePr>
+              <a:graphicFrameLocks noChangeAspect="1"/>
+            </wp:cNvGraphicFramePr>
+            <a:graphic>
+              <a:graphicData uri="http://schemas.openxmlformats.org/drawingml/2006/picture">
+                <pic:pic>
+                  <pic:nvPicPr>
+                    <pic:cNvPr id="0" name="image7.png"/>
+                    <pic:cNvPicPr/>
+                  </pic:nvPicPr>
+                  <pic:blipFill>
+                    <a:blip r:embed="rId18"/>
+                    <a:stretch>
+                      <a:fillRect/>
+                    </a:stretch>
+                  </pic:blipFill>
+                  <pic:spPr>
+                    <a:xfrm>
+                      <a:off x="0" y="0"/>
+                      <a:ext cx="8460000" cy="4758750"/>
+                    </a:xfrm>
+                    <a:prstGeom prst="rect"/>
+                  </pic:spPr>
+                </pic:pic>
+              </a:graphicData>
+            </a:graphic>
+          </wp:inline>
+        </w:drawing>
+      </w:r>
+    </w:p>
+    <w:p>
+      <w:pPr>
+        <w:keepNext/>
+        <w:spacing w:after="100"/>
+        <w:jc w:val="center"/>
+      </w:pPr>
+      <w:r>
+        <w:rPr>
+          <w:i/>
+          <w:sz w:val="20"/>
+        </w:rPr>
+        <w:t>Hình 7. Giao diện tab Cá nhân.</w:t>
+      </w:r>
+    </w:p>
+    <w:p>
+      <w:pPr>
+        <w:spacing w:after="0"/>
+      </w:pPr>
+      <w:r>
+        <w:rPr>
+          <w:b/>
+          <w:sz w:val="20"/>
+        </w:rPr>
+        <w:t xml:space="preserve">Nhận xét: </w:t>
+      </w:r>
+      <w:r>
+        <w:rPr>
+          <w:sz w:val="20"/>
+        </w:rPr>
+        <w:t>Tab Cá nhân hiển thị avatar tròn có chữ HT, tên Huỳnh Hoài Thanh và địa chỉ email. Icon cùng nhãn Cá nhân được tô đỏ để thể hiện tab đang chọn.</w:t>
+      </w:r>
+    </w:p>
     <w:p>
       <w:r>
         <w:br w:type="page"/>
@@ -2248,278 +1186,100 @@
     </w:p>
     <w:p>
       <w:pPr>
-        <w:spacing w:after="280"/>
+        <w:spacing w:after="80"/>
       </w:pPr>
       <w:r>
-        <w:t>Minh chứng 1/2 — Danh sách và truyền id</w:t>
+        <w:rPr>
+          <w:b/>
+          <w:sz w:val="24"/>
+        </w:rPr>
+        <w:t>4.1. Tab Products trong màn Home</w:t>
       </w:r>
     </w:p>
-    <w:tbl>
-      <w:tblPr>
-        <w:tblW w:type="auto" w:w="0"/>
+    <w:p>
+      <w:pPr>
+        <w:spacing w:after="100"/>
+      </w:pPr>
+      <w:r>
+        <w:rPr>
+          <w:sz w:val="20"/>
+        </w:rPr>
+        <w:t>Yêu cầu: Stack chính chứa Home với hai tab Products/Favorites và màn ProductDetails; mở chi tiết bằng tham số id.</w:t>
+      </w:r>
+    </w:p>
+    <w:p>
+      <w:pPr>
+        <w:keepNext/>
+        <w:spacing w:after="80" w:line="240" w:lineRule="auto"/>
         <w:jc w:val="center"/>
-        <w:tblLayout w:type="fixed"/>
-        <w:tblLook w:firstColumn="1" w:firstRow="1" w:lastColumn="0" w:lastRow="0" w:noHBand="0" w:noVBand="1" w:val="04A0"/>
-      </w:tblPr>
-      <w:tblGrid>
-        <w:gridCol w:w="4592"/>
-        <w:gridCol w:w="340"/>
-        <w:gridCol w:w="4592"/>
-      </w:tblGrid>
-      <w:tr>
-        <w:trPr>
-          <w:cantSplit/>
-        </w:trPr>
-        <w:tc>
-          <w:tcPr>
-            <w:tcW w:type="dxa" w:w="4592"/>
-            <w:vAlign w:val="top"/>
-          </w:tcPr>
-          <w:p>
-            <w:pPr>
-              <w:keepNext/>
-              <w:spacing w:after="120"/>
-            </w:pPr>
-            <w:r>
-              <w:rPr>
-                <w:b/>
-                <w:sz w:val="24"/>
-              </w:rPr>
-              <w:t>Ảnh 4.1. Home — tab Products</w:t>
-            </w:r>
-          </w:p>
-          <w:tbl>
-            <w:tblPr>
-              <w:tblW w:type="auto" w:w="0"/>
-              <w:tblLayout w:type="fixed"/>
-              <w:tblLook w:firstColumn="1" w:firstRow="1" w:lastColumn="0" w:lastRow="0" w:noHBand="0" w:noVBand="1" w:val="04A0"/>
-            </w:tblPr>
-            <w:tblGrid>
-              <w:gridCol w:w="4365"/>
-            </w:tblGrid>
-            <w:tr>
-              <w:trPr>
-                <w:trHeight w:val="7937" w:hRule="exact"/>
-              </w:trPr>
-              <w:tc>
-                <w:tcPr>
-                  <w:tcW w:type="dxa" w:w="4592"/>
-                  <w:vAlign w:val="center"/>
-                  <w:shd w:fill="FFFFFF"/>
-                  <w:tcBorders>
-                    <w:top w:val="dashed" w:sz="6" w:color="94A3B8"/>
-                    <w:left w:val="dashed" w:sz="6" w:color="94A3B8"/>
-                    <w:bottom w:val="dashed" w:sz="6" w:color="94A3B8"/>
-                    <w:right w:val="dashed" w:sz="6" w:color="94A3B8"/>
-                  </w:tcBorders>
-                </w:tcPr>
-                <w:p>
-                  <w:pPr>
-                    <w:spacing w:before="0" w:after="0" w:line="240" w:lineRule="auto"/>
-                    <w:jc w:val="center"/>
-                  </w:pPr>
-                  <w:r/>
-                  <w:r>
-                    <w:drawing>
-                      <wp:inline xmlns:a="http://schemas.openxmlformats.org/drawingml/2006/main" xmlns:pic="http://schemas.openxmlformats.org/drawingml/2006/picture">
-                        <wp:extent cx="2195829" cy="4752000"/>
-                        <wp:docPr id="15" name="Picture 15"/>
-                        <wp:cNvGraphicFramePr>
-                          <a:graphicFrameLocks noChangeAspect="1"/>
-                        </wp:cNvGraphicFramePr>
-                        <a:graphic>
-                          <a:graphicData uri="http://schemas.openxmlformats.org/drawingml/2006/picture">
-                            <pic:pic>
-                              <pic:nvPicPr>
-                                <pic:cNvPr id="0" name="4.1-products.png"/>
-                                <pic:cNvPicPr/>
-                              </pic:nvPicPr>
-                              <pic:blipFill>
-                                <a:blip r:embed="rId24"/>
-                                <a:stretch>
-                                  <a:fillRect/>
-                                </a:stretch>
-                              </pic:blipFill>
-                              <pic:spPr>
-                                <a:xfrm>
-                                  <a:off x="0" y="0"/>
-                                  <a:ext cx="2195829" cy="4752000"/>
-                                </a:xfrm>
-                                <a:prstGeom prst="rect"/>
-                              </pic:spPr>
-                            </pic:pic>
-                          </a:graphicData>
-                        </a:graphic>
-                      </wp:inline>
-                    </w:drawing>
-                  </w:r>
-                </w:p>
-              </w:tc>
-            </w:tr>
-          </w:tbl>
-          <w:p>
-            <w:pPr>
-              <w:keepNext/>
-              <w:spacing w:before="100" w:after="100"/>
-              <w:jc w:val="center"/>
-            </w:pPr>
-            <w:r>
-              <w:rPr>
-                <w:color w:val="475569"/>
-                <w:sz w:val="18"/>
-              </w:rPr>
-              <w:t>Chụp: 16:53:11 · 25/10/2026 (UTC+7)</w:t>
-            </w:r>
-          </w:p>
-          <w:p>
-            <w:pPr>
-              <w:keepNext/>
-              <w:spacing w:before="60"/>
-            </w:pPr>
-            <w:r>
-              <w:rPr>
-                <w:b/>
-                <w:sz w:val="20"/>
-              </w:rPr>
-              <w:t xml:space="preserve">Kết quả: </w:t>
-            </w:r>
-            <w:r>
-              <w:rPr>
-                <w:sz w:val="20"/>
-              </w:rPr>
-              <w:t>Home chứa hai tab Products/Favorites; Products hiển thị danh sách sản phẩm.</w:t>
-            </w:r>
-          </w:p>
-        </w:tc>
-        <w:tc>
-          <w:tcPr>
-            <w:tcW w:type="dxa" w:w="340"/>
-          </w:tcPr>
-          <w:p/>
-        </w:tc>
-        <w:tc>
-          <w:tcPr>
-            <w:tcW w:type="dxa" w:w="4592"/>
-            <w:vAlign w:val="top"/>
-          </w:tcPr>
-          <w:p>
-            <w:pPr>
-              <w:keepNext/>
-              <w:spacing w:after="120"/>
-            </w:pPr>
-            <w:r>
-              <w:rPr>
-                <w:b/>
-                <w:sz w:val="24"/>
-              </w:rPr>
-              <w:t>Ảnh 4.2. Chi tiết Live 4 — id = 2</w:t>
-            </w:r>
-          </w:p>
-          <w:tbl>
-            <w:tblPr>
-              <w:tblW w:type="auto" w:w="0"/>
-              <w:tblLayout w:type="fixed"/>
-              <w:tblLook w:firstColumn="1" w:firstRow="1" w:lastColumn="0" w:lastRow="0" w:noHBand="0" w:noVBand="1" w:val="04A0"/>
-            </w:tblPr>
-            <w:tblGrid>
-              <w:gridCol w:w="4365"/>
-            </w:tblGrid>
-            <w:tr>
-              <w:trPr>
-                <w:trHeight w:val="7937" w:hRule="exact"/>
-              </w:trPr>
-              <w:tc>
-                <w:tcPr>
-                  <w:tcW w:type="dxa" w:w="4592"/>
-                  <w:vAlign w:val="center"/>
-                  <w:shd w:fill="FFFFFF"/>
-                  <w:tcBorders>
-                    <w:top w:val="dashed" w:sz="6" w:color="94A3B8"/>
-                    <w:left w:val="dashed" w:sz="6" w:color="94A3B8"/>
-                    <w:bottom w:val="dashed" w:sz="6" w:color="94A3B8"/>
-                    <w:right w:val="dashed" w:sz="6" w:color="94A3B8"/>
-                  </w:tcBorders>
-                </w:tcPr>
-                <w:p>
-                  <w:pPr>
-                    <w:spacing w:before="0" w:after="0" w:line="240" w:lineRule="auto"/>
-                    <w:jc w:val="center"/>
-                  </w:pPr>
-                  <w:r/>
-                  <w:r>
-                    <w:drawing>
-                      <wp:inline xmlns:a="http://schemas.openxmlformats.org/drawingml/2006/main" xmlns:pic="http://schemas.openxmlformats.org/drawingml/2006/picture">
-                        <wp:extent cx="2195829" cy="4752000"/>
-                        <wp:docPr id="16" name="Picture 16"/>
-                        <wp:cNvGraphicFramePr>
-                          <a:graphicFrameLocks noChangeAspect="1"/>
-                        </wp:cNvGraphicFramePr>
-                        <a:graphic>
-                          <a:graphicData uri="http://schemas.openxmlformats.org/drawingml/2006/picture">
-                            <pic:pic>
-                              <pic:nvPicPr>
-                                <pic:cNvPr id="0" name="4.2-live4-details-saved.png"/>
-                                <pic:cNvPicPr/>
-                              </pic:nvPicPr>
-                              <pic:blipFill>
-                                <a:blip r:embed="rId25"/>
-                                <a:stretch>
-                                  <a:fillRect/>
-                                </a:stretch>
-                              </pic:blipFill>
-                              <pic:spPr>
-                                <a:xfrm>
-                                  <a:off x="0" y="0"/>
-                                  <a:ext cx="2195829" cy="4752000"/>
-                                </a:xfrm>
-                                <a:prstGeom prst="rect"/>
-                              </pic:spPr>
-                            </pic:pic>
-                          </a:graphicData>
-                        </a:graphic>
-                      </wp:inline>
-                    </w:drawing>
-                  </w:r>
-                </w:p>
-              </w:tc>
-            </w:tr>
-          </w:tbl>
-          <w:p>
-            <w:pPr>
-              <w:keepNext/>
-              <w:spacing w:before="100" w:after="100"/>
-              <w:jc w:val="center"/>
-            </w:pPr>
-            <w:r>
-              <w:rPr>
-                <w:color w:val="475569"/>
-                <w:sz w:val="18"/>
-              </w:rPr>
-              <w:t>Chụp: 16:53:12 · 25/10/2026 (UTC+7)</w:t>
-            </w:r>
-          </w:p>
-          <w:p>
-            <w:pPr>
-              <w:keepNext/>
-              <w:spacing w:before="60"/>
-            </w:pPr>
-            <w:r>
-              <w:rPr>
-                <w:b/>
-                <w:sz w:val="20"/>
-              </w:rPr>
-              <w:t xml:space="preserve">Kết quả: </w:t>
-            </w:r>
-            <w:r>
-              <w:rPr>
-                <w:sz w:val="20"/>
-              </w:rPr>
-              <w:t>Mở Live 4 qua id = 2: giá 3.990.000 đ, đúng tên/ảnh/sao/nhà cung cấp. Sau khi lưu, nút hiển thị Đã lưu.</w:t>
-            </w:r>
-          </w:p>
-        </w:tc>
-      </w:tr>
-    </w:tbl>
+      </w:pPr>
+      <w:r>
+        <w:drawing>
+          <wp:inline xmlns:a="http://schemas.openxmlformats.org/drawingml/2006/main" xmlns:pic="http://schemas.openxmlformats.org/drawingml/2006/picture">
+            <wp:extent cx="8460000" cy="4758750"/>
+            <wp:docPr id="8" name="Picture 8"/>
+            <wp:cNvGraphicFramePr>
+              <a:graphicFrameLocks noChangeAspect="1"/>
+            </wp:cNvGraphicFramePr>
+            <a:graphic>
+              <a:graphicData uri="http://schemas.openxmlformats.org/drawingml/2006/picture">
+                <pic:pic>
+                  <pic:nvPicPr>
+                    <pic:cNvPr id="0" name="image8.png"/>
+                    <pic:cNvPicPr/>
+                  </pic:nvPicPr>
+                  <pic:blipFill>
+                    <a:blip r:embed="rId19"/>
+                    <a:stretch>
+                      <a:fillRect/>
+                    </a:stretch>
+                  </pic:blipFill>
+                  <pic:spPr>
+                    <a:xfrm>
+                      <a:off x="0" y="0"/>
+                      <a:ext cx="8460000" cy="4758750"/>
+                    </a:xfrm>
+                    <a:prstGeom prst="rect"/>
+                  </pic:spPr>
+                </pic:pic>
+              </a:graphicData>
+            </a:graphic>
+          </wp:inline>
+        </w:drawing>
+      </w:r>
+    </w:p>
+    <w:p>
+      <w:pPr>
+        <w:keepNext/>
+        <w:spacing w:after="100"/>
+        <w:jc w:val="center"/>
+      </w:pPr>
+      <w:r>
+        <w:rPr>
+          <w:i/>
+          <w:sz w:val="20"/>
+        </w:rPr>
+        <w:t>Hình 8. Danh sách sản phẩm trong tab Products.</w:t>
+      </w:r>
+    </w:p>
+    <w:p>
+      <w:pPr>
+        <w:spacing w:after="0"/>
+      </w:pPr>
+      <w:r>
+        <w:rPr>
+          <w:b/>
+          <w:sz w:val="20"/>
+        </w:rPr>
+        <w:t xml:space="preserve">Nhận xét: </w:t>
+      </w:r>
+      <w:r>
+        <w:rPr>
+          <w:sz w:val="20"/>
+        </w:rPr>
+        <w:t>Màn Cửa hàng hiển thị các dòng sản phẩm có ảnh, tên, giá và ký hiệu chuyển tiếp. Hai tab Products và Favorites nằm ở cuối màn hình; Products đang được chọn.</w:t>
+      </w:r>
+    </w:p>
     <w:p>
       <w:r>
         <w:br w:type="page"/>
@@ -2535,278 +1295,100 @@
     </w:p>
     <w:p>
       <w:pPr>
-        <w:spacing w:after="280"/>
+        <w:spacing w:after="80"/>
       </w:pPr>
       <w:r>
-        <w:t>Minh chứng 2/2 — Lưu và bỏ yêu thích</w:t>
+        <w:rPr>
+          <w:b/>
+          <w:sz w:val="24"/>
+        </w:rPr>
+        <w:t>4.2. Danh sách sản phẩm yêu thích</w:t>
       </w:r>
     </w:p>
-    <w:tbl>
-      <w:tblPr>
-        <w:tblW w:type="auto" w:w="0"/>
+    <w:p>
+      <w:pPr>
+        <w:spacing w:after="100"/>
+      </w:pPr>
+      <w:r>
+        <w:rPr>
+          <w:sz w:val="20"/>
+        </w:rPr>
+        <w:t>Nội dung minh chứng: hiển thị các sản phẩm đã được lưu trong tab Favorites.</w:t>
+      </w:r>
+    </w:p>
+    <w:p>
+      <w:pPr>
+        <w:keepNext/>
+        <w:spacing w:after="80" w:line="240" w:lineRule="auto"/>
         <w:jc w:val="center"/>
-        <w:tblLayout w:type="fixed"/>
-        <w:tblLook w:firstColumn="1" w:firstRow="1" w:lastColumn="0" w:lastRow="0" w:noHBand="0" w:noVBand="1" w:val="04A0"/>
-      </w:tblPr>
-      <w:tblGrid>
-        <w:gridCol w:w="4592"/>
-        <w:gridCol w:w="340"/>
-        <w:gridCol w:w="4592"/>
-      </w:tblGrid>
-      <w:tr>
-        <w:trPr>
-          <w:cantSplit/>
-        </w:trPr>
-        <w:tc>
-          <w:tcPr>
-            <w:tcW w:type="dxa" w:w="4592"/>
-            <w:vAlign w:val="top"/>
-          </w:tcPr>
-          <w:p>
-            <w:pPr>
-              <w:keepNext/>
-              <w:spacing w:after="120"/>
-            </w:pPr>
-            <w:r>
-              <w:rPr>
-                <w:b/>
-                <w:sz w:val="24"/>
-              </w:rPr>
-              <w:t>Ảnh 4.3. Favorites — đã lưu sản phẩm</w:t>
-            </w:r>
-          </w:p>
-          <w:tbl>
-            <w:tblPr>
-              <w:tblW w:type="auto" w:w="0"/>
-              <w:tblLayout w:type="fixed"/>
-              <w:tblLook w:firstColumn="1" w:firstRow="1" w:lastColumn="0" w:lastRow="0" w:noHBand="0" w:noVBand="1" w:val="04A0"/>
-            </w:tblPr>
-            <w:tblGrid>
-              <w:gridCol w:w="4365"/>
-            </w:tblGrid>
-            <w:tr>
-              <w:trPr>
-                <w:trHeight w:val="7937" w:hRule="exact"/>
-              </w:trPr>
-              <w:tc>
-                <w:tcPr>
-                  <w:tcW w:type="dxa" w:w="4592"/>
-                  <w:vAlign w:val="center"/>
-                  <w:shd w:fill="FFFFFF"/>
-                  <w:tcBorders>
-                    <w:top w:val="dashed" w:sz="6" w:color="94A3B8"/>
-                    <w:left w:val="dashed" w:sz="6" w:color="94A3B8"/>
-                    <w:bottom w:val="dashed" w:sz="6" w:color="94A3B8"/>
-                    <w:right w:val="dashed" w:sz="6" w:color="94A3B8"/>
-                  </w:tcBorders>
-                </w:tcPr>
-                <w:p>
-                  <w:pPr>
-                    <w:spacing w:before="0" w:after="0" w:line="240" w:lineRule="auto"/>
-                    <w:jc w:val="center"/>
-                  </w:pPr>
-                  <w:r/>
-                  <w:r>
-                    <w:drawing>
-                      <wp:inline xmlns:a="http://schemas.openxmlformats.org/drawingml/2006/main" xmlns:pic="http://schemas.openxmlformats.org/drawingml/2006/picture">
-                        <wp:extent cx="2195829" cy="4752000"/>
-                        <wp:docPr id="17" name="Picture 17"/>
-                        <wp:cNvGraphicFramePr>
-                          <a:graphicFrameLocks noChangeAspect="1"/>
-                        </wp:cNvGraphicFramePr>
-                        <a:graphic>
-                          <a:graphicData uri="http://schemas.openxmlformats.org/drawingml/2006/picture">
-                            <pic:pic>
-                              <pic:nvPicPr>
-                                <pic:cNvPr id="0" name="4.3-favorites-saved.png"/>
-                                <pic:cNvPicPr/>
-                              </pic:nvPicPr>
-                              <pic:blipFill>
-                                <a:blip r:embed="rId26"/>
-                                <a:stretch>
-                                  <a:fillRect/>
-                                </a:stretch>
-                              </pic:blipFill>
-                              <pic:spPr>
-                                <a:xfrm>
-                                  <a:off x="0" y="0"/>
-                                  <a:ext cx="2195829" cy="4752000"/>
-                                </a:xfrm>
-                                <a:prstGeom prst="rect"/>
-                              </pic:spPr>
-                            </pic:pic>
-                          </a:graphicData>
-                        </a:graphic>
-                      </wp:inline>
-                    </w:drawing>
-                  </w:r>
-                </w:p>
-              </w:tc>
-            </w:tr>
-          </w:tbl>
-          <w:p>
-            <w:pPr>
-              <w:keepNext/>
-              <w:spacing w:before="100" w:after="100"/>
-              <w:jc w:val="center"/>
-            </w:pPr>
-            <w:r>
-              <w:rPr>
-                <w:color w:val="475569"/>
-                <w:sz w:val="18"/>
-              </w:rPr>
-              <w:t>Chụp: 16:53:12 · 25/10/2026 (UTC+7)</w:t>
-            </w:r>
-          </w:p>
-          <w:p>
-            <w:pPr>
-              <w:keepNext/>
-              <w:spacing w:before="60"/>
-            </w:pPr>
-            <w:r>
-              <w:rPr>
-                <w:b/>
-                <w:sz w:val="20"/>
-              </w:rPr>
-              <w:t xml:space="preserve">Kết quả: </w:t>
-            </w:r>
-            <w:r>
-              <w:rPr>
-                <w:sz w:val="20"/>
-              </w:rPr>
-              <w:t>Sau khi quay lại Home và chọn Favorites: Live 4 đã lưu xuất hiện trong danh sách.</w:t>
-            </w:r>
-          </w:p>
-        </w:tc>
-        <w:tc>
-          <w:tcPr>
-            <w:tcW w:type="dxa" w:w="340"/>
-          </w:tcPr>
-          <w:p/>
-        </w:tc>
-        <w:tc>
-          <w:tcPr>
-            <w:tcW w:type="dxa" w:w="4592"/>
-            <w:vAlign w:val="top"/>
-          </w:tcPr>
-          <w:p>
-            <w:pPr>
-              <w:keepNext/>
-              <w:spacing w:after="120"/>
-            </w:pPr>
-            <w:r>
-              <w:rPr>
-                <w:b/>
-                <w:sz w:val="24"/>
-              </w:rPr>
-              <w:t>Ảnh 4.4. Favorites — sau khi bỏ lưu</w:t>
-            </w:r>
-          </w:p>
-          <w:tbl>
-            <w:tblPr>
-              <w:tblW w:type="auto" w:w="0"/>
-              <w:tblLayout w:type="fixed"/>
-              <w:tblLook w:firstColumn="1" w:firstRow="1" w:lastColumn="0" w:lastRow="0" w:noHBand="0" w:noVBand="1" w:val="04A0"/>
-            </w:tblPr>
-            <w:tblGrid>
-              <w:gridCol w:w="4365"/>
-            </w:tblGrid>
-            <w:tr>
-              <w:trPr>
-                <w:trHeight w:val="7937" w:hRule="exact"/>
-              </w:trPr>
-              <w:tc>
-                <w:tcPr>
-                  <w:tcW w:type="dxa" w:w="4592"/>
-                  <w:vAlign w:val="center"/>
-                  <w:shd w:fill="FFFFFF"/>
-                  <w:tcBorders>
-                    <w:top w:val="dashed" w:sz="6" w:color="94A3B8"/>
-                    <w:left w:val="dashed" w:sz="6" w:color="94A3B8"/>
-                    <w:bottom w:val="dashed" w:sz="6" w:color="94A3B8"/>
-                    <w:right w:val="dashed" w:sz="6" w:color="94A3B8"/>
-                  </w:tcBorders>
-                </w:tcPr>
-                <w:p>
-                  <w:pPr>
-                    <w:spacing w:before="0" w:after="0" w:line="240" w:lineRule="auto"/>
-                    <w:jc w:val="center"/>
-                  </w:pPr>
-                  <w:r/>
-                  <w:r>
-                    <w:drawing>
-                      <wp:inline xmlns:a="http://schemas.openxmlformats.org/drawingml/2006/main" xmlns:pic="http://schemas.openxmlformats.org/drawingml/2006/picture">
-                        <wp:extent cx="2195829" cy="4752000"/>
-                        <wp:docPr id="18" name="Picture 18"/>
-                        <wp:cNvGraphicFramePr>
-                          <a:graphicFrameLocks noChangeAspect="1"/>
-                        </wp:cNvGraphicFramePr>
-                        <a:graphic>
-                          <a:graphicData uri="http://schemas.openxmlformats.org/drawingml/2006/picture">
-                            <pic:pic>
-                              <pic:nvPicPr>
-                                <pic:cNvPr id="0" name="4.4-favorites-empty.png"/>
-                                <pic:cNvPicPr/>
-                              </pic:nvPicPr>
-                              <pic:blipFill>
-                                <a:blip r:embed="rId27"/>
-                                <a:stretch>
-                                  <a:fillRect/>
-                                </a:stretch>
-                              </pic:blipFill>
-                              <pic:spPr>
-                                <a:xfrm>
-                                  <a:off x="0" y="0"/>
-                                  <a:ext cx="2195829" cy="4752000"/>
-                                </a:xfrm>
-                                <a:prstGeom prst="rect"/>
-                              </pic:spPr>
-                            </pic:pic>
-                          </a:graphicData>
-                        </a:graphic>
-                      </wp:inline>
-                    </w:drawing>
-                  </w:r>
-                </w:p>
-              </w:tc>
-            </w:tr>
-          </w:tbl>
-          <w:p>
-            <w:pPr>
-              <w:keepNext/>
-              <w:spacing w:before="100" w:after="100"/>
-              <w:jc w:val="center"/>
-            </w:pPr>
-            <w:r>
-              <w:rPr>
-                <w:color w:val="475569"/>
-                <w:sz w:val="18"/>
-              </w:rPr>
-              <w:t>Chụp: 16:53:13 · 25/10/2026 (UTC+7)</w:t>
-            </w:r>
-          </w:p>
-          <w:p>
-            <w:pPr>
-              <w:keepNext/>
-              <w:spacing w:before="60"/>
-            </w:pPr>
-            <w:r>
-              <w:rPr>
-                <w:b/>
-                <w:sz w:val="20"/>
-              </w:rPr>
-              <w:t xml:space="preserve">Kết quả: </w:t>
-            </w:r>
-            <w:r>
-              <w:rPr>
-                <w:sz w:val="20"/>
-              </w:rPr>
-              <w:t>Mở lại chi tiết và bỏ lưu: Favorites trở về trạng thái Chưa có sản phẩm nào được lưu.</w:t>
-            </w:r>
-          </w:p>
-        </w:tc>
-      </w:tr>
-    </w:tbl>
+      </w:pPr>
+      <w:r>
+        <w:drawing>
+          <wp:inline xmlns:a="http://schemas.openxmlformats.org/drawingml/2006/main" xmlns:pic="http://schemas.openxmlformats.org/drawingml/2006/picture">
+            <wp:extent cx="8460000" cy="4758750"/>
+            <wp:docPr id="9" name="Picture 9"/>
+            <wp:cNvGraphicFramePr>
+              <a:graphicFrameLocks noChangeAspect="1"/>
+            </wp:cNvGraphicFramePr>
+            <a:graphic>
+              <a:graphicData uri="http://schemas.openxmlformats.org/drawingml/2006/picture">
+                <pic:pic>
+                  <pic:nvPicPr>
+                    <pic:cNvPr id="0" name="image9.png"/>
+                    <pic:cNvPicPr/>
+                  </pic:nvPicPr>
+                  <pic:blipFill>
+                    <a:blip r:embed="rId20"/>
+                    <a:stretch>
+                      <a:fillRect/>
+                    </a:stretch>
+                  </pic:blipFill>
+                  <pic:spPr>
+                    <a:xfrm>
+                      <a:off x="0" y="0"/>
+                      <a:ext cx="8460000" cy="4758750"/>
+                    </a:xfrm>
+                    <a:prstGeom prst="rect"/>
+                  </pic:spPr>
+                </pic:pic>
+              </a:graphicData>
+            </a:graphic>
+          </wp:inline>
+        </w:drawing>
+      </w:r>
+    </w:p>
+    <w:p>
+      <w:pPr>
+        <w:keepNext/>
+        <w:spacing w:after="100"/>
+        <w:jc w:val="center"/>
+      </w:pPr>
+      <w:r>
+        <w:rPr>
+          <w:i/>
+          <w:sz w:val="20"/>
+        </w:rPr>
+        <w:t>Hình 9. Sản phẩm Vsmart Aris Pro xuất hiện trong Favorites.</w:t>
+      </w:r>
+    </w:p>
+    <w:p>
+      <w:pPr>
+        <w:spacing w:after="0"/>
+      </w:pPr>
+      <w:r>
+        <w:rPr>
+          <w:b/>
+          <w:sz w:val="20"/>
+        </w:rPr>
+        <w:t xml:space="preserve">Nhận xét: </w:t>
+      </w:r>
+      <w:r>
+        <w:rPr>
+          <w:sz w:val="20"/>
+        </w:rPr>
+        <w:t>Tab Favorites đang được chọn và hiển thị Vsmart Aris Pro với giá 7.490.000 đ. Ảnh ghi nhận danh sách yêu thích có sản phẩm; màn chi tiết nhận id và thao tác bỏ lưu chưa xuất hiện trong bộ ảnh này.</w:t>
+      </w:r>
+    </w:p>
     <w:p>
       <w:r>
         <w:br w:type="page"/>
@@ -2822,278 +1404,100 @@
     </w:p>
     <w:p>
       <w:pPr>
-        <w:spacing w:after="280"/>
+        <w:spacing w:after="80"/>
       </w:pPr>
       <w:r>
-        <w:t>Minh chứng 1/2 — Menu và hồ sơ</w:t>
+        <w:rPr>
+          <w:b/>
+          <w:sz w:val="24"/>
+        </w:rPr>
+        <w:t>5.1. Màn Trang chủ</w:t>
       </w:r>
     </w:p>
-    <w:tbl>
-      <w:tblPr>
-        <w:tblW w:type="auto" w:w="0"/>
+    <w:p>
+      <w:pPr>
+        <w:spacing w:after="100"/>
+      </w:pPr>
+      <w:r>
+        <w:rPr>
+          <w:sz w:val="20"/>
+        </w:rPr>
+        <w:t>Yêu cầu: sử dụng Drawer với các màn Home, Profile và Settings; màn Settings có một đến hai tùy chọn bật/tắt.</w:t>
+      </w:r>
+    </w:p>
+    <w:p>
+      <w:pPr>
+        <w:keepNext/>
+        <w:spacing w:after="80" w:line="240" w:lineRule="auto"/>
         <w:jc w:val="center"/>
-        <w:tblLayout w:type="fixed"/>
-        <w:tblLook w:firstColumn="1" w:firstRow="1" w:lastColumn="0" w:lastRow="0" w:noHBand="0" w:noVBand="1" w:val="04A0"/>
-      </w:tblPr>
-      <w:tblGrid>
-        <w:gridCol w:w="4592"/>
-        <w:gridCol w:w="340"/>
-        <w:gridCol w:w="4592"/>
-      </w:tblGrid>
-      <w:tr>
-        <w:trPr>
-          <w:cantSplit/>
-        </w:trPr>
-        <w:tc>
-          <w:tcPr>
-            <w:tcW w:type="dxa" w:w="4592"/>
-            <w:vAlign w:val="top"/>
-          </w:tcPr>
-          <w:p>
-            <w:pPr>
-              <w:keepNext/>
-              <w:spacing w:after="120"/>
-            </w:pPr>
-            <w:r>
-              <w:rPr>
-                <w:b/>
-                <w:sz w:val="24"/>
-              </w:rPr>
-              <w:t>Ảnh 5.1. Drawer đang mở</w:t>
-            </w:r>
-          </w:p>
-          <w:tbl>
-            <w:tblPr>
-              <w:tblW w:type="auto" w:w="0"/>
-              <w:tblLayout w:type="fixed"/>
-              <w:tblLook w:firstColumn="1" w:firstRow="1" w:lastColumn="0" w:lastRow="0" w:noHBand="0" w:noVBand="1" w:val="04A0"/>
-            </w:tblPr>
-            <w:tblGrid>
-              <w:gridCol w:w="4365"/>
-            </w:tblGrid>
-            <w:tr>
-              <w:trPr>
-                <w:trHeight w:val="7937" w:hRule="exact"/>
-              </w:trPr>
-              <w:tc>
-                <w:tcPr>
-                  <w:tcW w:type="dxa" w:w="4592"/>
-                  <w:vAlign w:val="center"/>
-                  <w:shd w:fill="FFFFFF"/>
-                  <w:tcBorders>
-                    <w:top w:val="dashed" w:sz="6" w:color="94A3B8"/>
-                    <w:left w:val="dashed" w:sz="6" w:color="94A3B8"/>
-                    <w:bottom w:val="dashed" w:sz="6" w:color="94A3B8"/>
-                    <w:right w:val="dashed" w:sz="6" w:color="94A3B8"/>
-                  </w:tcBorders>
-                </w:tcPr>
-                <w:p>
-                  <w:pPr>
-                    <w:spacing w:before="0" w:after="0" w:line="240" w:lineRule="auto"/>
-                    <w:jc w:val="center"/>
-                  </w:pPr>
-                  <w:r/>
-                  <w:r>
-                    <w:drawing>
-                      <wp:inline xmlns:a="http://schemas.openxmlformats.org/drawingml/2006/main" xmlns:pic="http://schemas.openxmlformats.org/drawingml/2006/picture">
-                        <wp:extent cx="2195829" cy="4752000"/>
-                        <wp:docPr id="19" name="Picture 19"/>
-                        <wp:cNvGraphicFramePr>
-                          <a:graphicFrameLocks noChangeAspect="1"/>
-                        </wp:cNvGraphicFramePr>
-                        <a:graphic>
-                          <a:graphicData uri="http://schemas.openxmlformats.org/drawingml/2006/picture">
-                            <pic:pic>
-                              <pic:nvPicPr>
-                                <pic:cNvPr id="0" name="5.1-drawer.png"/>
-                                <pic:cNvPicPr/>
-                              </pic:nvPicPr>
-                              <pic:blipFill>
-                                <a:blip r:embed="rId28"/>
-                                <a:stretch>
-                                  <a:fillRect/>
-                                </a:stretch>
-                              </pic:blipFill>
-                              <pic:spPr>
-                                <a:xfrm>
-                                  <a:off x="0" y="0"/>
-                                  <a:ext cx="2195829" cy="4752000"/>
-                                </a:xfrm>
-                                <a:prstGeom prst="rect"/>
-                              </pic:spPr>
-                            </pic:pic>
-                          </a:graphicData>
-                        </a:graphic>
-                      </wp:inline>
-                    </w:drawing>
-                  </w:r>
-                </w:p>
-              </w:tc>
-            </w:tr>
-          </w:tbl>
-          <w:p>
-            <w:pPr>
-              <w:keepNext/>
-              <w:spacing w:before="100" w:after="100"/>
-              <w:jc w:val="center"/>
-            </w:pPr>
-            <w:r>
-              <w:rPr>
-                <w:color w:val="475569"/>
-                <w:sz w:val="18"/>
-              </w:rPr>
-              <w:t>Chụp: 16:53:14 · 25/10/2026 (UTC+7)</w:t>
-            </w:r>
-          </w:p>
-          <w:p>
-            <w:pPr>
-              <w:keepNext/>
-              <w:spacing w:before="60"/>
-            </w:pPr>
-            <w:r>
-              <w:rPr>
-                <w:b/>
-                <w:sz w:val="20"/>
-              </w:rPr>
-              <w:t xml:space="preserve">Kết quả: </w:t>
-            </w:r>
-            <w:r>
-              <w:rPr>
-                <w:sz w:val="20"/>
-              </w:rPr>
-              <w:t>Menu Drawer mở bằng nút trên header, có Trang chủ, Cá nhân và Cài đặt; mục hiện tại tô đỏ.</w:t>
-            </w:r>
-          </w:p>
-        </w:tc>
-        <w:tc>
-          <w:tcPr>
-            <w:tcW w:type="dxa" w:w="340"/>
-          </w:tcPr>
-          <w:p/>
-        </w:tc>
-        <w:tc>
-          <w:tcPr>
-            <w:tcW w:type="dxa" w:w="4592"/>
-            <w:vAlign w:val="top"/>
-          </w:tcPr>
-          <w:p>
-            <w:pPr>
-              <w:keepNext/>
-              <w:spacing w:after="120"/>
-            </w:pPr>
-            <w:r>
-              <w:rPr>
-                <w:b/>
-                <w:sz w:val="24"/>
-              </w:rPr>
-              <w:t>Ảnh 5.2. Màn Cá nhân trong Drawer</w:t>
-            </w:r>
-          </w:p>
-          <w:tbl>
-            <w:tblPr>
-              <w:tblW w:type="auto" w:w="0"/>
-              <w:tblLayout w:type="fixed"/>
-              <w:tblLook w:firstColumn="1" w:firstRow="1" w:lastColumn="0" w:lastRow="0" w:noHBand="0" w:noVBand="1" w:val="04A0"/>
-            </w:tblPr>
-            <w:tblGrid>
-              <w:gridCol w:w="4365"/>
-            </w:tblGrid>
-            <w:tr>
-              <w:trPr>
-                <w:trHeight w:val="7937" w:hRule="exact"/>
-              </w:trPr>
-              <w:tc>
-                <w:tcPr>
-                  <w:tcW w:type="dxa" w:w="4592"/>
-                  <w:vAlign w:val="center"/>
-                  <w:shd w:fill="FFFFFF"/>
-                  <w:tcBorders>
-                    <w:top w:val="dashed" w:sz="6" w:color="94A3B8"/>
-                    <w:left w:val="dashed" w:sz="6" w:color="94A3B8"/>
-                    <w:bottom w:val="dashed" w:sz="6" w:color="94A3B8"/>
-                    <w:right w:val="dashed" w:sz="6" w:color="94A3B8"/>
-                  </w:tcBorders>
-                </w:tcPr>
-                <w:p>
-                  <w:pPr>
-                    <w:spacing w:before="0" w:after="0" w:line="240" w:lineRule="auto"/>
-                    <w:jc w:val="center"/>
-                  </w:pPr>
-                  <w:r/>
-                  <w:r>
-                    <w:drawing>
-                      <wp:inline xmlns:a="http://schemas.openxmlformats.org/drawingml/2006/main" xmlns:pic="http://schemas.openxmlformats.org/drawingml/2006/picture">
-                        <wp:extent cx="2195829" cy="4752000"/>
-                        <wp:docPr id="20" name="Picture 20"/>
-                        <wp:cNvGraphicFramePr>
-                          <a:graphicFrameLocks noChangeAspect="1"/>
-                        </wp:cNvGraphicFramePr>
-                        <a:graphic>
-                          <a:graphicData uri="http://schemas.openxmlformats.org/drawingml/2006/picture">
-                            <pic:pic>
-                              <pic:nvPicPr>
-                                <pic:cNvPr id="0" name="5.2-profile.png"/>
-                                <pic:cNvPicPr/>
-                              </pic:nvPicPr>
-                              <pic:blipFill>
-                                <a:blip r:embed="rId29"/>
-                                <a:stretch>
-                                  <a:fillRect/>
-                                </a:stretch>
-                              </pic:blipFill>
-                              <pic:spPr>
-                                <a:xfrm>
-                                  <a:off x="0" y="0"/>
-                                  <a:ext cx="2195829" cy="4752000"/>
-                                </a:xfrm>
-                                <a:prstGeom prst="rect"/>
-                              </pic:spPr>
-                            </pic:pic>
-                          </a:graphicData>
-                        </a:graphic>
-                      </wp:inline>
-                    </w:drawing>
-                  </w:r>
-                </w:p>
-              </w:tc>
-            </w:tr>
-          </w:tbl>
-          <w:p>
-            <w:pPr>
-              <w:keepNext/>
-              <w:spacing w:before="100" w:after="100"/>
-              <w:jc w:val="center"/>
-            </w:pPr>
-            <w:r>
-              <w:rPr>
-                <w:color w:val="475569"/>
-                <w:sz w:val="18"/>
-              </w:rPr>
-              <w:t>Chụp: 16:53:15 · 25/10/2026 (UTC+7)</w:t>
-            </w:r>
-          </w:p>
-          <w:p>
-            <w:pPr>
-              <w:keepNext/>
-              <w:spacing w:before="60"/>
-            </w:pPr>
-            <w:r>
-              <w:rPr>
-                <w:b/>
-                <w:sz w:val="20"/>
-              </w:rPr>
-              <w:t xml:space="preserve">Kết quả: </w:t>
-            </w:r>
-            <w:r>
-              <w:rPr>
-                <w:sz w:val="20"/>
-              </w:rPr>
-              <w:t>Chọn Cá nhân trong Drawer: hiển thị avatar, họ tên và email.</w:t>
-            </w:r>
-          </w:p>
-        </w:tc>
-      </w:tr>
-    </w:tbl>
+      </w:pPr>
+      <w:r>
+        <w:drawing>
+          <wp:inline xmlns:a="http://schemas.openxmlformats.org/drawingml/2006/main" xmlns:pic="http://schemas.openxmlformats.org/drawingml/2006/picture">
+            <wp:extent cx="8460000" cy="4758750"/>
+            <wp:docPr id="10" name="Picture 10"/>
+            <wp:cNvGraphicFramePr>
+              <a:graphicFrameLocks noChangeAspect="1"/>
+            </wp:cNvGraphicFramePr>
+            <a:graphic>
+              <a:graphicData uri="http://schemas.openxmlformats.org/drawingml/2006/picture">
+                <pic:pic>
+                  <pic:nvPicPr>
+                    <pic:cNvPr id="0" name="image10.png"/>
+                    <pic:cNvPicPr/>
+                  </pic:nvPicPr>
+                  <pic:blipFill>
+                    <a:blip r:embed="rId21"/>
+                    <a:stretch>
+                      <a:fillRect/>
+                    </a:stretch>
+                  </pic:blipFill>
+                  <pic:spPr>
+                    <a:xfrm>
+                      <a:off x="0" y="0"/>
+                      <a:ext cx="8460000" cy="4758750"/>
+                    </a:xfrm>
+                    <a:prstGeom prst="rect"/>
+                  </pic:spPr>
+                </pic:pic>
+              </a:graphicData>
+            </a:graphic>
+          </wp:inline>
+        </w:drawing>
+      </w:r>
+    </w:p>
+    <w:p>
+      <w:pPr>
+        <w:keepNext/>
+        <w:spacing w:after="100"/>
+        <w:jc w:val="center"/>
+      </w:pPr>
+      <w:r>
+        <w:rPr>
+          <w:i/>
+          <w:sz w:val="20"/>
+        </w:rPr>
+        <w:t>Hình 10. Màn Trang chủ của Bài 5.</w:t>
+      </w:r>
+    </w:p>
+    <w:p>
+      <w:pPr>
+        <w:spacing w:after="0"/>
+      </w:pPr>
+      <w:r>
+        <w:rPr>
+          <w:b/>
+          <w:sz w:val="20"/>
+        </w:rPr>
+        <w:t xml:space="preserve">Nhận xét: </w:t>
+      </w:r>
+      <w:r>
+        <w:rPr>
+          <w:sz w:val="20"/>
+        </w:rPr>
+        <w:t>Trang chủ hiển thị lời chào “Xin chào” ở giữa màn hình. Trên header có nút menu ☰ để truy cập điều hướng Drawer.</w:t>
+      </w:r>
+    </w:p>
     <w:p>
       <w:r>
         <w:br w:type="page"/>
@@ -3109,437 +1513,103 @@
     </w:p>
     <w:p>
       <w:pPr>
-        <w:spacing w:after="280"/>
+        <w:spacing w:after="80"/>
       </w:pPr>
       <w:r>
-        <w:t>Minh chứng 2/2 — Hai Switch và trạng thái</w:t>
-      </w:r>
-    </w:p>
-    <w:tbl>
-      <w:tblPr>
-        <w:tblW w:type="auto" w:w="0"/>
-        <w:jc w:val="center"/>
-        <w:tblLayout w:type="fixed"/>
-        <w:tblLook w:firstColumn="1" w:firstRow="1" w:lastColumn="0" w:lastRow="0" w:noHBand="0" w:noVBand="1" w:val="04A0"/>
-      </w:tblPr>
-      <w:tblGrid>
-        <w:gridCol w:w="4592"/>
-        <w:gridCol w:w="340"/>
-        <w:gridCol w:w="4592"/>
-      </w:tblGrid>
-      <w:tr>
-        <w:trPr>
-          <w:cantSplit/>
-        </w:trPr>
-        <w:tc>
-          <w:tcPr>
-            <w:tcW w:type="dxa" w:w="4592"/>
-            <w:vAlign w:val="top"/>
-          </w:tcPr>
-          <w:p>
-            <w:pPr>
-              <w:keepNext/>
-              <w:spacing w:after="120"/>
-            </w:pPr>
-            <w:r>
-              <w:rPr>
-                <w:b/>
-                <w:sz w:val="24"/>
-              </w:rPr>
-              <w:t>Ảnh 5.3. Cài đặt — trạng thái ban đầu</w:t>
-            </w:r>
-          </w:p>
-          <w:tbl>
-            <w:tblPr>
-              <w:tblW w:type="auto" w:w="0"/>
-              <w:tblLayout w:type="fixed"/>
-              <w:tblLook w:firstColumn="1" w:firstRow="1" w:lastColumn="0" w:lastRow="0" w:noHBand="0" w:noVBand="1" w:val="04A0"/>
-            </w:tblPr>
-            <w:tblGrid>
-              <w:gridCol w:w="4365"/>
-            </w:tblGrid>
-            <w:tr>
-              <w:trPr>
-                <w:trHeight w:val="7937" w:hRule="exact"/>
-              </w:trPr>
-              <w:tc>
-                <w:tcPr>
-                  <w:tcW w:type="dxa" w:w="4592"/>
-                  <w:vAlign w:val="center"/>
-                  <w:shd w:fill="FFFFFF"/>
-                  <w:tcBorders>
-                    <w:top w:val="dashed" w:sz="6" w:color="94A3B8"/>
-                    <w:left w:val="dashed" w:sz="6" w:color="94A3B8"/>
-                    <w:bottom w:val="dashed" w:sz="6" w:color="94A3B8"/>
-                    <w:right w:val="dashed" w:sz="6" w:color="94A3B8"/>
-                  </w:tcBorders>
-                </w:tcPr>
-                <w:p>
-                  <w:pPr>
-                    <w:spacing w:before="0" w:after="0" w:line="240" w:lineRule="auto"/>
-                    <w:jc w:val="center"/>
-                  </w:pPr>
-                  <w:r/>
-                  <w:r>
-                    <w:drawing>
-                      <wp:inline xmlns:a="http://schemas.openxmlformats.org/drawingml/2006/main" xmlns:pic="http://schemas.openxmlformats.org/drawingml/2006/picture">
-                        <wp:extent cx="2195829" cy="4752000"/>
-                        <wp:docPr id="21" name="Picture 21"/>
-                        <wp:cNvGraphicFramePr>
-                          <a:graphicFrameLocks noChangeAspect="1"/>
-                        </wp:cNvGraphicFramePr>
-                        <a:graphic>
-                          <a:graphicData uri="http://schemas.openxmlformats.org/drawingml/2006/picture">
-                            <pic:pic>
-                              <pic:nvPicPr>
-                                <pic:cNvPr id="0" name="5.3-settings-default.png"/>
-                                <pic:cNvPicPr/>
-                              </pic:nvPicPr>
-                              <pic:blipFill>
-                                <a:blip r:embed="rId30"/>
-                                <a:stretch>
-                                  <a:fillRect/>
-                                </a:stretch>
-                              </pic:blipFill>
-                              <pic:spPr>
-                                <a:xfrm>
-                                  <a:off x="0" y="0"/>
-                                  <a:ext cx="2195829" cy="4752000"/>
-                                </a:xfrm>
-                                <a:prstGeom prst="rect"/>
-                              </pic:spPr>
-                            </pic:pic>
-                          </a:graphicData>
-                        </a:graphic>
-                      </wp:inline>
-                    </w:drawing>
-                  </w:r>
-                </w:p>
-              </w:tc>
-            </w:tr>
-          </w:tbl>
-          <w:p>
-            <w:pPr>
-              <w:keepNext/>
-              <w:spacing w:before="100" w:after="100"/>
-              <w:jc w:val="center"/>
-            </w:pPr>
-            <w:r>
-              <w:rPr>
-                <w:color w:val="475569"/>
-                <w:sz w:val="18"/>
-              </w:rPr>
-              <w:t>Chụp: 16:53:16 · 25/10/2026 (UTC+7)</w:t>
-            </w:r>
-          </w:p>
-          <w:p>
-            <w:pPr>
-              <w:keepNext/>
-              <w:spacing w:before="60"/>
-            </w:pPr>
-            <w:r>
-              <w:rPr>
-                <w:b/>
-                <w:sz w:val="20"/>
-              </w:rPr>
-              <w:t xml:space="preserve">Kết quả: </w:t>
-            </w:r>
-            <w:r>
-              <w:rPr>
-                <w:sz w:val="20"/>
-              </w:rPr>
-              <w:t>Hai Switch ở trạng thái mặc định: thông báo BẬT, giao diện sáng.</w:t>
-            </w:r>
-          </w:p>
-        </w:tc>
-        <w:tc>
-          <w:tcPr>
-            <w:tcW w:type="dxa" w:w="340"/>
-          </w:tcPr>
-          <w:p/>
-        </w:tc>
-        <w:tc>
-          <w:tcPr>
-            <w:tcW w:type="dxa" w:w="4592"/>
-            <w:vAlign w:val="top"/>
-          </w:tcPr>
-          <w:p>
-            <w:pPr>
-              <w:keepNext/>
-              <w:spacing w:after="120"/>
-            </w:pPr>
-            <w:r>
-              <w:rPr>
-                <w:b/>
-                <w:sz w:val="24"/>
-              </w:rPr>
-              <w:t>Ảnh 5.4. Cài đặt — sau khi gạt Switch</w:t>
-            </w:r>
-          </w:p>
-          <w:tbl>
-            <w:tblPr>
-              <w:tblW w:type="auto" w:w="0"/>
-              <w:tblLayout w:type="fixed"/>
-              <w:tblLook w:firstColumn="1" w:firstRow="1" w:lastColumn="0" w:lastRow="0" w:noHBand="0" w:noVBand="1" w:val="04A0"/>
-            </w:tblPr>
-            <w:tblGrid>
-              <w:gridCol w:w="4365"/>
-            </w:tblGrid>
-            <w:tr>
-              <w:trPr>
-                <w:trHeight w:val="7937" w:hRule="exact"/>
-              </w:trPr>
-              <w:tc>
-                <w:tcPr>
-                  <w:tcW w:type="dxa" w:w="4592"/>
-                  <w:vAlign w:val="center"/>
-                  <w:shd w:fill="FFFFFF"/>
-                  <w:tcBorders>
-                    <w:top w:val="dashed" w:sz="6" w:color="94A3B8"/>
-                    <w:left w:val="dashed" w:sz="6" w:color="94A3B8"/>
-                    <w:bottom w:val="dashed" w:sz="6" w:color="94A3B8"/>
-                    <w:right w:val="dashed" w:sz="6" w:color="94A3B8"/>
-                  </w:tcBorders>
-                </w:tcPr>
-                <w:p>
-                  <w:pPr>
-                    <w:spacing w:before="0" w:after="0" w:line="240" w:lineRule="auto"/>
-                    <w:jc w:val="center"/>
-                  </w:pPr>
-                  <w:r/>
-                  <w:r>
-                    <w:drawing>
-                      <wp:inline xmlns:a="http://schemas.openxmlformats.org/drawingml/2006/main" xmlns:pic="http://schemas.openxmlformats.org/drawingml/2006/picture">
-                        <wp:extent cx="2195829" cy="4752000"/>
-                        <wp:docPr id="22" name="Picture 22"/>
-                        <wp:cNvGraphicFramePr>
-                          <a:graphicFrameLocks noChangeAspect="1"/>
-                        </wp:cNvGraphicFramePr>
-                        <a:graphic>
-                          <a:graphicData uri="http://schemas.openxmlformats.org/drawingml/2006/picture">
-                            <pic:pic>
-                              <pic:nvPicPr>
-                                <pic:cNvPr id="0" name="5.4-settings-toggled.png"/>
-                                <pic:cNvPicPr/>
-                              </pic:nvPicPr>
-                              <pic:blipFill>
-                                <a:blip r:embed="rId31"/>
-                                <a:stretch>
-                                  <a:fillRect/>
-                                </a:stretch>
-                              </pic:blipFill>
-                              <pic:spPr>
-                                <a:xfrm>
-                                  <a:off x="0" y="0"/>
-                                  <a:ext cx="2195829" cy="4752000"/>
-                                </a:xfrm>
-                                <a:prstGeom prst="rect"/>
-                              </pic:spPr>
-                            </pic:pic>
-                          </a:graphicData>
-                        </a:graphic>
-                      </wp:inline>
-                    </w:drawing>
-                  </w:r>
-                </w:p>
-              </w:tc>
-            </w:tr>
-          </w:tbl>
-          <w:p>
-            <w:pPr>
-              <w:keepNext/>
-              <w:spacing w:before="100" w:after="100"/>
-              <w:jc w:val="center"/>
-            </w:pPr>
-            <w:r>
-              <w:rPr>
-                <w:color w:val="475569"/>
-                <w:sz w:val="18"/>
-              </w:rPr>
-              <w:t>Chụp: 16:53:17 · 25/10/2026 (UTC+7)</w:t>
-            </w:r>
-          </w:p>
-          <w:p>
-            <w:pPr>
-              <w:keepNext/>
-              <w:spacing w:before="60"/>
-            </w:pPr>
-            <w:r>
-              <w:rPr>
-                <w:b/>
-                <w:sz w:val="20"/>
-              </w:rPr>
-              <w:t xml:space="preserve">Kết quả: </w:t>
-            </w:r>
-            <w:r>
-              <w:rPr>
-                <w:sz w:val="20"/>
-              </w:rPr>
-              <w:t>Gạt hai Switch: thông báo TẮT, giao diện tối; dòng trạng thái cập nhật ngay. Không kiểm tra phần nâng cao đổi nền toàn app.</w:t>
-            </w:r>
-          </w:p>
-        </w:tc>
-      </w:tr>
-    </w:tbl>
-    <w:p>
-      <w:r>
-        <w:br w:type="page"/>
+        <w:rPr>
+          <w:b/>
+          <w:sz w:val="24"/>
+        </w:rPr>
+        <w:t>5.2. Màn Cài đặt</w:t>
       </w:r>
     </w:p>
     <w:p>
       <w:pPr>
-        <w:pStyle w:val="Heading1"/>
+        <w:spacing w:after="100"/>
       </w:pPr>
       <w:r>
-        <w:t>BÀI 5. DRAWER NAVIGATION</w:t>
+        <w:rPr>
+          <w:sz w:val="20"/>
+        </w:rPr>
+        <w:t>Nội dung minh chứng: hai Switch và dòng mô tả trạng thái cài đặt hiện tại.</w:t>
       </w:r>
     </w:p>
     <w:p>
+      <w:pPr>
+        <w:keepNext/>
+        <w:spacing w:after="80" w:line="240" w:lineRule="auto"/>
+        <w:jc w:val="center"/>
+      </w:pPr>
       <w:r>
-        <w:t>Minh chứng bổ sung — Màn Trang chủ</w:t>
+        <w:drawing>
+          <wp:inline xmlns:a="http://schemas.openxmlformats.org/drawingml/2006/main" xmlns:pic="http://schemas.openxmlformats.org/drawingml/2006/picture">
+            <wp:extent cx="8460000" cy="4758750"/>
+            <wp:docPr id="11" name="Picture 11"/>
+            <wp:cNvGraphicFramePr>
+              <a:graphicFrameLocks noChangeAspect="1"/>
+            </wp:cNvGraphicFramePr>
+            <a:graphic>
+              <a:graphicData uri="http://schemas.openxmlformats.org/drawingml/2006/picture">
+                <pic:pic>
+                  <pic:nvPicPr>
+                    <pic:cNvPr id="0" name="image11.png"/>
+                    <pic:cNvPicPr/>
+                  </pic:nvPicPr>
+                  <pic:blipFill>
+                    <a:blip r:embed="rId22"/>
+                    <a:stretch>
+                      <a:fillRect/>
+                    </a:stretch>
+                  </pic:blipFill>
+                  <pic:spPr>
+                    <a:xfrm>
+                      <a:off x="0" y="0"/>
+                      <a:ext cx="8460000" cy="4758750"/>
+                    </a:xfrm>
+                    <a:prstGeom prst="rect"/>
+                  </pic:spPr>
+                </pic:pic>
+              </a:graphicData>
+            </a:graphic>
+          </wp:inline>
+        </w:drawing>
       </w:r>
     </w:p>
-    <w:tbl>
-      <w:tblPr>
-        <w:tblW w:type="auto" w:w="0"/>
+    <w:p>
+      <w:pPr>
+        <w:keepNext/>
+        <w:spacing w:after="100"/>
         <w:jc w:val="center"/>
-        <w:tblLayout w:type="fixed"/>
-        <w:tblLook w:firstColumn="1" w:firstRow="1" w:lastColumn="0" w:lastRow="0" w:noHBand="0" w:noVBand="1" w:val="04A0"/>
-      </w:tblPr>
-      <w:tblGrid>
-        <w:gridCol w:w="9524"/>
-      </w:tblGrid>
-      <w:tr>
-        <w:tc>
-          <w:tcPr>
-            <w:tcW w:type="dxa" w:w="9638"/>
-            <w:vAlign w:val="top"/>
-          </w:tcPr>
-          <w:p>
-            <w:pPr>
-              <w:keepNext/>
-              <w:spacing w:after="120"/>
-              <w:jc w:val="center"/>
-            </w:pPr>
-            <w:r>
-              <w:rPr>
-                <w:b/>
-                <w:sz w:val="24"/>
-              </w:rPr>
-              <w:t>Ảnh 5.5. Trang chủ trong Drawer</w:t>
-            </w:r>
-          </w:p>
-          <w:tbl>
-            <w:tblPr>
-              <w:tblW w:type="auto" w:w="0"/>
-              <w:jc w:val="center"/>
-              <w:tblLayout w:type="fixed"/>
-              <w:tblLook w:firstColumn="1" w:firstRow="1" w:lastColumn="0" w:lastRow="0" w:noHBand="0" w:noVBand="1" w:val="04A0"/>
-            </w:tblPr>
-            <w:tblGrid>
-              <w:gridCol w:w="4365"/>
-            </w:tblGrid>
-            <w:tr>
-              <w:trPr>
-                <w:trHeight w:val="7937" w:hRule="exact"/>
-              </w:trPr>
-              <w:tc>
-                <w:tcPr>
-                  <w:tcW w:type="dxa" w:w="9638"/>
-                  <w:vAlign w:val="center"/>
-                  <w:shd w:fill="FFFFFF"/>
-                  <w:tcBorders>
-                    <w:top w:val="dashed" w:sz="6" w:color="94A3B8"/>
-                    <w:left w:val="dashed" w:sz="6" w:color="94A3B8"/>
-                    <w:bottom w:val="dashed" w:sz="6" w:color="94A3B8"/>
-                    <w:right w:val="dashed" w:sz="6" w:color="94A3B8"/>
-                  </w:tcBorders>
-                </w:tcPr>
-                <w:p>
-                  <w:pPr>
-                    <w:spacing w:before="0" w:after="0" w:line="240" w:lineRule="auto"/>
-                    <w:jc w:val="center"/>
-                  </w:pPr>
-                  <w:r/>
-                  <w:r>
-                    <w:drawing>
-                      <wp:inline xmlns:a="http://schemas.openxmlformats.org/drawingml/2006/main" xmlns:pic="http://schemas.openxmlformats.org/drawingml/2006/picture">
-                        <wp:extent cx="2195829" cy="4752000"/>
-                        <wp:docPr id="23" name="Picture 23"/>
-                        <wp:cNvGraphicFramePr>
-                          <a:graphicFrameLocks noChangeAspect="1"/>
-                        </wp:cNvGraphicFramePr>
-                        <a:graphic>
-                          <a:graphicData uri="http://schemas.openxmlformats.org/drawingml/2006/picture">
-                            <pic:pic>
-                              <pic:nvPicPr>
-                                <pic:cNvPr id="0" name="5.5-home.png"/>
-                                <pic:cNvPicPr/>
-                              </pic:nvPicPr>
-                              <pic:blipFill>
-                                <a:blip r:embed="rId32"/>
-                                <a:stretch>
-                                  <a:fillRect/>
-                                </a:stretch>
-                              </pic:blipFill>
-                              <pic:spPr>
-                                <a:xfrm>
-                                  <a:off x="0" y="0"/>
-                                  <a:ext cx="2195829" cy="4752000"/>
-                                </a:xfrm>
-                                <a:prstGeom prst="rect"/>
-                              </pic:spPr>
-                            </pic:pic>
-                          </a:graphicData>
-                        </a:graphic>
-                      </wp:inline>
-                    </w:drawing>
-                  </w:r>
-                </w:p>
-              </w:tc>
-            </w:tr>
-          </w:tbl>
-          <w:p>
-            <w:pPr>
-              <w:keepNext/>
-              <w:spacing w:before="100" w:after="100"/>
-              <w:jc w:val="center"/>
-            </w:pPr>
-            <w:r>
-              <w:rPr>
-                <w:color w:val="475569"/>
-                <w:sz w:val="18"/>
-              </w:rPr>
-              <w:t>Chụp: 16:54:37 · 25/10/2026 (UTC+7)</w:t>
-            </w:r>
-          </w:p>
-          <w:p>
-            <w:pPr>
-              <w:keepNext/>
-              <w:spacing w:before="60"/>
-            </w:pPr>
-            <w:r>
-              <w:rPr>
-                <w:b/>
-                <w:sz w:val="20"/>
-              </w:rPr>
-              <w:t xml:space="preserve">Kết quả: </w:t>
-            </w:r>
-            <w:r>
-              <w:rPr>
-                <w:sz w:val="20"/>
-              </w:rPr>
-              <w:t>Trang chủ hiển thị Xin chào; header có nút mở Drawer. Đây là màn Home của Bài 5.</w:t>
-            </w:r>
-          </w:p>
-        </w:tc>
-      </w:tr>
-    </w:tbl>
+      </w:pPr>
+      <w:r>
+        <w:rPr>
+          <w:i/>
+          <w:sz w:val="20"/>
+        </w:rPr>
+        <w:t>Hình 11. Giao diện cài đặt thông báo và giao diện tối.</w:t>
+      </w:r>
+    </w:p>
+    <w:p>
+      <w:pPr>
+        <w:spacing w:after="0"/>
+      </w:pPr>
+      <w:r>
+        <w:rPr>
+          <w:b/>
+          <w:sz w:val="20"/>
+        </w:rPr>
+        <w:t xml:space="preserve">Nhận xét: </w:t>
+      </w:r>
+      <w:r>
+        <w:rPr>
+          <w:sz w:val="20"/>
+        </w:rPr>
+        <w:t>Màn Cài đặt có hai tùy chọn “Nhận thông báo” và “Giao diện tối”. Ở thời điểm chụp, thông báo đang bật, giao diện tối đang tắt; dòng trạng thái hiển thị “Thông báo: BẬT · Giao diện: sáng”.</w:t>
+      </w:r>
+    </w:p>
     <w:sectPr>
-      <w:headerReference w:type="default" r:id="rId9"/>
-      <w:footerReference w:type="default" r:id="rId10"/>
-      <w:pgSz w:w="11906" w:h="16838"/>
-      <w:pgMar w:top="1020" w:right="1134" w:bottom="964" w:left="1134" w:header="397" w:footer="397" w:gutter="0"/>
+      <w:pgSz w:w="16838" w:h="11906" w:orient="landscape"/>
+      <w:pgMar w:top="765" w:right="1134" w:bottom="765" w:left="1134" w:header="312" w:footer="312" w:gutter="0"/>
       <w:cols w:space="720"/>
       <w:docGrid w:linePitch="360"/>
     </w:sectPr>
@@ -3574,11 +1644,10 @@
     </w:pPr>
     <w:r>
       <w:rPr>
-        <w:rFonts w:ascii="Times New Roman" w:hAnsi="Times New Roman"/>
         <w:color w:val="64748B"/>
         <w:sz w:val="18"/>
       </w:rPr>
-      <w:t>LAB 06  |  REACT NATIVE NAVIGATION</w:t>
+      <w:t>THỰC HÀNH REACT NATIVE · LAB 06</w:t>
     </w:r>
   </w:p>
 </w:hdr>
@@ -3948,7 +2017,7 @@
     <w:qFormat/>
     <w:rsid w:val="00FC693F"/>
     <w:pPr>
-      <w:spacing w:after="120" w:line="276" w:lineRule="auto"/>
+      <w:spacing w:line="264" w:lineRule="auto" w:after="120"/>
     </w:pPr>
     <w:rPr>
       <w:rFonts w:ascii="Times New Roman" w:hAnsi="Times New Roman"/>
@@ -4010,14 +2079,14 @@
     <w:pPr>
       <w:keepNext/>
       <w:keepLines/>
-      <w:spacing w:before="480" w:after="200"/>
+      <w:spacing w:before="0" w:after="140"/>
       <w:outlineLvl w:val="0"/>
     </w:pPr>
     <w:rPr>
       <w:rFonts w:asciiTheme="majorHAnsi" w:eastAsiaTheme="majorEastAsia" w:hAnsiTheme="majorHAnsi" w:cstheme="majorBidi" w:ascii="Times New Roman" w:hAnsi="Times New Roman"/>
       <w:b/>
       <w:bCs/>
-      <w:color w:val="183153"/>
+      <w:color w:val="17365D"/>
       <w:sz w:val="36"/>
       <w:szCs w:val="28"/>
     </w:rPr>
@@ -4034,14 +2103,14 @@
     <w:pPr>
       <w:keepNext/>
       <w:keepLines/>
-      <w:spacing w:before="200" w:after="200"/>
+      <w:spacing w:before="0" w:after="140"/>
       <w:outlineLvl w:val="1"/>
     </w:pPr>
     <w:rPr>
       <w:rFonts w:asciiTheme="majorHAnsi" w:eastAsiaTheme="majorEastAsia" w:hAnsiTheme="majorHAnsi" w:cstheme="majorBidi" w:ascii="Times New Roman" w:hAnsi="Times New Roman"/>
       <w:b/>
       <w:bCs/>
-      <w:color w:val="183153"/>
+      <w:color w:val="17365D"/>
       <w:sz w:val="28"/>
       <w:szCs w:val="26"/>
     </w:rPr>
@@ -4296,19 +2365,18 @@
     <w:qFormat/>
     <w:rsid w:val="00FC693F"/>
     <w:pPr>
-      <w:keepNext/>
       <w:pBdr>
         <w:bottom w:val="single" w:sz="8" w:space="4" w:color="4F81BD" w:themeColor="accent1"/>
       </w:pBdr>
-      <w:spacing w:after="200" w:line="240" w:lineRule="auto"/>
+      <w:spacing w:after="140" w:line="240" w:lineRule="auto" w:before="0"/>
       <w:contextualSpacing/>
     </w:pPr>
     <w:rPr>
       <w:rFonts w:asciiTheme="majorHAnsi" w:eastAsiaTheme="majorEastAsia" w:hAnsiTheme="majorHAnsi" w:cstheme="majorBidi" w:ascii="Times New Roman" w:hAnsi="Times New Roman"/>
-      <w:color w:val="183153"/>
+      <w:color w:val="17365D"/>
       <w:spacing w:val="5"/>
       <w:kern w:val="28"/>
-      <w:sz w:val="52"/>
+      <w:sz w:val="50"/>
       <w:szCs w:val="52"/>
     </w:rPr>
   </w:style>

</xml_diff>